<commit_message>
fix: clean up CV awards and artefact workflow
</commit_message>
<xml_diff>
--- a/public/resume/Isaac_Adjei_CV.docx
+++ b/public/resume/Isaac_Adjei_CV.docx
@@ -223,7 +223,7 @@
       </w:pPr>
       <w:r>
         <w:rPr/>
-        <w:t xml:space="preserve">              Aston University, Birmingham, United Kingdom | Top 40 Finalist – Black Heritage Undergraduate of the Year Award 2026 (TargetJobs &amp; Sky)            </w:t>
+        <w:t xml:space="preserve">              Top 40 Finalist – Black Heritage Undergraduate of the Year Award 2026 (TargetJobs &amp; Sky)           </w:t>
       </w:r>
     </w:p>
     <w:p>
@@ -303,7 +303,7 @@
       </w:pPr>
       <w:r>
         <w:rPr/>
-        <w:t xml:space="preserve">Stanmore College, London, United Kingdom | Best and Most Hardworking Student Award</w:t>
+        <w:t xml:space="preserve">Best and Most Hardworking Student Award</w:t>
       </w:r>
     </w:p>
     <w:p>
@@ -1062,7 +1062,23 @@
       </w:pPr>
       <w:r>
         <w:rPr/>
-        <w:t xml:space="preserve">                Collect and communicate student feedback to academic staff through SSLC, Senate and                Council meetings              </w:t>
+        <w:t xml:space="preserve">                Collect and communicate </w:t>
+      </w:r>
+      <w:r>
+        <w:rPr>
+          <w:b/>
+        </w:rPr>
+        <w:t xml:space="preserve">student feedback</w:t>
+      </w:r>
+      <w:r>
+        <w:rPr/>
+        <w:t xml:space="preserve"> to academic staff through </w:t>
+      </w:r>
+      <w:r>
+        <w:rPr>
+          <w:b/>
+        </w:rPr>
+        <w:t xml:space="preserve">SSLC, Senate and               Council meetings</w:t>
       </w:r>
     </w:p>
     <w:p>
@@ -1075,7 +1091,23 @@
       </w:pPr>
       <w:r>
         <w:rPr/>
-        <w:t xml:space="preserve">Delivered improvements to learning delivery and the wider course experience</w:t>
+        <w:t xml:space="preserve">Delivered improvements to </w:t>
+      </w:r>
+      <w:r>
+        <w:rPr>
+          <w:b/>
+        </w:rPr>
+        <w:t xml:space="preserve">learning delivery</w:t>
+      </w:r>
+      <w:r>
+        <w:rPr/>
+        <w:t xml:space="preserve"> and the wider </w:t>
+      </w:r>
+      <w:r>
+        <w:rPr>
+          <w:b/>
+        </w:rPr>
+        <w:t xml:space="preserve">course experience</w:t>
       </w:r>
     </w:p>
     <w:p>
@@ -1222,7 +1254,33 @@
       </w:pPr>
       <w:r>
         <w:rPr/>
-        <w:t xml:space="preserve">                Examined intelligent transport systems and digital solutions to evaluate their impact on                air quality and urban mobility efficiency              </w:t>
+        <w:t xml:space="preserve">                Examined </w:t>
+      </w:r>
+      <w:r>
+        <w:rPr>
+          <w:b/>
+        </w:rPr>
+        <w:t xml:space="preserve">intelligent transport systems</w:t>
+      </w:r>
+      <w:r>
+        <w:rPr/>
+        <w:t xml:space="preserve"> and </w:t>
+      </w:r>
+      <w:r>
+        <w:rPr>
+          <w:b/>
+        </w:rPr>
+        <w:t xml:space="preserve">digital solutions</w:t>
+      </w:r>
+      <w:r>
+        <w:rPr/>
+        <w:t xml:space="preserve"> to evaluate their impact on               air quality and </w:t>
+      </w:r>
+      <w:r>
+        <w:rPr>
+          <w:b/>
+        </w:rPr>
+        <w:t xml:space="preserve">urban mobility efficiency</w:t>
       </w:r>
     </w:p>
     <w:p>
@@ -1235,7 +1293,27 @@
       </w:pPr>
       <w:r>
         <w:rPr/>
-        <w:t xml:space="preserve">                Delivered technical insight outputs based on real-time pollution sensing and smart                traffic workflows              </w:t>
+        <w:t xml:space="preserve">                Delivered </w:t>
+      </w:r>
+      <w:r>
+        <w:rPr>
+          <w:b/>
+        </w:rPr>
+        <w:t xml:space="preserve">technical insight outputs</w:t>
+      </w:r>
+      <w:r>
+        <w:rPr/>
+        <w:t xml:space="preserve"> based on </w:t>
+      </w:r>
+      <w:r>
+        <w:rPr>
+          <w:b/>
+        </w:rPr>
+        <w:t xml:space="preserve">real-time pollution sensing</w:t>
+      </w:r>
+      <w:r>
+        <w:rPr/>
+        <w:t xml:space="preserve"> and smart               traffic workflows             </w:t>
       </w:r>
     </w:p>
     <w:p>
@@ -1284,7 +1362,73 @@
       </w:pPr>
       <w:r>
         <w:rPr/>
-        <w:t xml:space="preserve">                Operated end-to-end consular processing workflows using official diplomatic management systems - handling application intake, biometric data capture, document authentication and physical visa and passport production from print to issuance, supporting 100+ daily client interactions              </w:t>
+        <w:t xml:space="preserve">                Operated </w:t>
+      </w:r>
+      <w:r>
+        <w:rPr>
+          <w:b/>
+        </w:rPr>
+        <w:t xml:space="preserve">end-to-end consular processing workflows</w:t>
+      </w:r>
+      <w:r>
+        <w:rPr/>
+        <w:t xml:space="preserve"> using </w:t>
+      </w:r>
+      <w:r>
+        <w:rPr>
+          <w:b/>
+        </w:rPr>
+        <w:t xml:space="preserve">official diplomatic management systems</w:t>
+      </w:r>
+      <w:r>
+        <w:rPr/>
+        <w:t xml:space="preserve"> - handling </w:t>
+      </w:r>
+      <w:r>
+        <w:rPr>
+          <w:b/>
+        </w:rPr>
+        <w:t xml:space="preserve">application intake</w:t>
+      </w:r>
+      <w:r>
+        <w:rPr/>
+        <w:t xml:space="preserve">, </w:t>
+      </w:r>
+      <w:r>
+        <w:rPr>
+          <w:b/>
+        </w:rPr>
+        <w:t xml:space="preserve">biometric data capture</w:t>
+      </w:r>
+      <w:r>
+        <w:rPr/>
+        <w:t xml:space="preserve">, </w:t>
+      </w:r>
+      <w:r>
+        <w:rPr>
+          <w:b/>
+        </w:rPr>
+        <w:t xml:space="preserve">document authentication</w:t>
+      </w:r>
+      <w:r>
+        <w:rPr/>
+        <w:t xml:space="preserve"> and physical </w:t>
+      </w:r>
+      <w:r>
+        <w:rPr>
+          <w:b/>
+        </w:rPr>
+        <w:t xml:space="preserve">visa and passport production</w:t>
+      </w:r>
+      <w:r>
+        <w:rPr/>
+        <w:t xml:space="preserve"> from print to issuance, supporting </w:t>
+      </w:r>
+      <w:r>
+        <w:rPr>
+          <w:b/>
+        </w:rPr>
+        <w:t xml:space="preserve">100+ daily client interactions</w:t>
       </w:r>
     </w:p>
     <w:p>
@@ -1333,7 +1477,73 @@
       </w:pPr>
       <w:r>
         <w:rPr/>
-        <w:t xml:space="preserve">                Coordinated diplomatic property operations by accompanying officers on site inspections and facility surveys, managing estates documentation, maintenance schedules and office workflows to maintain mission operational standards              </w:t>
+        <w:t xml:space="preserve">                Coordinated </w:t>
+      </w:r>
+      <w:r>
+        <w:rPr>
+          <w:b/>
+        </w:rPr>
+        <w:t xml:space="preserve">diplomatic property operations</w:t>
+      </w:r>
+      <w:r>
+        <w:rPr/>
+        <w:t xml:space="preserve"> by accompanying officers on </w:t>
+      </w:r>
+      <w:r>
+        <w:rPr>
+          <w:b/>
+        </w:rPr>
+        <w:t xml:space="preserve">site inspections</w:t>
+      </w:r>
+      <w:r>
+        <w:rPr/>
+        <w:t xml:space="preserve"> and </w:t>
+      </w:r>
+      <w:r>
+        <w:rPr>
+          <w:b/>
+        </w:rPr>
+        <w:t xml:space="preserve">facility surveys</w:t>
+      </w:r>
+      <w:r>
+        <w:rPr/>
+        <w:t xml:space="preserve">, managing </w:t>
+      </w:r>
+      <w:r>
+        <w:rPr>
+          <w:b/>
+        </w:rPr>
+        <w:t xml:space="preserve">estates documentation</w:t>
+      </w:r>
+      <w:r>
+        <w:rPr/>
+        <w:t xml:space="preserve">, </w:t>
+      </w:r>
+      <w:r>
+        <w:rPr>
+          <w:b/>
+        </w:rPr>
+        <w:t xml:space="preserve">maintenance schedules</w:t>
+      </w:r>
+      <w:r>
+        <w:rPr/>
+        <w:t xml:space="preserve"> and </w:t>
+      </w:r>
+      <w:r>
+        <w:rPr>
+          <w:b/>
+        </w:rPr>
+        <w:t xml:space="preserve">office workflows</w:t>
+      </w:r>
+      <w:r>
+        <w:rPr/>
+        <w:t xml:space="preserve"> to maintain </w:t>
+      </w:r>
+      <w:r>
+        <w:rPr>
+          <w:b/>
+        </w:rPr>
+        <w:t xml:space="preserve">mission operational standards</w:t>
       </w:r>
     </w:p>
     <w:p>

</xml_diff>

<commit_message>
fix: clean up CV awards and artefact workflow (#168)
* fix: clean up CV awards and artefact workflow

* chore: regenerate CV PDF and DOCX from cv.html [skip ci]

* fix: keep CV artefact workflow checks running

* chore: regenerate CV PDF and DOCX from cv.html

* chore: trigger checks after CV artefact regeneration

* chore: regenerate CV PDF and DOCX from cv.html

* fix: prevent CV artefact workflow loops

* chore: regenerate CV PDF and DOCX from cv.html

* fix: CV artefact workflow on main and dashboard tab title

Regenerate PDF/DOCX via a separate auto-merge PR after cv.html lands on
main (avoids loop commits on feature PRs). Use GH_PAT on GitHub Actions.
Set dashboard metadata to an absolute title so the tab is not duplicated.

Co-authored-by: Cursor <cursoragent@cursor.com>

---------

Co-authored-by: github-actions[bot] <github-actions[bot]@users.noreply.github.com>
Co-authored-by: Cursor <cursoragent@cursor.com>
</commit_message>
<xml_diff>
--- a/public/resume/Isaac_Adjei_CV.docx
+++ b/public/resume/Isaac_Adjei_CV.docx
@@ -158,7 +158,7 @@
       </w:pPr>
       <w:r>
         <w:rPr/>
-        <w:t xml:space="preserve">            Electronic Engineering and Computer Science student at Aston University (Predicted First Class) and Top 40 Finalist in the Black Heritage Undergraduate of the Year Award 2026 (TargetJobs &amp; Sky).          Builds across the full engineering stack - from PCB-level analogue circuit design and embedded firmware to production IoT platforms and secure full-stack web applications.          Seeking internships, industrial placements and professional experiences in embedded systems, hardware-software integration, software engineering, cybersecurity, cloud, AI/ML and data.          </w:t>
+        <w:t xml:space="preserve">          Electronic Engineering and Computer Science student at Aston University (Predicted First Class) and Top 40 Finalist in the Black Heritage Undergraduate of the Year Award 2026 (TargetJobs &amp; Sky).         Builds across the full engineering stack - from PCB-level analogue circuit design and embedded firmware to production IoT platforms and secure full-stack web applications.         Seeking internships, industrial placements and professional experiences in embedded systems, hardware-software integration, software engineering, cybersecurity, cloud, AI/ML and data.        </w:t>
       </w:r>
     </w:p>
     <w:p>
@@ -203,7 +203,7 @@
       </w:pPr>
       <w:r>
         <w:rPr/>
-        <w:t xml:space="preserve">              BEng (Hons), Electronic Engineering and Computer Science ·              </w:t>
+        <w:t xml:space="preserve">            BEng (Hons), Electronic Engineering and Computer Science ·            </w:t>
       </w:r>
     </w:p>
     <w:p>
@@ -223,7 +223,7 @@
       </w:pPr>
       <w:r>
         <w:rPr/>
-        <w:t xml:space="preserve">              Aston University, Birmingham, United Kingdom | Top 40 Finalist – Black Heritage Undergraduate of the Year Award 2026 (TargetJobs &amp; Sky)            </w:t>
+        <w:t xml:space="preserve">            Top 40 Finalist – Black Heritage Undergraduate of the Year Award 2026 (TargetJobs &amp; Sky)          </w:t>
       </w:r>
     </w:p>
     <w:p>
@@ -243,7 +243,7 @@
       </w:pPr>
       <w:r>
         <w:rPr/>
-        <w:t xml:space="preserve"> Internet Applications and Databases, Foundations of AI              and Data Science, Introductory Programming for Digital Science (Python), Electronics 1,              Electronics 2, Introductory Mathematics for Engineering, Power Skills            </w:t>
+        <w:t xml:space="preserve"> Internet Applications and Databases, Foundations of AI            and Data Science, Introductory Programming for Digital Science (Python), Electronics 1,            Electronics 2, Introductory Mathematics for Engineering, Power Skills          </w:t>
       </w:r>
     </w:p>
     <w:p>
@@ -256,7 +256,7 @@
       </w:pPr>
       <w:r>
         <w:rPr/>
-        <w:t xml:space="preserve">                Developing strong foundations in software engineering, electronics and applied mathematics while building practical project experience across embedded systems, AI/data and full-stack development              </w:t>
+        <w:t xml:space="preserve">              Developing strong foundations in software engineering, electronics and applied mathematics while building practical project experience across embedded systems, AI/data and full-stack development            </w:t>
       </w:r>
     </w:p>
     <w:p>
@@ -283,7 +283,7 @@
       </w:pPr>
       <w:r>
         <w:rPr/>
-        <w:t xml:space="preserve">              Pearson BTEC Level 3 National Extended Diploma in Engineering ·              </w:t>
+        <w:t xml:space="preserve">            Pearson BTEC Level 3 National Extended Diploma in Engineering ·            </w:t>
       </w:r>
     </w:p>
     <w:p>
@@ -303,7 +303,7 @@
       </w:pPr>
       <w:r>
         <w:rPr/>
-        <w:t xml:space="preserve">Stanmore College, London, United Kingdom | Best and Most Hardworking Student Award</w:t>
+        <w:t xml:space="preserve">Best and Most Hardworking Student Award</w:t>
       </w:r>
     </w:p>
     <w:p>
@@ -323,7 +323,7 @@
       </w:pPr>
       <w:r>
         <w:rPr/>
-        <w:t xml:space="preserve"> Engineering Product Design and Manufacture,              Microcontroller Systems for Engineers, Engineering Principles, Specialist Engineering              Project, CAD in Engineering, Electronic Devices and Circuits, Calculus to Solve              Engineering Problems, Electronic Measurement and Testing of Circuits            </w:t>
+        <w:t xml:space="preserve"> Engineering Product Design and Manufacture,            Microcontroller Systems for Engineers, Engineering Principles, Specialist Engineering            Project, CAD in Engineering, Electronic Devices and Circuits, Calculus to Solve            Engineering Problems, Electronic Measurement and Testing of Circuits          </w:t>
       </w:r>
     </w:p>
     <w:p>
@@ -336,7 +336,7 @@
       </w:pPr>
       <w:r>
         <w:rPr/>
-        <w:t xml:space="preserve">                Completed intensive hands-on training in engineering design, testing and documentation, applying microcontroller, electronics and CAD skills through practical coursework and projects              </w:t>
+        <w:t xml:space="preserve">              Completed intensive hands-on training in engineering design, testing and documentation, applying microcontroller, electronics and CAD skills through practical coursework and projects            </w:t>
       </w:r>
     </w:p>
     <w:p>
@@ -369,7 +369,7 @@
       </w:r>
       <w:r>
         <w:rPr/>
-        <w:t xml:space="preserve"> C, C++, Python, Java, TypeScript, JavaScript, PHP, SQL, MATLAB            </w:t>
+        <w:t xml:space="preserve"> C, C++, Python, Java, TypeScript, JavaScript, PHP, SQL, MATLAB          </w:t>
       </w:r>
     </w:p>
     <w:p>
@@ -384,7 +384,7 @@
       </w:r>
       <w:r>
         <w:rPr/>
-        <w:t xml:space="preserve"> Arduino, STM32, ESP32, Raspberry Pi, AVR, KiCad,              Proteus, PCB Layout, Circuit Design, Oscilloscope, I2C / UART / SPI            </w:t>
+        <w:t xml:space="preserve"> Arduino, STM32, ESP32, Raspberry Pi, AVR, KiCad,            Proteus, PCB Layout, Circuit Design, Oscilloscope, I2C / UART / SPI          </w:t>
       </w:r>
     </w:p>
     <w:p>
@@ -429,7 +429,7 @@
       </w:r>
       <w:r>
         <w:rPr/>
-        <w:t xml:space="preserve"> AWS, Azure, Docker, Kubernetes, Vercel, Cloudflare, GitHub              Actions            </w:t>
+        <w:t xml:space="preserve"> AWS, Azure, Docker, Kubernetes, Vercel, Cloudflare, GitHub            Actions          </w:t>
       </w:r>
     </w:p>
     <w:p>
@@ -444,7 +444,7 @@
       </w:r>
       <w:r>
         <w:rPr/>
-        <w:t xml:space="preserve"> Problem Solving, Critical Thinking, Communication, Team              Collaboration, Leadership, Time Management, Adaptability, Attention to Detail            </w:t>
+        <w:t xml:space="preserve"> Problem Solving, Critical Thinking, Communication, Team            Collaboration, Leadership, Time Management, Adaptability, Attention to Detail          </w:t>
       </w:r>
     </w:p>
     <w:p>
@@ -517,7 +517,7 @@
       </w:pPr>
       <w:r>
         <w:rPr/>
-        <w:t xml:space="preserve">                End-to-end </w:t>
+        <w:t xml:space="preserve">              End-to-end </w:t>
       </w:r>
       <w:r>
         <w:rPr>
@@ -546,7 +546,7 @@
       </w:pPr>
       <w:r>
         <w:rPr/>
-        <w:t xml:space="preserve">                Unsupervised Isolation Forest anomaly detection scores every telemetry reading; above                0.7 triggers an alert and auto-generates a maintenance ticket, above 0.85 attaches a                diagnostic recommendation              </w:t>
+        <w:t xml:space="preserve">              Unsupervised Isolation Forest anomaly detection scores every telemetry reading; above              0.7 triggers an alert and auto-generates a maintenance ticket, above 0.85 attaches a              diagnostic recommendation            </w:t>
       </w:r>
     </w:p>
     <w:p>
@@ -565,7 +565,7 @@
       </w:r>
       <w:r>
         <w:rPr/>
-        <w:t xml:space="preserve"> (Admin, Technician, Viewer) enforced at API and                UI level with a full </w:t>
+        <w:t xml:space="preserve"> (Admin, Technician, Viewer) enforced at API and              UI level with a full </w:t>
       </w:r>
       <w:r>
         <w:rPr>
@@ -624,7 +624,7 @@
       </w:pPr>
       <w:r>
         <w:rPr/>
-        <w:t xml:space="preserve">                Delivered a </w:t>
+        <w:t xml:space="preserve">              Delivered a </w:t>
       </w:r>
       <w:r>
         <w:rPr>
@@ -634,7 +634,7 @@
       </w:r>
       <w:r>
         <w:rPr/>
-        <w:t xml:space="preserve">                bench testing              </w:t>
+        <w:t xml:space="preserve">              bench testing            </w:t>
       </w:r>
     </w:p>
     <w:p>
@@ -647,7 +647,7 @@
       </w:pPr>
       <w:r>
         <w:rPr/>
-        <w:t xml:space="preserve">                Validated performance with measured output of </w:t>
+        <w:t xml:space="preserve">              Validated performance with measured output of </w:t>
       </w:r>
       <w:r>
         <w:rPr>
@@ -708,7 +708,7 @@
       </w:pPr>
       <w:r>
         <w:rPr/>
-        <w:t xml:space="preserve">                Built a 64-LED interactive display with a </w:t>
+        <w:t xml:space="preserve">              Built a 64-LED interactive display with a </w:t>
       </w:r>
       <w:r>
         <w:rPr>
@@ -718,7 +718,7 @@
       </w:r>
       <w:r>
         <w:rPr/>
-        <w:t xml:space="preserve"> using                millis()              </w:t>
+        <w:t xml:space="preserve"> using              millis()            </w:t>
       </w:r>
     </w:p>
     <w:p>
@@ -731,7 +731,7 @@
       </w:pPr>
       <w:r>
         <w:rPr/>
-        <w:t xml:space="preserve">                Introduced four animation modes, ambient-light adaptive brightness and debounced user                controls              </w:t>
+        <w:t xml:space="preserve">              Introduced four animation modes, ambient-light adaptive brightness and debounced user              controls            </w:t>
       </w:r>
     </w:p>
     <w:p>
@@ -786,7 +786,7 @@
       </w:pPr>
       <w:r>
         <w:rPr/>
-        <w:t xml:space="preserve">                Engineered </w:t>
+        <w:t xml:space="preserve">              Engineered </w:t>
       </w:r>
       <w:r>
         <w:rPr>
@@ -802,7 +802,7 @@
         <w:rPr>
           <w:b/>
         </w:rPr>
-        <w:t xml:space="preserve">bcrypt hashing, CSRF tokens, PDO prepared                statements and brute-force protection</w:t>
+        <w:t xml:space="preserve">bcrypt hashing, CSRF tokens, PDO prepared              statements and brute-force protection</w:t>
       </w:r>
     </w:p>
     <w:p>
@@ -821,7 +821,7 @@
       </w:r>
       <w:r>
         <w:rPr/>
-        <w:t xml:space="preserve"> with searchable profiles, sorting/filtering and server-side PDF export              </w:t>
+        <w:t xml:space="preserve"> with searchable profiles, sorting/filtering and server-side PDF export            </w:t>
       </w:r>
     </w:p>
     <w:p>
@@ -874,7 +874,7 @@
       </w:pPr>
       <w:r>
         <w:rPr/>
-        <w:t xml:space="preserve">                Engineered a </w:t>
+        <w:t xml:space="preserve">              Engineered a </w:t>
       </w:r>
       <w:r>
         <w:rPr>
@@ -894,7 +894,7 @@
       </w:r>
       <w:r>
         <w:rPr/>
-        <w:t xml:space="preserve"> and strict                transition validation              </w:t>
+        <w:t xml:space="preserve"> and strict              transition validation            </w:t>
       </w:r>
     </w:p>
     <w:p>
@@ -907,7 +907,7 @@
       </w:pPr>
       <w:r>
         <w:rPr/>
-        <w:t xml:space="preserve">                Integrated door interlocks, </w:t>
+        <w:t xml:space="preserve">              Integrated door interlocks, </w:t>
       </w:r>
       <w:r>
         <w:rPr>
@@ -917,7 +917,7 @@
       </w:r>
       <w:r>
         <w:rPr/>
-        <w:t xml:space="preserve">, timed cooldown and LCD status                feedback for safe operation              </w:t>
+        <w:t xml:space="preserve">, timed cooldown and LCD status              feedback for safe operation            </w:t>
       </w:r>
     </w:p>
     <w:p>
@@ -972,7 +972,7 @@
       </w:pPr>
       <w:r>
         <w:rPr/>
-        <w:t xml:space="preserve">                Created a structured learning resource with </w:t>
+        <w:t xml:space="preserve">              Created a structured learning resource with </w:t>
       </w:r>
       <w:r>
         <w:rPr>
@@ -982,7 +982,7 @@
       </w:r>
       <w:r>
         <w:rPr/>
-        <w:t xml:space="preserve"> covering fundamentals to advanced workflows across Git, GitHub, GitLab and 5 other platforms              </w:t>
+        <w:t xml:space="preserve"> covering fundamentals to advanced workflows across Git, GitHub, GitLab and 5 other platforms            </w:t>
       </w:r>
     </w:p>
     <w:p>
@@ -1062,7 +1062,23 @@
       </w:pPr>
       <w:r>
         <w:rPr/>
-        <w:t xml:space="preserve">                Collect and communicate student feedback to academic staff through SSLC, Senate and                Council meetings              </w:t>
+        <w:t xml:space="preserve">              Collect and communicate </w:t>
+      </w:r>
+      <w:r>
+        <w:rPr>
+          <w:b/>
+        </w:rPr>
+        <w:t xml:space="preserve">student feedback</w:t>
+      </w:r>
+      <w:r>
+        <w:rPr/>
+        <w:t xml:space="preserve"> to academic staff through </w:t>
+      </w:r>
+      <w:r>
+        <w:rPr>
+          <w:b/>
+        </w:rPr>
+        <w:t xml:space="preserve">SSLC, Senate and              Council meetings</w:t>
       </w:r>
     </w:p>
     <w:p>
@@ -1075,7 +1091,23 @@
       </w:pPr>
       <w:r>
         <w:rPr/>
-        <w:t xml:space="preserve">Delivered improvements to learning delivery and the wider course experience</w:t>
+        <w:t xml:space="preserve">Delivered improvements to </w:t>
+      </w:r>
+      <w:r>
+        <w:rPr>
+          <w:b/>
+        </w:rPr>
+        <w:t xml:space="preserve">learning delivery</w:t>
+      </w:r>
+      <w:r>
+        <w:rPr/>
+        <w:t xml:space="preserve"> and the wider </w:t>
+      </w:r>
+      <w:r>
+        <w:rPr>
+          <w:b/>
+        </w:rPr>
+        <w:t xml:space="preserve">course experience</w:t>
       </w:r>
     </w:p>
     <w:p>
@@ -1124,7 +1156,7 @@
       </w:pPr>
       <w:r>
         <w:rPr/>
-        <w:t xml:space="preserve">                Reviewed </w:t>
+        <w:t xml:space="preserve">              Reviewed </w:t>
       </w:r>
       <w:r>
         <w:rPr>
@@ -1153,7 +1185,7 @@
       </w:pPr>
       <w:r>
         <w:rPr/>
-        <w:t xml:space="preserve">                Developed </w:t>
+        <w:t xml:space="preserve">              Developed </w:t>
       </w:r>
       <w:r>
         <w:rPr>
@@ -1173,7 +1205,7 @@
       </w:r>
       <w:r>
         <w:rPr/>
-        <w:t xml:space="preserve"> for six aircraft with risk-mitigation recommendations              </w:t>
+        <w:t xml:space="preserve"> for six aircraft with risk-mitigation recommendations            </w:t>
       </w:r>
     </w:p>
     <w:p>
@@ -1222,7 +1254,33 @@
       </w:pPr>
       <w:r>
         <w:rPr/>
-        <w:t xml:space="preserve">                Examined intelligent transport systems and digital solutions to evaluate their impact on                air quality and urban mobility efficiency              </w:t>
+        <w:t xml:space="preserve">              Examined </w:t>
+      </w:r>
+      <w:r>
+        <w:rPr>
+          <w:b/>
+        </w:rPr>
+        <w:t xml:space="preserve">intelligent transport systems</w:t>
+      </w:r>
+      <w:r>
+        <w:rPr/>
+        <w:t xml:space="preserve"> and </w:t>
+      </w:r>
+      <w:r>
+        <w:rPr>
+          <w:b/>
+        </w:rPr>
+        <w:t xml:space="preserve">digital solutions</w:t>
+      </w:r>
+      <w:r>
+        <w:rPr/>
+        <w:t xml:space="preserve"> to evaluate their impact on              air quality and </w:t>
+      </w:r>
+      <w:r>
+        <w:rPr>
+          <w:b/>
+        </w:rPr>
+        <w:t xml:space="preserve">urban mobility efficiency</w:t>
       </w:r>
     </w:p>
     <w:p>
@@ -1235,7 +1293,27 @@
       </w:pPr>
       <w:r>
         <w:rPr/>
-        <w:t xml:space="preserve">                Delivered technical insight outputs based on real-time pollution sensing and smart                traffic workflows              </w:t>
+        <w:t xml:space="preserve">              Delivered </w:t>
+      </w:r>
+      <w:r>
+        <w:rPr>
+          <w:b/>
+        </w:rPr>
+        <w:t xml:space="preserve">technical insight outputs</w:t>
+      </w:r>
+      <w:r>
+        <w:rPr/>
+        <w:t xml:space="preserve"> based on </w:t>
+      </w:r>
+      <w:r>
+        <w:rPr>
+          <w:b/>
+        </w:rPr>
+        <w:t xml:space="preserve">real-time pollution sensing</w:t>
+      </w:r>
+      <w:r>
+        <w:rPr/>
+        <w:t xml:space="preserve"> and smart              traffic workflows            </w:t>
       </w:r>
     </w:p>
     <w:p>
@@ -1284,7 +1362,73 @@
       </w:pPr>
       <w:r>
         <w:rPr/>
-        <w:t xml:space="preserve">                Operated end-to-end consular processing workflows using official diplomatic management systems - handling application intake, biometric data capture, document authentication and physical visa and passport production from print to issuance, supporting 100+ daily client interactions              </w:t>
+        <w:t xml:space="preserve">              Operated </w:t>
+      </w:r>
+      <w:r>
+        <w:rPr>
+          <w:b/>
+        </w:rPr>
+        <w:t xml:space="preserve">end-to-end consular processing workflows</w:t>
+      </w:r>
+      <w:r>
+        <w:rPr/>
+        <w:t xml:space="preserve"> using </w:t>
+      </w:r>
+      <w:r>
+        <w:rPr>
+          <w:b/>
+        </w:rPr>
+        <w:t xml:space="preserve">official diplomatic management systems</w:t>
+      </w:r>
+      <w:r>
+        <w:rPr/>
+        <w:t xml:space="preserve"> - handling </w:t>
+      </w:r>
+      <w:r>
+        <w:rPr>
+          <w:b/>
+        </w:rPr>
+        <w:t xml:space="preserve">application intake</w:t>
+      </w:r>
+      <w:r>
+        <w:rPr/>
+        <w:t xml:space="preserve">, </w:t>
+      </w:r>
+      <w:r>
+        <w:rPr>
+          <w:b/>
+        </w:rPr>
+        <w:t xml:space="preserve">biometric data capture</w:t>
+      </w:r>
+      <w:r>
+        <w:rPr/>
+        <w:t xml:space="preserve">, </w:t>
+      </w:r>
+      <w:r>
+        <w:rPr>
+          <w:b/>
+        </w:rPr>
+        <w:t xml:space="preserve">document authentication</w:t>
+      </w:r>
+      <w:r>
+        <w:rPr/>
+        <w:t xml:space="preserve"> and physical </w:t>
+      </w:r>
+      <w:r>
+        <w:rPr>
+          <w:b/>
+        </w:rPr>
+        <w:t xml:space="preserve">visa and passport production</w:t>
+      </w:r>
+      <w:r>
+        <w:rPr/>
+        <w:t xml:space="preserve"> from print to issuance, supporting </w:t>
+      </w:r>
+      <w:r>
+        <w:rPr>
+          <w:b/>
+        </w:rPr>
+        <w:t xml:space="preserve">100+ daily client interactions</w:t>
       </w:r>
     </w:p>
     <w:p>
@@ -1333,7 +1477,73 @@
       </w:pPr>
       <w:r>
         <w:rPr/>
-        <w:t xml:space="preserve">                Coordinated diplomatic property operations by accompanying officers on site inspections and facility surveys, managing estates documentation, maintenance schedules and office workflows to maintain mission operational standards              </w:t>
+        <w:t xml:space="preserve">              Coordinated </w:t>
+      </w:r>
+      <w:r>
+        <w:rPr>
+          <w:b/>
+        </w:rPr>
+        <w:t xml:space="preserve">diplomatic property operations</w:t>
+      </w:r>
+      <w:r>
+        <w:rPr/>
+        <w:t xml:space="preserve"> by accompanying officers on </w:t>
+      </w:r>
+      <w:r>
+        <w:rPr>
+          <w:b/>
+        </w:rPr>
+        <w:t xml:space="preserve">site inspections</w:t>
+      </w:r>
+      <w:r>
+        <w:rPr/>
+        <w:t xml:space="preserve"> and </w:t>
+      </w:r>
+      <w:r>
+        <w:rPr>
+          <w:b/>
+        </w:rPr>
+        <w:t xml:space="preserve">facility surveys</w:t>
+      </w:r>
+      <w:r>
+        <w:rPr/>
+        <w:t xml:space="preserve">, managing </w:t>
+      </w:r>
+      <w:r>
+        <w:rPr>
+          <w:b/>
+        </w:rPr>
+        <w:t xml:space="preserve">estates documentation</w:t>
+      </w:r>
+      <w:r>
+        <w:rPr/>
+        <w:t xml:space="preserve">, </w:t>
+      </w:r>
+      <w:r>
+        <w:rPr>
+          <w:b/>
+        </w:rPr>
+        <w:t xml:space="preserve">maintenance schedules</w:t>
+      </w:r>
+      <w:r>
+        <w:rPr/>
+        <w:t xml:space="preserve"> and </w:t>
+      </w:r>
+      <w:r>
+        <w:rPr>
+          <w:b/>
+        </w:rPr>
+        <w:t xml:space="preserve">office workflows</w:t>
+      </w:r>
+      <w:r>
+        <w:rPr/>
+        <w:t xml:space="preserve"> to maintain </w:t>
+      </w:r>
+      <w:r>
+        <w:rPr>
+          <w:b/>
+        </w:rPr>
+        <w:t xml:space="preserve">mission operational standards</w:t>
       </w:r>
     </w:p>
     <w:p>
@@ -1382,7 +1592,7 @@
       </w:pPr>
       <w:r>
         <w:rPr/>
-        <w:t xml:space="preserve">                Serviced, installed and maintained </w:t>
+        <w:t xml:space="preserve">              Serviced, installed and maintained </w:t>
       </w:r>
       <w:r>
         <w:rPr>
@@ -1456,7 +1666,7 @@
       </w:pPr>
       <w:r>
         <w:rPr/>
-        <w:t xml:space="preserve">                Evaluated employer submissions for </w:t>
+        <w:t xml:space="preserve">              Evaluated employer submissions for </w:t>
       </w:r>
       <w:r>
         <w:rPr>
@@ -1466,7 +1676,7 @@
       </w:r>
       <w:r>
         <w:rPr/>
-        <w:t xml:space="preserve"> using qualitative and scoring criteria; commended for a thorough, timely and high-quality approach              </w:t>
+        <w:t xml:space="preserve"> using qualitative and scoring criteria; commended for a thorough, timely and high-quality approach            </w:t>
       </w:r>
     </w:p>
     <w:p>
@@ -1506,7 +1716,7 @@
       </w:pPr>
       <w:r>
         <w:rPr/>
-        <w:t xml:space="preserve">                Completed </w:t>
+        <w:t xml:space="preserve">              Completed </w:t>
       </w:r>
       <w:r>
         <w:rPr>
@@ -1526,7 +1736,7 @@
       </w:r>
       <w:r>
         <w:rPr/>
-        <w:t xml:space="preserve"> (plus £159,224.14 Gift Aid)              </w:t>
+        <w:t xml:space="preserve"> (plus £159,224.14 Gift Aid)            </w:t>
       </w:r>
     </w:p>
     <w:p>
@@ -1569,7 +1779,7 @@
       </w:r>
       <w:r>
         <w:rPr/>
-        <w:t xml:space="preserve"> (Full Native),            </w:t>
+        <w:t xml:space="preserve"> (Full Native),          </w:t>
       </w:r>
       <w:r>
         <w:rPr>
@@ -1579,16 +1789,16 @@
       </w:r>
       <w:r>
         <w:rPr/>
-        <w:t xml:space="preserve"> (Elementary)          </w:t>
-      </w:r>
-    </w:p>
-    <w:p>
-      <w:pPr>
-        <w:spacing w:lineRule="auto"/>
-      </w:pPr>
-      <w:r>
-        <w:rPr/>
-        <w:t xml:space="preserve">          ;(function () {            var params = new URLSearchParams(window.location.search)            if (params.get("print") === "1") {              window.addEventListener(                "load",                function () {                  setTimeout(function () {                    window.print()                  }, 250)                },                { once: true }              )            }          })()        </w:t>
+        <w:t xml:space="preserve"> (Elementary)        </w:t>
+      </w:r>
+    </w:p>
+    <w:p>
+      <w:pPr>
+        <w:spacing w:lineRule="auto"/>
+      </w:pPr>
+      <w:r>
+        <w:rPr/>
+        <w:t xml:space="preserve">        ;(function () {          var params = new URLSearchParams(window.location.search)          if (params.get("print") === "1") {            window.addEventListener(              "load",              function () {                setTimeout(function () {                  window.print()                }, 250)              },              { once: true }            )          }        })()      </w:t>
       </w:r>
     </w:p>
   </w:body>

</xml_diff>

<commit_message>
feat: blog enrichment, open-source post, Spotify embeds, settings triggers and job scraper fix
- All 34 blog posts enriched with references, inline links and accessibility definitions
- New open-source-contributing post published live (2026-06-13)
- Blog renderer: Spotify embed ContentBlock and inline [text](url) link rendering
- Dashboard Settings: CV generation and WakaTime sync trigger buttons with API routes
- Job scraper browser-sources job pinned to ubuntu-22.04 to fix Playwright libasound2 failure on Noble
- CVs and cover letters rewritten with Inter font, full project list and per-role content
- SQL migration 008 adds url column to inventory_items
</commit_message>
<xml_diff>
--- a/public/resume/Isaac_Adjei_CV.docx
+++ b/public/resume/Isaac_Adjei_CV.docx
@@ -384,7 +384,7 @@
       </w:r>
       <w:r>
         <w:rPr/>
-        <w:t xml:space="preserve"> Arduino, STM32, ESP32, Raspberry Pi, AVR, KiCad,            Proteus, PCB Layout, Circuit Design, Oscilloscope, I2C / UART / SPI          </w:t>
+        <w:t xml:space="preserve"> Arduino, STM32, ESP32, Raspberry Pi, AVR, KiCad,            Proteus, PCB Layout, Circuit Design, Oscilloscope, I2C / UART / SPI, FPGA, VHDL          </w:t>
       </w:r>
     </w:p>
     <w:p>
@@ -1014,6 +1014,15 @@
       <w:r>
         <w:rPr/>
         <w:t xml:space="preserve">Experience</w:t>
+      </w:r>
+    </w:p>
+    <w:p>
+      <w:pPr>
+        <w:spacing w:lineRule="auto"/>
+      </w:pPr>
+      <w:r>
+        <w:rPr/>
+        <w:t xml:space="preserve"/>
       </w:r>
     </w:p>
     <w:p>

</xml_diff>

<commit_message>
chore: regenerate CV PDF and DOCX from cv.html
</commit_message>
<xml_diff>
--- a/public/resume/Isaac_Adjei_CV.docx
+++ b/public/resume/Isaac_Adjei_CV.docx
@@ -86,7 +86,7 @@
           <w:rPr>
             <w:rStyle w:val="Hyperlink"/>
           </w:rPr>
-          <w:t xml:space="preserve">LinkedIn</w:t>
+          <w:t xml:space="preserve">linkedin.com/in/isaacadjei</w:t>
         </w:r>
       </w:hyperlink>
     </w:p>
@@ -108,7 +108,7 @@
           <w:rPr>
             <w:rStyle w:val="Hyperlink"/>
           </w:rPr>
-          <w:t xml:space="preserve">GitHub</w:t>
+          <w:t xml:space="preserve">github.com/zaccesss</w:t>
         </w:r>
       </w:hyperlink>
     </w:p>
@@ -130,7 +130,7 @@
           <w:rPr>
             <w:rStyle w:val="Hyperlink"/>
           </w:rPr>
-          <w:t xml:space="preserve">ORCID</w:t>
+          <w:t xml:space="preserve">orcid.org/0009-0001-8298-5098</w:t>
         </w:r>
       </w:hyperlink>
     </w:p>
@@ -194,7 +194,7 @@
       </w:pPr>
       <w:r>
         <w:rPr/>
-        <w:t xml:space="preserve">Oct 2024 – Jul 2028</w:t>
+        <w:t xml:space="preserve">Oct 2024 - Jul 2028</w:t>
       </w:r>
     </w:p>
     <w:p>
@@ -223,7 +223,7 @@
       </w:pPr>
       <w:r>
         <w:rPr/>
-        <w:t xml:space="preserve">            Top 40 Finalist – Black Heritage Undergraduate of the Year Award 2026 (TargetJobs &amp; Sky)          </w:t>
+        <w:t xml:space="preserve">            Top 40 Finalist - Black Heritage Undergraduate of the Year Award 2026 (TargetJobs &amp; Sky)          </w:t>
       </w:r>
     </w:p>
     <w:p>
@@ -274,7 +274,7 @@
       </w:pPr>
       <w:r>
         <w:rPr/>
-        <w:t xml:space="preserve">Sep 2022 – Jul 2024</w:t>
+        <w:t xml:space="preserve">Sep 2022 - Jul 2024</w:t>
       </w:r>
     </w:p>
     <w:p>
@@ -740,7 +740,7 @@
       </w:pPr>
       <w:r>
         <w:rPr/>
-        <w:t xml:space="preserve">AstonCV – Full-Stack CV Database</w:t>
+        <w:t xml:space="preserve">AstonCV - Full-Stack CV Database</w:t>
       </w:r>
     </w:p>
     <w:p>
@@ -926,7 +926,7 @@
       </w:pPr>
       <w:r>
         <w:rPr/>
-        <w:t xml:space="preserve">git-unlocked – Open Source Git Course</w:t>
+        <w:t xml:space="preserve">git-unlocked - Open Source Git Course</w:t>
       </w:r>
     </w:p>
     <w:p>
@@ -1058,7 +1058,7 @@
       </w:pPr>
       <w:r>
         <w:rPr/>
-        <w:t xml:space="preserve">Sep 2025 – Present</w:t>
+        <w:t xml:space="preserve">Sep 2025 - Present</w:t>
       </w:r>
     </w:p>
     <w:p>
@@ -1071,23 +1071,13 @@
       </w:pPr>
       <w:r>
         <w:rPr/>
-        <w:t xml:space="preserve">              Collect and communicate </w:t>
+        <w:t xml:space="preserve">              Collect and communicate student feedback to academic staff through </w:t>
       </w:r>
       <w:r>
         <w:rPr>
           <w:b/>
         </w:rPr>
-        <w:t xml:space="preserve">student feedback</w:t>
-      </w:r>
-      <w:r>
-        <w:rPr/>
-        <w:t xml:space="preserve"> to academic staff through </w:t>
-      </w:r>
-      <w:r>
-        <w:rPr>
-          <w:b/>
-        </w:rPr>
-        <w:t xml:space="preserve">SSLC, Senate and              Council meetings</w:t>
+        <w:t xml:space="preserve">SSLC, Senate and Council meetings</w:t>
       </w:r>
     </w:p>
     <w:p>
@@ -1100,23 +1090,7 @@
       </w:pPr>
       <w:r>
         <w:rPr/>
-        <w:t xml:space="preserve">Delivered improvements to </w:t>
-      </w:r>
-      <w:r>
-        <w:rPr>
-          <w:b/>
-        </w:rPr>
-        <w:t xml:space="preserve">learning delivery</w:t>
-      </w:r>
-      <w:r>
-        <w:rPr/>
-        <w:t xml:space="preserve"> and the wider </w:t>
-      </w:r>
-      <w:r>
-        <w:rPr>
-          <w:b/>
-        </w:rPr>
-        <w:t xml:space="preserve">course experience</w:t>
+        <w:t xml:space="preserve">Delivered improvements to learning delivery and the wider course experience</w:t>
       </w:r>
     </w:p>
     <w:p>
@@ -1165,17 +1139,7 @@
       </w:pPr>
       <w:r>
         <w:rPr/>
-        <w:t xml:space="preserve">              Reviewed </w:t>
-      </w:r>
-      <w:r>
-        <w:rPr>
-          <w:b/>
-        </w:rPr>
-        <w:t xml:space="preserve">A320 maintenance schedules</w:t>
-      </w:r>
-      <w:r>
-        <w:rPr/>
-        <w:t xml:space="preserve">, diagnosed component faults and produced structured </w:t>
+        <w:t xml:space="preserve">              Reviewed A320 maintenance schedules, diagnosed component faults and produced structured </w:t>
       </w:r>
       <w:r>
         <w:rPr>
@@ -1194,27 +1158,7 @@
       </w:pPr>
       <w:r>
         <w:rPr/>
-        <w:t xml:space="preserve">              Developed </w:t>
-      </w:r>
-      <w:r>
-        <w:rPr>
-          <w:b/>
-        </w:rPr>
-        <w:t xml:space="preserve">material forecasts</w:t>
-      </w:r>
-      <w:r>
-        <w:rPr/>
-        <w:t xml:space="preserve"> and </w:t>
-      </w:r>
-      <w:r>
-        <w:rPr>
-          <w:b/>
-        </w:rPr>
-        <w:t xml:space="preserve">maintenance planning reports</w:t>
-      </w:r>
-      <w:r>
-        <w:rPr/>
-        <w:t xml:space="preserve"> for six aircraft with risk-mitigation recommendations            </w:t>
+        <w:t xml:space="preserve">              Developed material forecasts and maintenance planning reports for six aircraft with risk-mitigation recommendations            </w:t>
       </w:r>
     </w:p>
     <w:p>
@@ -1273,23 +1217,7 @@
       </w:r>
       <w:r>
         <w:rPr/>
-        <w:t xml:space="preserve"> and </w:t>
-      </w:r>
-      <w:r>
-        <w:rPr>
-          <w:b/>
-        </w:rPr>
-        <w:t xml:space="preserve">digital solutions</w:t>
-      </w:r>
-      <w:r>
-        <w:rPr/>
-        <w:t xml:space="preserve"> to evaluate their impact on              air quality and </w:t>
-      </w:r>
-      <w:r>
-        <w:rPr>
-          <w:b/>
-        </w:rPr>
-        <w:t xml:space="preserve">urban mobility efficiency</w:t>
+        <w:t xml:space="preserve"> and digital solutions to evaluate their impact on air quality and urban mobility efficiency            </w:t>
       </w:r>
     </w:p>
     <w:p>
@@ -1302,27 +1230,7 @@
       </w:pPr>
       <w:r>
         <w:rPr/>
-        <w:t xml:space="preserve">              Delivered </w:t>
-      </w:r>
-      <w:r>
-        <w:rPr>
-          <w:b/>
-        </w:rPr>
-        <w:t xml:space="preserve">technical insight outputs</w:t>
-      </w:r>
-      <w:r>
-        <w:rPr/>
-        <w:t xml:space="preserve"> based on </w:t>
-      </w:r>
-      <w:r>
-        <w:rPr>
-          <w:b/>
-        </w:rPr>
-        <w:t xml:space="preserve">real-time pollution sensing</w:t>
-      </w:r>
-      <w:r>
-        <w:rPr/>
-        <w:t xml:space="preserve"> and smart              traffic workflows            </w:t>
+        <w:t xml:space="preserve">              Delivered technical insight outputs based on real-time pollution sensing and smart traffic workflows            </w:t>
       </w:r>
     </w:p>
     <w:p>
@@ -1358,7 +1266,7 @@
       </w:pPr>
       <w:r>
         <w:rPr/>
-        <w:t xml:space="preserve">Jul 2024 – Aug 2024</w:t>
+        <w:t xml:space="preserve">Jul 2024 - Aug 2024</w:t>
       </w:r>
     </w:p>
     <w:p>
@@ -1371,67 +1279,7 @@
       </w:pPr>
       <w:r>
         <w:rPr/>
-        <w:t xml:space="preserve">              Operated </w:t>
-      </w:r>
-      <w:r>
-        <w:rPr>
-          <w:b/>
-        </w:rPr>
-        <w:t xml:space="preserve">end-to-end consular processing workflows</w:t>
-      </w:r>
-      <w:r>
-        <w:rPr/>
-        <w:t xml:space="preserve"> using </w:t>
-      </w:r>
-      <w:r>
-        <w:rPr>
-          <w:b/>
-        </w:rPr>
-        <w:t xml:space="preserve">official diplomatic management systems</w:t>
-      </w:r>
-      <w:r>
-        <w:rPr/>
-        <w:t xml:space="preserve"> - handling </w:t>
-      </w:r>
-      <w:r>
-        <w:rPr>
-          <w:b/>
-        </w:rPr>
-        <w:t xml:space="preserve">application intake</w:t>
-      </w:r>
-      <w:r>
-        <w:rPr/>
-        <w:t xml:space="preserve">, </w:t>
-      </w:r>
-      <w:r>
-        <w:rPr>
-          <w:b/>
-        </w:rPr>
-        <w:t xml:space="preserve">biometric data capture</w:t>
-      </w:r>
-      <w:r>
-        <w:rPr/>
-        <w:t xml:space="preserve">, </w:t>
-      </w:r>
-      <w:r>
-        <w:rPr>
-          <w:b/>
-        </w:rPr>
-        <w:t xml:space="preserve">document authentication</w:t>
-      </w:r>
-      <w:r>
-        <w:rPr/>
-        <w:t xml:space="preserve"> and physical </w:t>
-      </w:r>
-      <w:r>
-        <w:rPr>
-          <w:b/>
-        </w:rPr>
-        <w:t xml:space="preserve">visa and passport production</w:t>
-      </w:r>
-      <w:r>
-        <w:rPr/>
-        <w:t xml:space="preserve"> from print to issuance, supporting </w:t>
+        <w:t xml:space="preserve">              Operated end-to-end consular processing workflows using official diplomatic management systems - handling application intake, biometric data capture, document authentication and physical visa and passport production from print to issuance, supporting </w:t>
       </w:r>
       <w:r>
         <w:rPr>
@@ -1496,63 +1344,7 @@
       </w:r>
       <w:r>
         <w:rPr/>
-        <w:t xml:space="preserve"> by accompanying officers on </w:t>
-      </w:r>
-      <w:r>
-        <w:rPr>
-          <w:b/>
-        </w:rPr>
-        <w:t xml:space="preserve">site inspections</w:t>
-      </w:r>
-      <w:r>
-        <w:rPr/>
-        <w:t xml:space="preserve"> and </w:t>
-      </w:r>
-      <w:r>
-        <w:rPr>
-          <w:b/>
-        </w:rPr>
-        <w:t xml:space="preserve">facility surveys</w:t>
-      </w:r>
-      <w:r>
-        <w:rPr/>
-        <w:t xml:space="preserve">, managing </w:t>
-      </w:r>
-      <w:r>
-        <w:rPr>
-          <w:b/>
-        </w:rPr>
-        <w:t xml:space="preserve">estates documentation</w:t>
-      </w:r>
-      <w:r>
-        <w:rPr/>
-        <w:t xml:space="preserve">, </w:t>
-      </w:r>
-      <w:r>
-        <w:rPr>
-          <w:b/>
-        </w:rPr>
-        <w:t xml:space="preserve">maintenance schedules</w:t>
-      </w:r>
-      <w:r>
-        <w:rPr/>
-        <w:t xml:space="preserve"> and </w:t>
-      </w:r>
-      <w:r>
-        <w:rPr>
-          <w:b/>
-        </w:rPr>
-        <w:t xml:space="preserve">office workflows</w:t>
-      </w:r>
-      <w:r>
-        <w:rPr/>
-        <w:t xml:space="preserve"> to maintain </w:t>
-      </w:r>
-      <w:r>
-        <w:rPr>
-          <w:b/>
-        </w:rPr>
-        <w:t xml:space="preserve">mission operational standards</w:t>
+        <w:t xml:space="preserve"> by accompanying officers on site inspections and facility surveys, managing estates documentation, maintenance schedules and office workflows            </w:t>
       </w:r>
     </w:p>
     <w:p>
@@ -1588,7 +1380,7 @@
       </w:pPr>
       <w:r>
         <w:rPr/>
-        <w:t xml:space="preserve">Jul 2019 – Jul 2021</w:t>
+        <w:t xml:space="preserve">Jul 2019 - Jul 2021</w:t>
       </w:r>
     </w:p>
     <w:p>
@@ -1611,13 +1403,7 @@
       </w:r>
       <w:r>
         <w:rPr/>
-        <w:t xml:space="preserve"> using standard </w:t>
-      </w:r>
-      <w:r>
-        <w:rPr>
-          <w:b/>
-        </w:rPr>
-        <w:t xml:space="preserve">diagnostic tools and field servicing techniques</w:t>
+        <w:t xml:space="preserve"> using standard diagnostic tools and field servicing techniques            </w:t>
       </w:r>
     </w:p>
     <w:p>
@@ -1644,7 +1430,7 @@
       </w:pPr>
       <w:r>
         <w:rPr/>
-        <w:t xml:space="preserve">Student Judge – National Emerging Talent Awards 2026</w:t>
+        <w:t xml:space="preserve">Student Judge - National Emerging Talent Awards 2026</w:t>
       </w:r>
     </w:p>
     <w:p>
@@ -1694,16 +1480,16 @@
       </w:pPr>
       <w:r>
         <w:rPr/>
-        <w:t xml:space="preserve">Fundraising Volunteer – 10 Days of 5K Challenge</w:t>
-      </w:r>
-    </w:p>
-    <w:p>
-      <w:pPr>
-        <w:spacing w:lineRule="auto"/>
-      </w:pPr>
-      <w:r>
-        <w:rPr/>
-        <w:t xml:space="preserve">Feb – Mar 2026</w:t>
+        <w:t xml:space="preserve">Fundraising Volunteer - 10 Days of 5K Challenge</w:t>
+      </w:r>
+    </w:p>
+    <w:p>
+      <w:pPr>
+        <w:spacing w:lineRule="auto"/>
+      </w:pPr>
+      <w:r>
+        <w:rPr/>
+        <w:t xml:space="preserve">Feb - Mar 2026</w:t>
       </w:r>
     </w:p>
     <w:p>

</xml_diff>

<commit_message>
chore: regenerate CV download artefacts (#280)
* feat: blog enrichment, open-source post, Spotify embeds, settings triggers and job scraper fix

- All 34 blog posts enriched with references, inline links and accessibility definitions
- New open-source-contributing post published live (2026-06-13)
- Blog renderer: Spotify embed ContentBlock and inline [text](url) link rendering
- Dashboard Settings: CV generation and WakaTime sync trigger buttons with API routes
- Job scraper browser-sources job pinned to ubuntu-22.04 to fix Playwright libasound2 failure on Noble
- CVs and cover letters rewritten with Inter font, full project list and per-role content
- SQL migration 008 adds url column to inventory_items

* chore: regenerate CV PDF and DOCX from cv.html

---------

Co-authored-by: github-actions[bot] <github-actions[bot]@users.noreply.github.com>
</commit_message>
<xml_diff>
--- a/public/resume/Isaac_Adjei_CV.docx
+++ b/public/resume/Isaac_Adjei_CV.docx
@@ -86,7 +86,7 @@
           <w:rPr>
             <w:rStyle w:val="Hyperlink"/>
           </w:rPr>
-          <w:t xml:space="preserve">LinkedIn</w:t>
+          <w:t xml:space="preserve">linkedin.com/in/isaacadjei</w:t>
         </w:r>
       </w:hyperlink>
     </w:p>
@@ -108,7 +108,7 @@
           <w:rPr>
             <w:rStyle w:val="Hyperlink"/>
           </w:rPr>
-          <w:t xml:space="preserve">GitHub</w:t>
+          <w:t xml:space="preserve">github.com/zaccesss</w:t>
         </w:r>
       </w:hyperlink>
     </w:p>
@@ -130,7 +130,7 @@
           <w:rPr>
             <w:rStyle w:val="Hyperlink"/>
           </w:rPr>
-          <w:t xml:space="preserve">ORCID</w:t>
+          <w:t xml:space="preserve">orcid.org/0009-0001-8298-5098</w:t>
         </w:r>
       </w:hyperlink>
     </w:p>
@@ -194,7 +194,7 @@
       </w:pPr>
       <w:r>
         <w:rPr/>
-        <w:t xml:space="preserve">Oct 2024 – Jul 2028</w:t>
+        <w:t xml:space="preserve">Oct 2024 - Jul 2028</w:t>
       </w:r>
     </w:p>
     <w:p>
@@ -223,7 +223,7 @@
       </w:pPr>
       <w:r>
         <w:rPr/>
-        <w:t xml:space="preserve">            Top 40 Finalist – Black Heritage Undergraduate of the Year Award 2026 (TargetJobs &amp; Sky)          </w:t>
+        <w:t xml:space="preserve">            Top 40 Finalist - Black Heritage Undergraduate of the Year Award 2026 (TargetJobs &amp; Sky)          </w:t>
       </w:r>
     </w:p>
     <w:p>
@@ -274,7 +274,7 @@
       </w:pPr>
       <w:r>
         <w:rPr/>
-        <w:t xml:space="preserve">Sep 2022 – Jul 2024</w:t>
+        <w:t xml:space="preserve">Sep 2022 - Jul 2024</w:t>
       </w:r>
     </w:p>
     <w:p>
@@ -384,7 +384,7 @@
       </w:r>
       <w:r>
         <w:rPr/>
-        <w:t xml:space="preserve"> Arduino, STM32, ESP32, Raspberry Pi, AVR, KiCad,            Proteus, PCB Layout, Circuit Design, Oscilloscope, I2C / UART / SPI          </w:t>
+        <w:t xml:space="preserve"> Arduino, STM32, ESP32, Raspberry Pi, AVR, KiCad,            Proteus, PCB Layout, Circuit Design, Oscilloscope, I2C / UART / SPI, FPGA, VHDL          </w:t>
       </w:r>
     </w:p>
     <w:p>
@@ -740,7 +740,7 @@
       </w:pPr>
       <w:r>
         <w:rPr/>
-        <w:t xml:space="preserve">AstonCV – Full-Stack CV Database</w:t>
+        <w:t xml:space="preserve">AstonCV - Full-Stack CV Database</w:t>
       </w:r>
     </w:p>
     <w:p>
@@ -926,7 +926,7 @@
       </w:pPr>
       <w:r>
         <w:rPr/>
-        <w:t xml:space="preserve">git-unlocked – Open Source Git Course</w:t>
+        <w:t xml:space="preserve">git-unlocked - Open Source Git Course</w:t>
       </w:r>
     </w:p>
     <w:p>
@@ -1022,6 +1022,15 @@
       </w:pPr>
       <w:r>
         <w:rPr/>
+        <w:t xml:space="preserve"/>
+      </w:r>
+    </w:p>
+    <w:p>
+      <w:pPr>
+        <w:spacing w:lineRule="auto"/>
+      </w:pPr>
+      <w:r>
+        <w:rPr/>
         <w:t xml:space="preserve">Student Representative</w:t>
       </w:r>
     </w:p>
@@ -1049,7 +1058,7 @@
       </w:pPr>
       <w:r>
         <w:rPr/>
-        <w:t xml:space="preserve">Sep 2025 – Present</w:t>
+        <w:t xml:space="preserve">Sep 2025 - Present</w:t>
       </w:r>
     </w:p>
     <w:p>
@@ -1062,23 +1071,13 @@
       </w:pPr>
       <w:r>
         <w:rPr/>
-        <w:t xml:space="preserve">              Collect and communicate </w:t>
+        <w:t xml:space="preserve">              Collect and communicate student feedback to academic staff through </w:t>
       </w:r>
       <w:r>
         <w:rPr>
           <w:b/>
         </w:rPr>
-        <w:t xml:space="preserve">student feedback</w:t>
-      </w:r>
-      <w:r>
-        <w:rPr/>
-        <w:t xml:space="preserve"> to academic staff through </w:t>
-      </w:r>
-      <w:r>
-        <w:rPr>
-          <w:b/>
-        </w:rPr>
-        <w:t xml:space="preserve">SSLC, Senate and              Council meetings</w:t>
+        <w:t xml:space="preserve">SSLC, Senate and Council meetings</w:t>
       </w:r>
     </w:p>
     <w:p>
@@ -1091,23 +1090,7 @@
       </w:pPr>
       <w:r>
         <w:rPr/>
-        <w:t xml:space="preserve">Delivered improvements to </w:t>
-      </w:r>
-      <w:r>
-        <w:rPr>
-          <w:b/>
-        </w:rPr>
-        <w:t xml:space="preserve">learning delivery</w:t>
-      </w:r>
-      <w:r>
-        <w:rPr/>
-        <w:t xml:space="preserve"> and the wider </w:t>
-      </w:r>
-      <w:r>
-        <w:rPr>
-          <w:b/>
-        </w:rPr>
-        <w:t xml:space="preserve">course experience</w:t>
+        <w:t xml:space="preserve">Delivered improvements to learning delivery and the wider course experience</w:t>
       </w:r>
     </w:p>
     <w:p>
@@ -1156,17 +1139,7 @@
       </w:pPr>
       <w:r>
         <w:rPr/>
-        <w:t xml:space="preserve">              Reviewed </w:t>
-      </w:r>
-      <w:r>
-        <w:rPr>
-          <w:b/>
-        </w:rPr>
-        <w:t xml:space="preserve">A320 maintenance schedules</w:t>
-      </w:r>
-      <w:r>
-        <w:rPr/>
-        <w:t xml:space="preserve">, diagnosed component faults and produced structured </w:t>
+        <w:t xml:space="preserve">              Reviewed A320 maintenance schedules, diagnosed component faults and produced structured </w:t>
       </w:r>
       <w:r>
         <w:rPr>
@@ -1185,27 +1158,7 @@
       </w:pPr>
       <w:r>
         <w:rPr/>
-        <w:t xml:space="preserve">              Developed </w:t>
-      </w:r>
-      <w:r>
-        <w:rPr>
-          <w:b/>
-        </w:rPr>
-        <w:t xml:space="preserve">material forecasts</w:t>
-      </w:r>
-      <w:r>
-        <w:rPr/>
-        <w:t xml:space="preserve"> and </w:t>
-      </w:r>
-      <w:r>
-        <w:rPr>
-          <w:b/>
-        </w:rPr>
-        <w:t xml:space="preserve">maintenance planning reports</w:t>
-      </w:r>
-      <w:r>
-        <w:rPr/>
-        <w:t xml:space="preserve"> for six aircraft with risk-mitigation recommendations            </w:t>
+        <w:t xml:space="preserve">              Developed material forecasts and maintenance planning reports for six aircraft with risk-mitigation recommendations            </w:t>
       </w:r>
     </w:p>
     <w:p>
@@ -1264,23 +1217,7 @@
       </w:r>
       <w:r>
         <w:rPr/>
-        <w:t xml:space="preserve"> and </w:t>
-      </w:r>
-      <w:r>
-        <w:rPr>
-          <w:b/>
-        </w:rPr>
-        <w:t xml:space="preserve">digital solutions</w:t>
-      </w:r>
-      <w:r>
-        <w:rPr/>
-        <w:t xml:space="preserve"> to evaluate their impact on              air quality and </w:t>
-      </w:r>
-      <w:r>
-        <w:rPr>
-          <w:b/>
-        </w:rPr>
-        <w:t xml:space="preserve">urban mobility efficiency</w:t>
+        <w:t xml:space="preserve"> and digital solutions to evaluate their impact on air quality and urban mobility efficiency            </w:t>
       </w:r>
     </w:p>
     <w:p>
@@ -1293,27 +1230,7 @@
       </w:pPr>
       <w:r>
         <w:rPr/>
-        <w:t xml:space="preserve">              Delivered </w:t>
-      </w:r>
-      <w:r>
-        <w:rPr>
-          <w:b/>
-        </w:rPr>
-        <w:t xml:space="preserve">technical insight outputs</w:t>
-      </w:r>
-      <w:r>
-        <w:rPr/>
-        <w:t xml:space="preserve"> based on </w:t>
-      </w:r>
-      <w:r>
-        <w:rPr>
-          <w:b/>
-        </w:rPr>
-        <w:t xml:space="preserve">real-time pollution sensing</w:t>
-      </w:r>
-      <w:r>
-        <w:rPr/>
-        <w:t xml:space="preserve"> and smart              traffic workflows            </w:t>
+        <w:t xml:space="preserve">              Delivered technical insight outputs based on real-time pollution sensing and smart traffic workflows            </w:t>
       </w:r>
     </w:p>
     <w:p>
@@ -1349,7 +1266,7 @@
       </w:pPr>
       <w:r>
         <w:rPr/>
-        <w:t xml:space="preserve">Jul 2024 – Aug 2024</w:t>
+        <w:t xml:space="preserve">Jul 2024 - Aug 2024</w:t>
       </w:r>
     </w:p>
     <w:p>
@@ -1362,67 +1279,7 @@
       </w:pPr>
       <w:r>
         <w:rPr/>
-        <w:t xml:space="preserve">              Operated </w:t>
-      </w:r>
-      <w:r>
-        <w:rPr>
-          <w:b/>
-        </w:rPr>
-        <w:t xml:space="preserve">end-to-end consular processing workflows</w:t>
-      </w:r>
-      <w:r>
-        <w:rPr/>
-        <w:t xml:space="preserve"> using </w:t>
-      </w:r>
-      <w:r>
-        <w:rPr>
-          <w:b/>
-        </w:rPr>
-        <w:t xml:space="preserve">official diplomatic management systems</w:t>
-      </w:r>
-      <w:r>
-        <w:rPr/>
-        <w:t xml:space="preserve"> - handling </w:t>
-      </w:r>
-      <w:r>
-        <w:rPr>
-          <w:b/>
-        </w:rPr>
-        <w:t xml:space="preserve">application intake</w:t>
-      </w:r>
-      <w:r>
-        <w:rPr/>
-        <w:t xml:space="preserve">, </w:t>
-      </w:r>
-      <w:r>
-        <w:rPr>
-          <w:b/>
-        </w:rPr>
-        <w:t xml:space="preserve">biometric data capture</w:t>
-      </w:r>
-      <w:r>
-        <w:rPr/>
-        <w:t xml:space="preserve">, </w:t>
-      </w:r>
-      <w:r>
-        <w:rPr>
-          <w:b/>
-        </w:rPr>
-        <w:t xml:space="preserve">document authentication</w:t>
-      </w:r>
-      <w:r>
-        <w:rPr/>
-        <w:t xml:space="preserve"> and physical </w:t>
-      </w:r>
-      <w:r>
-        <w:rPr>
-          <w:b/>
-        </w:rPr>
-        <w:t xml:space="preserve">visa and passport production</w:t>
-      </w:r>
-      <w:r>
-        <w:rPr/>
-        <w:t xml:space="preserve"> from print to issuance, supporting </w:t>
+        <w:t xml:space="preserve">              Operated end-to-end consular processing workflows using official diplomatic management systems - handling application intake, biometric data capture, document authentication and physical visa and passport production from print to issuance, supporting </w:t>
       </w:r>
       <w:r>
         <w:rPr>
@@ -1487,63 +1344,7 @@
       </w:r>
       <w:r>
         <w:rPr/>
-        <w:t xml:space="preserve"> by accompanying officers on </w:t>
-      </w:r>
-      <w:r>
-        <w:rPr>
-          <w:b/>
-        </w:rPr>
-        <w:t xml:space="preserve">site inspections</w:t>
-      </w:r>
-      <w:r>
-        <w:rPr/>
-        <w:t xml:space="preserve"> and </w:t>
-      </w:r>
-      <w:r>
-        <w:rPr>
-          <w:b/>
-        </w:rPr>
-        <w:t xml:space="preserve">facility surveys</w:t>
-      </w:r>
-      <w:r>
-        <w:rPr/>
-        <w:t xml:space="preserve">, managing </w:t>
-      </w:r>
-      <w:r>
-        <w:rPr>
-          <w:b/>
-        </w:rPr>
-        <w:t xml:space="preserve">estates documentation</w:t>
-      </w:r>
-      <w:r>
-        <w:rPr/>
-        <w:t xml:space="preserve">, </w:t>
-      </w:r>
-      <w:r>
-        <w:rPr>
-          <w:b/>
-        </w:rPr>
-        <w:t xml:space="preserve">maintenance schedules</w:t>
-      </w:r>
-      <w:r>
-        <w:rPr/>
-        <w:t xml:space="preserve"> and </w:t>
-      </w:r>
-      <w:r>
-        <w:rPr>
-          <w:b/>
-        </w:rPr>
-        <w:t xml:space="preserve">office workflows</w:t>
-      </w:r>
-      <w:r>
-        <w:rPr/>
-        <w:t xml:space="preserve"> to maintain </w:t>
-      </w:r>
-      <w:r>
-        <w:rPr>
-          <w:b/>
-        </w:rPr>
-        <w:t xml:space="preserve">mission operational standards</w:t>
+        <w:t xml:space="preserve"> by accompanying officers on site inspections and facility surveys, managing estates documentation, maintenance schedules and office workflows            </w:t>
       </w:r>
     </w:p>
     <w:p>
@@ -1579,7 +1380,7 @@
       </w:pPr>
       <w:r>
         <w:rPr/>
-        <w:t xml:space="preserve">Jul 2019 – Jul 2021</w:t>
+        <w:t xml:space="preserve">Jul 2019 - Jul 2021</w:t>
       </w:r>
     </w:p>
     <w:p>
@@ -1602,13 +1403,7 @@
       </w:r>
       <w:r>
         <w:rPr/>
-        <w:t xml:space="preserve"> using standard </w:t>
-      </w:r>
-      <w:r>
-        <w:rPr>
-          <w:b/>
-        </w:rPr>
-        <w:t xml:space="preserve">diagnostic tools and field servicing techniques</w:t>
+        <w:t xml:space="preserve"> using standard diagnostic tools and field servicing techniques            </w:t>
       </w:r>
     </w:p>
     <w:p>
@@ -1635,7 +1430,7 @@
       </w:pPr>
       <w:r>
         <w:rPr/>
-        <w:t xml:space="preserve">Student Judge – National Emerging Talent Awards 2026</w:t>
+        <w:t xml:space="preserve">Student Judge - National Emerging Talent Awards 2026</w:t>
       </w:r>
     </w:p>
     <w:p>
@@ -1685,16 +1480,16 @@
       </w:pPr>
       <w:r>
         <w:rPr/>
-        <w:t xml:space="preserve">Fundraising Volunteer – 10 Days of 5K Challenge</w:t>
-      </w:r>
-    </w:p>
-    <w:p>
-      <w:pPr>
-        <w:spacing w:lineRule="auto"/>
-      </w:pPr>
-      <w:r>
-        <w:rPr/>
-        <w:t xml:space="preserve">Feb – Mar 2026</w:t>
+        <w:t xml:space="preserve">Fundraising Volunteer - 10 Days of 5K Challenge</w:t>
+      </w:r>
+    </w:p>
+    <w:p>
+      <w:pPr>
+        <w:spacing w:lineRule="auto"/>
+      </w:pPr>
+      <w:r>
+        <w:rPr/>
+        <w:t xml:space="preserve">Feb - Mar 2026</w:t>
       </w:r>
     </w:p>
     <w:p>

</xml_diff>

<commit_message>
fix: restore Projects and Experience sections in role CV DOCX files
reorderEntryBlock strips all HTML comments to filter the PAL Leader
placeholder, but this also removed the section delimiter markers
that generateCVDocxNative needs to extract Projects and Experience.
Re-insert the markers explicitly in createRoleCV before assembly.

Regenerate all 6 role CVs and all cover letters.
</commit_message>
<xml_diff>
--- a/public/resume/Isaac_Adjei_CV.docx
+++ b/public/resume/Isaac_Adjei_CV.docx
@@ -33,7 +33,7 @@
         </w:rPr>
         <w:t xml:space="preserve">✉ </w:t>
       </w:r>
-      <w:hyperlink w:history="1" r:id="rIddzwacpwvbnu0xbffh-kkd">
+      <w:hyperlink w:history="1" r:id="rIdelpenwmkomh8jzkyux0fk">
         <w:r>
           <w:rPr>
             <w:rFonts w:ascii="Calibri" w:cs="Calibri" w:eastAsia="Calibri" w:hAnsi="Calibri"/>
@@ -63,7 +63,7 @@
         </w:rPr>
         <w:t xml:space="preserve">• </w:t>
       </w:r>
-      <w:hyperlink w:history="1" r:id="rIdl_r6svn-0bh7goe9qusxu">
+      <w:hyperlink w:history="1" r:id="rIdu0x-69zzife1g1nbq1-a_">
         <w:r>
           <w:rPr>
             <w:rFonts w:ascii="Calibri" w:cs="Calibri" w:eastAsia="Calibri" w:hAnsi="Calibri"/>
@@ -93,7 +93,7 @@
         </w:rPr>
         <w:t xml:space="preserve">⁠in </w:t>
       </w:r>
-      <w:hyperlink w:history="1" r:id="rIdh0m2fbbzoc7c4pkwfcc7b">
+      <w:hyperlink w:history="1" r:id="rIdixuoywwwfokv4kq1muly6">
         <w:r>
           <w:rPr>
             <w:rFonts w:ascii="Calibri" w:cs="Calibri" w:eastAsia="Calibri" w:hAnsi="Calibri"/>
@@ -123,7 +123,7 @@
         </w:rPr>
         <w:t xml:space="preserve">◔ </w:t>
       </w:r>
-      <w:hyperlink w:history="1" r:id="rIdo1um_7oabrqkztvepjikq">
+      <w:hyperlink w:history="1" r:id="rIds5eeubzbaguwxlqbkmxy5">
         <w:r>
           <w:rPr>
             <w:rFonts w:ascii="Calibri" w:cs="Calibri" w:eastAsia="Calibri" w:hAnsi="Calibri"/>
@@ -153,7 +153,7 @@
         </w:rPr>
         <w:t xml:space="preserve">Ⓘ </w:t>
       </w:r>
-      <w:hyperlink w:history="1" r:id="rIdupisoj6w70kmynew1zelz">
+      <w:hyperlink w:history="1" r:id="rIdh1yhmbjb_zt9ocvporefk">
         <w:r>
           <w:rPr>
             <w:rFonts w:ascii="Calibri" w:cs="Calibri" w:eastAsia="Calibri" w:hAnsi="Calibri"/>
@@ -716,7 +716,7 @@
         </w:rPr>
         <w:t xml:space="preserve">   </w:t>
       </w:r>
-      <w:hyperlink w:history="1" r:id="rId58oih-htymxugniy5m4mz">
+      <w:hyperlink w:history="1" r:id="rIdwzs4so6a29zmsn9mrtoq0">
         <w:r>
           <w:rPr>
             <w:rFonts w:ascii="Calibri" w:cs="Calibri" w:eastAsia="Calibri" w:hAnsi="Calibri"/>
@@ -744,7 +744,7 @@
         </w:rPr>
         <w:t xml:space="preserve">| </w:t>
       </w:r>
-      <w:hyperlink w:history="1" r:id="rId8vgrpuralr2tsjntfba0u">
+      <w:hyperlink w:history="1" r:id="rIdaszjncc9ax0rayccbpwuy">
         <w:r>
           <w:rPr>
             <w:rFonts w:ascii="Calibri" w:cs="Calibri" w:eastAsia="Calibri" w:hAnsi="Calibri"/>
@@ -772,7 +772,7 @@
         </w:rPr>
         <w:t xml:space="preserve">| </w:t>
       </w:r>
-      <w:hyperlink w:history="1" r:id="rIdtfykkswxp1hdsfr7ww4sj">
+      <w:hyperlink w:history="1" r:id="rIdjcsw70ssiuxcwnr0f5lbk">
         <w:r>
           <w:rPr>
             <w:rFonts w:ascii="Calibri" w:cs="Calibri" w:eastAsia="Calibri" w:hAnsi="Calibri"/>
@@ -1125,7 +1125,7 @@
         </w:rPr>
         <w:t xml:space="preserve">   </w:t>
       </w:r>
-      <w:hyperlink w:history="1" r:id="rId0ihunw3xp1jxrig1ausvq">
+      <w:hyperlink w:history="1" r:id="rIdsstkhvvdrjzfeow7teprm">
         <w:r>
           <w:rPr>
             <w:rFonts w:ascii="Calibri" w:cs="Calibri" w:eastAsia="Calibri" w:hAnsi="Calibri"/>
@@ -1275,7 +1275,7 @@
         </w:rPr>
         <w:t xml:space="preserve">   </w:t>
       </w:r>
-      <w:hyperlink w:history="1" r:id="rIdietc0y3iamdw8nppzw1ir">
+      <w:hyperlink w:history="1" r:id="rIdzhnsockl4vemadefybjyw">
         <w:r>
           <w:rPr>
             <w:rFonts w:ascii="Calibri" w:cs="Calibri" w:eastAsia="Calibri" w:hAnsi="Calibri"/>
@@ -1303,7 +1303,7 @@
         </w:rPr>
         <w:t xml:space="preserve">| </w:t>
       </w:r>
-      <w:hyperlink w:history="1" r:id="rId3io29nklwreox9t0u-okm">
+      <w:hyperlink w:history="1" r:id="rIdbc0n1ufpenwfchiwt92_m">
         <w:r>
           <w:rPr>
             <w:rFonts w:ascii="Calibri" w:cs="Calibri" w:eastAsia="Calibri" w:hAnsi="Calibri"/>
@@ -1436,7 +1436,7 @@
         </w:rPr>
         <w:t xml:space="preserve">   </w:t>
       </w:r>
-      <w:hyperlink w:history="1" r:id="rIduf4lj8fqdz7r-bbfothna">
+      <w:hyperlink w:history="1" r:id="rIdrovytiszmsyaurw6lkwrq">
         <w:r>
           <w:rPr>
             <w:rFonts w:ascii="Calibri" w:cs="Calibri" w:eastAsia="Calibri" w:hAnsi="Calibri"/>
@@ -1464,7 +1464,7 @@
         </w:rPr>
         <w:t xml:space="preserve">| </w:t>
       </w:r>
-      <w:hyperlink w:history="1" r:id="rIdvhmtfl0os8uxfkohmzauj">
+      <w:hyperlink w:history="1" r:id="rIdpylhfuhgxee6gfr1axgjo">
         <w:r>
           <w:rPr>
             <w:rFonts w:ascii="Calibri" w:cs="Calibri" w:eastAsia="Calibri" w:hAnsi="Calibri"/>
@@ -1492,7 +1492,7 @@
         </w:rPr>
         <w:t xml:space="preserve">| </w:t>
       </w:r>
-      <w:hyperlink w:history="1" r:id="rIdiim7d50psxfmiopktzbxq">
+      <w:hyperlink w:history="1" r:id="rIdmk5wqj5nzqkf3b7i7ayik">
         <w:r>
           <w:rPr>
             <w:rFonts w:ascii="Calibri" w:cs="Calibri" w:eastAsia="Calibri" w:hAnsi="Calibri"/>
@@ -1659,7 +1659,7 @@
         </w:rPr>
         <w:t xml:space="preserve">   </w:t>
       </w:r>
-      <w:hyperlink w:history="1" r:id="rId6la2h_aomb28buidl-ayn">
+      <w:hyperlink w:history="1" r:id="rIddlvyq3sxy4pfldl_z22ka">
         <w:r>
           <w:rPr>
             <w:rFonts w:ascii="Calibri" w:cs="Calibri" w:eastAsia="Calibri" w:hAnsi="Calibri"/>
@@ -1828,7 +1828,7 @@
         </w:rPr>
         <w:t xml:space="preserve">   </w:t>
       </w:r>
-      <w:hyperlink w:history="1" r:id="rIdi2cul2lqf-0whlxddg0ly">
+      <w:hyperlink w:history="1" r:id="rIdryohha3xt2lknfzy3od0n">
         <w:r>
           <w:rPr>
             <w:rFonts w:ascii="Calibri" w:cs="Calibri" w:eastAsia="Calibri" w:hAnsi="Calibri"/>
@@ -1856,7 +1856,7 @@
         </w:rPr>
         <w:t xml:space="preserve">| </w:t>
       </w:r>
-      <w:hyperlink w:history="1" r:id="rIdzprpcwhq57levi2r5-1_t">
+      <w:hyperlink w:history="1" r:id="rIdtvfwdhqfe82faqlpjrnvm">
         <w:r>
           <w:rPr>
             <w:rFonts w:ascii="Calibri" w:cs="Calibri" w:eastAsia="Calibri" w:hAnsi="Calibri"/>
@@ -2702,7 +2702,7 @@
         </w:rPr>
         <w:t xml:space="preserve">   </w:t>
       </w:r>
-      <w:hyperlink w:history="1" r:id="rIdcj044tuwda0fd9cpjkuwl">
+      <w:hyperlink w:history="1" r:id="rId8fnqyiak2blmaxbyqpz0h">
         <w:r>
           <w:rPr>
             <w:rFonts w:ascii="Calibri" w:cs="Calibri" w:eastAsia="Calibri" w:hAnsi="Calibri"/>
@@ -2730,7 +2730,7 @@
         </w:rPr>
         <w:t xml:space="preserve">| </w:t>
       </w:r>
-      <w:hyperlink w:history="1" r:id="rIdphzi961p7razksdjfwnu_">
+      <w:hyperlink w:history="1" r:id="rId2wun9n0rnh0gmvghsle3l">
         <w:r>
           <w:rPr>
             <w:rFonts w:ascii="Calibri" w:cs="Calibri" w:eastAsia="Calibri" w:hAnsi="Calibri"/>

</xml_diff>

<commit_message>
chore: regenerate CV PDF and DOCX from cv.html (#325)
Co-authored-by: github-actions[bot] <github-actions[bot]@users.noreply.github.com>
</commit_message>
<xml_diff>
--- a/public/resume/Isaac_Adjei_CV.docx
+++ b/public/resume/Isaac_Adjei_CV.docx
@@ -33,7 +33,7 @@
         </w:rPr>
         <w:t xml:space="preserve">✉ </w:t>
       </w:r>
-      <w:hyperlink w:history="1" r:id="rIdelpenwmkomh8jzkyux0fk">
+      <w:hyperlink w:history="1" r:id="rIdekb5ob6g5zbkwrzizbycp">
         <w:r>
           <w:rPr>
             <w:rFonts w:ascii="Calibri" w:cs="Calibri" w:eastAsia="Calibri" w:hAnsi="Calibri"/>
@@ -63,7 +63,7 @@
         </w:rPr>
         <w:t xml:space="preserve">• </w:t>
       </w:r>
-      <w:hyperlink w:history="1" r:id="rIdu0x-69zzife1g1nbq1-a_">
+      <w:hyperlink w:history="1" r:id="rId_cnxfhvytvx5rzs8q5xf4">
         <w:r>
           <w:rPr>
             <w:rFonts w:ascii="Calibri" w:cs="Calibri" w:eastAsia="Calibri" w:hAnsi="Calibri"/>
@@ -93,7 +93,7 @@
         </w:rPr>
         <w:t xml:space="preserve">⁠in </w:t>
       </w:r>
-      <w:hyperlink w:history="1" r:id="rIdixuoywwwfokv4kq1muly6">
+      <w:hyperlink w:history="1" r:id="rIdckvqa79zx0dz6kn1znewt">
         <w:r>
           <w:rPr>
             <w:rFonts w:ascii="Calibri" w:cs="Calibri" w:eastAsia="Calibri" w:hAnsi="Calibri"/>
@@ -123,7 +123,7 @@
         </w:rPr>
         <w:t xml:space="preserve">◔ </w:t>
       </w:r>
-      <w:hyperlink w:history="1" r:id="rIds5eeubzbaguwxlqbkmxy5">
+      <w:hyperlink w:history="1" r:id="rIdretfxfwnodutehx-kfu2-">
         <w:r>
           <w:rPr>
             <w:rFonts w:ascii="Calibri" w:cs="Calibri" w:eastAsia="Calibri" w:hAnsi="Calibri"/>
@@ -153,7 +153,7 @@
         </w:rPr>
         <w:t xml:space="preserve">Ⓘ </w:t>
       </w:r>
-      <w:hyperlink w:history="1" r:id="rIdh1yhmbjb_zt9ocvporefk">
+      <w:hyperlink w:history="1" r:id="rIdwszf0oswsn-0tft2et-au">
         <w:r>
           <w:rPr>
             <w:rFonts w:ascii="Calibri" w:cs="Calibri" w:eastAsia="Calibri" w:hAnsi="Calibri"/>
@@ -716,7 +716,7 @@
         </w:rPr>
         <w:t xml:space="preserve">   </w:t>
       </w:r>
-      <w:hyperlink w:history="1" r:id="rIdwzs4so6a29zmsn9mrtoq0">
+      <w:hyperlink w:history="1" r:id="rIdlmzl_eze1g-vo5uwddcag">
         <w:r>
           <w:rPr>
             <w:rFonts w:ascii="Calibri" w:cs="Calibri" w:eastAsia="Calibri" w:hAnsi="Calibri"/>
@@ -744,7 +744,7 @@
         </w:rPr>
         <w:t xml:space="preserve">| </w:t>
       </w:r>
-      <w:hyperlink w:history="1" r:id="rIdaszjncc9ax0rayccbpwuy">
+      <w:hyperlink w:history="1" r:id="rIdw5nvubuibslecvlrqz2ev">
         <w:r>
           <w:rPr>
             <w:rFonts w:ascii="Calibri" w:cs="Calibri" w:eastAsia="Calibri" w:hAnsi="Calibri"/>
@@ -772,7 +772,7 @@
         </w:rPr>
         <w:t xml:space="preserve">| </w:t>
       </w:r>
-      <w:hyperlink w:history="1" r:id="rIdjcsw70ssiuxcwnr0f5lbk">
+      <w:hyperlink w:history="1" r:id="rIddx4xnksoalfichxydtn4e">
         <w:r>
           <w:rPr>
             <w:rFonts w:ascii="Calibri" w:cs="Calibri" w:eastAsia="Calibri" w:hAnsi="Calibri"/>
@@ -1125,7 +1125,7 @@
         </w:rPr>
         <w:t xml:space="preserve">   </w:t>
       </w:r>
-      <w:hyperlink w:history="1" r:id="rIdsstkhvvdrjzfeow7teprm">
+      <w:hyperlink w:history="1" r:id="rId_um-vroamzpupzovsffqj">
         <w:r>
           <w:rPr>
             <w:rFonts w:ascii="Calibri" w:cs="Calibri" w:eastAsia="Calibri" w:hAnsi="Calibri"/>
@@ -1275,7 +1275,7 @@
         </w:rPr>
         <w:t xml:space="preserve">   </w:t>
       </w:r>
-      <w:hyperlink w:history="1" r:id="rIdzhnsockl4vemadefybjyw">
+      <w:hyperlink w:history="1" r:id="rIdnzmsfkgwvxqaioabaxg9l">
         <w:r>
           <w:rPr>
             <w:rFonts w:ascii="Calibri" w:cs="Calibri" w:eastAsia="Calibri" w:hAnsi="Calibri"/>
@@ -1303,7 +1303,7 @@
         </w:rPr>
         <w:t xml:space="preserve">| </w:t>
       </w:r>
-      <w:hyperlink w:history="1" r:id="rIdbc0n1ufpenwfchiwt92_m">
+      <w:hyperlink w:history="1" r:id="rId0dpg2ejht2mkaxxkseysy">
         <w:r>
           <w:rPr>
             <w:rFonts w:ascii="Calibri" w:cs="Calibri" w:eastAsia="Calibri" w:hAnsi="Calibri"/>
@@ -1436,7 +1436,7 @@
         </w:rPr>
         <w:t xml:space="preserve">   </w:t>
       </w:r>
-      <w:hyperlink w:history="1" r:id="rIdrovytiszmsyaurw6lkwrq">
+      <w:hyperlink w:history="1" r:id="rId7deflxzwipyygyk4nhcsf">
         <w:r>
           <w:rPr>
             <w:rFonts w:ascii="Calibri" w:cs="Calibri" w:eastAsia="Calibri" w:hAnsi="Calibri"/>
@@ -1464,7 +1464,7 @@
         </w:rPr>
         <w:t xml:space="preserve">| </w:t>
       </w:r>
-      <w:hyperlink w:history="1" r:id="rIdpylhfuhgxee6gfr1axgjo">
+      <w:hyperlink w:history="1" r:id="rIdojpkf5wparsxwm3i6rf43">
         <w:r>
           <w:rPr>
             <w:rFonts w:ascii="Calibri" w:cs="Calibri" w:eastAsia="Calibri" w:hAnsi="Calibri"/>
@@ -1492,7 +1492,7 @@
         </w:rPr>
         <w:t xml:space="preserve">| </w:t>
       </w:r>
-      <w:hyperlink w:history="1" r:id="rIdmk5wqj5nzqkf3b7i7ayik">
+      <w:hyperlink w:history="1" r:id="rId3c7qaeyslbxankfrpyz-f">
         <w:r>
           <w:rPr>
             <w:rFonts w:ascii="Calibri" w:cs="Calibri" w:eastAsia="Calibri" w:hAnsi="Calibri"/>
@@ -1659,7 +1659,7 @@
         </w:rPr>
         <w:t xml:space="preserve">   </w:t>
       </w:r>
-      <w:hyperlink w:history="1" r:id="rIddlvyq3sxy4pfldl_z22ka">
+      <w:hyperlink w:history="1" r:id="rId-jg3rkhhhoncehse0fxn2">
         <w:r>
           <w:rPr>
             <w:rFonts w:ascii="Calibri" w:cs="Calibri" w:eastAsia="Calibri" w:hAnsi="Calibri"/>
@@ -1828,7 +1828,7 @@
         </w:rPr>
         <w:t xml:space="preserve">   </w:t>
       </w:r>
-      <w:hyperlink w:history="1" r:id="rIdryohha3xt2lknfzy3od0n">
+      <w:hyperlink w:history="1" r:id="rIdidtrfliw0dn7xuqu4uoac">
         <w:r>
           <w:rPr>
             <w:rFonts w:ascii="Calibri" w:cs="Calibri" w:eastAsia="Calibri" w:hAnsi="Calibri"/>
@@ -1856,7 +1856,7 @@
         </w:rPr>
         <w:t xml:space="preserve">| </w:t>
       </w:r>
-      <w:hyperlink w:history="1" r:id="rIdtvfwdhqfe82faqlpjrnvm">
+      <w:hyperlink w:history="1" r:id="rIdlhwznni9ruhulxbkyzgxe">
         <w:r>
           <w:rPr>
             <w:rFonts w:ascii="Calibri" w:cs="Calibri" w:eastAsia="Calibri" w:hAnsi="Calibri"/>
@@ -2702,7 +2702,7 @@
         </w:rPr>
         <w:t xml:space="preserve">   </w:t>
       </w:r>
-      <w:hyperlink w:history="1" r:id="rId8fnqyiak2blmaxbyqpz0h">
+      <w:hyperlink w:history="1" r:id="rIdliqrcmtkqvwmca0a5vky2">
         <w:r>
           <w:rPr>
             <w:rFonts w:ascii="Calibri" w:cs="Calibri" w:eastAsia="Calibri" w:hAnsi="Calibri"/>
@@ -2730,7 +2730,7 @@
         </w:rPr>
         <w:t xml:space="preserve">| </w:t>
       </w:r>
-      <w:hyperlink w:history="1" r:id="rId2wun9n0rnh0gmvghsle3l">
+      <w:hyperlink w:history="1" r:id="rId5ynte68tj71opdjfcbnak">
         <w:r>
           <w:rPr>
             <w:rFonts w:ascii="Calibri" w:cs="Calibri" w:eastAsia="Calibri" w:hAnsi="Calibri"/>

</xml_diff>

<commit_message>
chore: regenerate CV PDF and DOCX from cv.html (#632)
</commit_message>
<xml_diff>
--- a/public/resume/Isaac_Adjei_CV.docx
+++ b/public/resume/Isaac_Adjei_CV.docx
@@ -33,7 +33,7 @@
         </w:rPr>
         <w:t xml:space="preserve">✉ </w:t>
       </w:r>
-      <w:hyperlink w:history="1" r:id="rIdekb5ob6g5zbkwrzizbycp">
+      <w:hyperlink w:history="1" r:id="rId4eezjczb0_ttzsidejkdj">
         <w:r>
           <w:rPr>
             <w:rFonts w:ascii="Calibri" w:cs="Calibri" w:eastAsia="Calibri" w:hAnsi="Calibri"/>
@@ -63,7 +63,7 @@
         </w:rPr>
         <w:t xml:space="preserve">• </w:t>
       </w:r>
-      <w:hyperlink w:history="1" r:id="rId_cnxfhvytvx5rzs8q5xf4">
+      <w:hyperlink w:history="1" r:id="rId8bxemtipnuvk692pwf-h4">
         <w:r>
           <w:rPr>
             <w:rFonts w:ascii="Calibri" w:cs="Calibri" w:eastAsia="Calibri" w:hAnsi="Calibri"/>
@@ -93,7 +93,7 @@
         </w:rPr>
         <w:t xml:space="preserve">⁠in </w:t>
       </w:r>
-      <w:hyperlink w:history="1" r:id="rIdckvqa79zx0dz6kn1znewt">
+      <w:hyperlink w:history="1" r:id="rIdzksr-jgwo0x-zigybshqr">
         <w:r>
           <w:rPr>
             <w:rFonts w:ascii="Calibri" w:cs="Calibri" w:eastAsia="Calibri" w:hAnsi="Calibri"/>
@@ -123,7 +123,7 @@
         </w:rPr>
         <w:t xml:space="preserve">◔ </w:t>
       </w:r>
-      <w:hyperlink w:history="1" r:id="rIdretfxfwnodutehx-kfu2-">
+      <w:hyperlink w:history="1" r:id="rIdletvt7ksbr1iggbmolm8x">
         <w:r>
           <w:rPr>
             <w:rFonts w:ascii="Calibri" w:cs="Calibri" w:eastAsia="Calibri" w:hAnsi="Calibri"/>
@@ -153,7 +153,7 @@
         </w:rPr>
         <w:t xml:space="preserve">Ⓘ </w:t>
       </w:r>
-      <w:hyperlink w:history="1" r:id="rIdwszf0oswsn-0tft2et-au">
+      <w:hyperlink w:history="1" r:id="rIdyj6jqqps98lqljeoz6ebb">
         <w:r>
           <w:rPr>
             <w:rFonts w:ascii="Calibri" w:cs="Calibri" w:eastAsia="Calibri" w:hAnsi="Calibri"/>
@@ -716,7 +716,7 @@
         </w:rPr>
         <w:t xml:space="preserve">   </w:t>
       </w:r>
-      <w:hyperlink w:history="1" r:id="rIdlmzl_eze1g-vo5uwddcag">
+      <w:hyperlink w:history="1" r:id="rIdvhll-jpzp3qdanzait1jr">
         <w:r>
           <w:rPr>
             <w:rFonts w:ascii="Calibri" w:cs="Calibri" w:eastAsia="Calibri" w:hAnsi="Calibri"/>
@@ -744,7 +744,7 @@
         </w:rPr>
         <w:t xml:space="preserve">| </w:t>
       </w:r>
-      <w:hyperlink w:history="1" r:id="rIdw5nvubuibslecvlrqz2ev">
+      <w:hyperlink w:history="1" r:id="rIdtgqmhwqfflhrfbzxg_vhg">
         <w:r>
           <w:rPr>
             <w:rFonts w:ascii="Calibri" w:cs="Calibri" w:eastAsia="Calibri" w:hAnsi="Calibri"/>
@@ -772,7 +772,7 @@
         </w:rPr>
         <w:t xml:space="preserve">| </w:t>
       </w:r>
-      <w:hyperlink w:history="1" r:id="rIddx4xnksoalfichxydtn4e">
+      <w:hyperlink w:history="1" r:id="rIdnh5xz2wnsf32odzdlhtev">
         <w:r>
           <w:rPr>
             <w:rFonts w:ascii="Calibri" w:cs="Calibri" w:eastAsia="Calibri" w:hAnsi="Calibri"/>
@@ -1125,7 +1125,7 @@
         </w:rPr>
         <w:t xml:space="preserve">   </w:t>
       </w:r>
-      <w:hyperlink w:history="1" r:id="rId_um-vroamzpupzovsffqj">
+      <w:hyperlink w:history="1" r:id="rIdyz_omj17dd-joivv0dl61">
         <w:r>
           <w:rPr>
             <w:rFonts w:ascii="Calibri" w:cs="Calibri" w:eastAsia="Calibri" w:hAnsi="Calibri"/>
@@ -1275,7 +1275,7 @@
         </w:rPr>
         <w:t xml:space="preserve">   </w:t>
       </w:r>
-      <w:hyperlink w:history="1" r:id="rIdnzmsfkgwvxqaioabaxg9l">
+      <w:hyperlink w:history="1" r:id="rIdjmdbxtgiwjzy8ukqxzzjx">
         <w:r>
           <w:rPr>
             <w:rFonts w:ascii="Calibri" w:cs="Calibri" w:eastAsia="Calibri" w:hAnsi="Calibri"/>
@@ -1303,7 +1303,7 @@
         </w:rPr>
         <w:t xml:space="preserve">| </w:t>
       </w:r>
-      <w:hyperlink w:history="1" r:id="rId0dpg2ejht2mkaxxkseysy">
+      <w:hyperlink w:history="1" r:id="rIdspadjquw_qewbk3qsusea">
         <w:r>
           <w:rPr>
             <w:rFonts w:ascii="Calibri" w:cs="Calibri" w:eastAsia="Calibri" w:hAnsi="Calibri"/>
@@ -1436,7 +1436,7 @@
         </w:rPr>
         <w:t xml:space="preserve">   </w:t>
       </w:r>
-      <w:hyperlink w:history="1" r:id="rId7deflxzwipyygyk4nhcsf">
+      <w:hyperlink w:history="1" r:id="rIdx4_0rogutk6bpog6bx703">
         <w:r>
           <w:rPr>
             <w:rFonts w:ascii="Calibri" w:cs="Calibri" w:eastAsia="Calibri" w:hAnsi="Calibri"/>
@@ -1464,7 +1464,7 @@
         </w:rPr>
         <w:t xml:space="preserve">| </w:t>
       </w:r>
-      <w:hyperlink w:history="1" r:id="rIdojpkf5wparsxwm3i6rf43">
+      <w:hyperlink w:history="1" r:id="rIdddem2kjpmhtxbxdhumz-w">
         <w:r>
           <w:rPr>
             <w:rFonts w:ascii="Calibri" w:cs="Calibri" w:eastAsia="Calibri" w:hAnsi="Calibri"/>
@@ -1492,7 +1492,7 @@
         </w:rPr>
         <w:t xml:space="preserve">| </w:t>
       </w:r>
-      <w:hyperlink w:history="1" r:id="rId3c7qaeyslbxankfrpyz-f">
+      <w:hyperlink w:history="1" r:id="rIdhuoka6ph1o_39v8qul9mq">
         <w:r>
           <w:rPr>
             <w:rFonts w:ascii="Calibri" w:cs="Calibri" w:eastAsia="Calibri" w:hAnsi="Calibri"/>
@@ -1659,7 +1659,7 @@
         </w:rPr>
         <w:t xml:space="preserve">   </w:t>
       </w:r>
-      <w:hyperlink w:history="1" r:id="rId-jg3rkhhhoncehse0fxn2">
+      <w:hyperlink w:history="1" r:id="rIdmw9ajslaskwcoggebohgv">
         <w:r>
           <w:rPr>
             <w:rFonts w:ascii="Calibri" w:cs="Calibri" w:eastAsia="Calibri" w:hAnsi="Calibri"/>
@@ -1828,7 +1828,7 @@
         </w:rPr>
         <w:t xml:space="preserve">   </w:t>
       </w:r>
-      <w:hyperlink w:history="1" r:id="rIdidtrfliw0dn7xuqu4uoac">
+      <w:hyperlink w:history="1" r:id="rIdssb1xvolrkir-dag4pp5t">
         <w:r>
           <w:rPr>
             <w:rFonts w:ascii="Calibri" w:cs="Calibri" w:eastAsia="Calibri" w:hAnsi="Calibri"/>
@@ -1856,7 +1856,7 @@
         </w:rPr>
         <w:t xml:space="preserve">| </w:t>
       </w:r>
-      <w:hyperlink w:history="1" r:id="rIdlhwznni9ruhulxbkyzgxe">
+      <w:hyperlink w:history="1" r:id="rIdmvpxn6jifqjxvc6jewjda">
         <w:r>
           <w:rPr>
             <w:rFonts w:ascii="Calibri" w:cs="Calibri" w:eastAsia="Calibri" w:hAnsi="Calibri"/>
@@ -2702,7 +2702,7 @@
         </w:rPr>
         <w:t xml:space="preserve">   </w:t>
       </w:r>
-      <w:hyperlink w:history="1" r:id="rIdliqrcmtkqvwmca0a5vky2">
+      <w:hyperlink w:history="1" r:id="rIdoiwvg1srtyvdadhjh-ou_">
         <w:r>
           <w:rPr>
             <w:rFonts w:ascii="Calibri" w:cs="Calibri" w:eastAsia="Calibri" w:hAnsi="Calibri"/>
@@ -2730,7 +2730,7 @@
         </w:rPr>
         <w:t xml:space="preserve">| </w:t>
       </w:r>
-      <w:hyperlink w:history="1" r:id="rId5ynte68tj71opdjfcbnak">
+      <w:hyperlink w:history="1" r:id="rIdewhajj30izymzrdr2eiho">
         <w:r>
           <w:rPr>
             <w:rFonts w:ascii="Calibri" w:cs="Calibri" w:eastAsia="Calibri" w:hAnsi="Calibri"/>

</xml_diff>

<commit_message>
chore: regenerate CV PDF and DOCX from cv.html (#801)
</commit_message>
<xml_diff>
--- a/public/resume/Isaac_Adjei_CV.docx
+++ b/public/resume/Isaac_Adjei_CV.docx
@@ -33,7 +33,7 @@
         </w:rPr>
         <w:t xml:space="preserve">✉ </w:t>
       </w:r>
-      <w:hyperlink w:history="1" r:id="rId4eezjczb0_ttzsidejkdj">
+      <w:hyperlink w:history="1" r:id="rIdpvgrysqq1ozfuhdi9hnj3">
         <w:r>
           <w:rPr>
             <w:rFonts w:ascii="Calibri" w:cs="Calibri" w:eastAsia="Calibri" w:hAnsi="Calibri"/>
@@ -63,7 +63,7 @@
         </w:rPr>
         <w:t xml:space="preserve">• </w:t>
       </w:r>
-      <w:hyperlink w:history="1" r:id="rId8bxemtipnuvk692pwf-h4">
+      <w:hyperlink w:history="1" r:id="rIdlcm4eoxwvdvqz5sme4oec">
         <w:r>
           <w:rPr>
             <w:rFonts w:ascii="Calibri" w:cs="Calibri" w:eastAsia="Calibri" w:hAnsi="Calibri"/>
@@ -93,7 +93,7 @@
         </w:rPr>
         <w:t xml:space="preserve">⁠in </w:t>
       </w:r>
-      <w:hyperlink w:history="1" r:id="rIdzksr-jgwo0x-zigybshqr">
+      <w:hyperlink w:history="1" r:id="rIdzxkc7mre47n9vb5sktejq">
         <w:r>
           <w:rPr>
             <w:rFonts w:ascii="Calibri" w:cs="Calibri" w:eastAsia="Calibri" w:hAnsi="Calibri"/>
@@ -123,7 +123,7 @@
         </w:rPr>
         <w:t xml:space="preserve">◔ </w:t>
       </w:r>
-      <w:hyperlink w:history="1" r:id="rIdletvt7ksbr1iggbmolm8x">
+      <w:hyperlink w:history="1" r:id="rIdifjhbczylk91p8tn4hzce">
         <w:r>
           <w:rPr>
             <w:rFonts w:ascii="Calibri" w:cs="Calibri" w:eastAsia="Calibri" w:hAnsi="Calibri"/>
@@ -153,7 +153,7 @@
         </w:rPr>
         <w:t xml:space="preserve">Ⓘ </w:t>
       </w:r>
-      <w:hyperlink w:history="1" r:id="rIdyj6jqqps98lqljeoz6ebb">
+      <w:hyperlink w:history="1" r:id="rIdf8wmgnlh1xdmp-gbvei-g">
         <w:r>
           <w:rPr>
             <w:rFonts w:ascii="Calibri" w:cs="Calibri" w:eastAsia="Calibri" w:hAnsi="Calibri"/>
@@ -716,7 +716,7 @@
         </w:rPr>
         <w:t xml:space="preserve">   </w:t>
       </w:r>
-      <w:hyperlink w:history="1" r:id="rIdvhll-jpzp3qdanzait1jr">
+      <w:hyperlink w:history="1" r:id="rId_fvfvm_0wgdhqb7gjynhs">
         <w:r>
           <w:rPr>
             <w:rFonts w:ascii="Calibri" w:cs="Calibri" w:eastAsia="Calibri" w:hAnsi="Calibri"/>
@@ -744,7 +744,7 @@
         </w:rPr>
         <w:t xml:space="preserve">| </w:t>
       </w:r>
-      <w:hyperlink w:history="1" r:id="rIdtgqmhwqfflhrfbzxg_vhg">
+      <w:hyperlink w:history="1" r:id="rId7i1dzg16qxldmygmkxlpo">
         <w:r>
           <w:rPr>
             <w:rFonts w:ascii="Calibri" w:cs="Calibri" w:eastAsia="Calibri" w:hAnsi="Calibri"/>
@@ -772,7 +772,7 @@
         </w:rPr>
         <w:t xml:space="preserve">| </w:t>
       </w:r>
-      <w:hyperlink w:history="1" r:id="rIdnh5xz2wnsf32odzdlhtev">
+      <w:hyperlink w:history="1" r:id="rIdkpdh1evtsql2q_gu90kem">
         <w:r>
           <w:rPr>
             <w:rFonts w:ascii="Calibri" w:cs="Calibri" w:eastAsia="Calibri" w:hAnsi="Calibri"/>
@@ -1125,7 +1125,7 @@
         </w:rPr>
         <w:t xml:space="preserve">   </w:t>
       </w:r>
-      <w:hyperlink w:history="1" r:id="rIdyz_omj17dd-joivv0dl61">
+      <w:hyperlink w:history="1" r:id="rIdsqsu2pviccpr1syxkazgv">
         <w:r>
           <w:rPr>
             <w:rFonts w:ascii="Calibri" w:cs="Calibri" w:eastAsia="Calibri" w:hAnsi="Calibri"/>
@@ -1275,7 +1275,7 @@
         </w:rPr>
         <w:t xml:space="preserve">   </w:t>
       </w:r>
-      <w:hyperlink w:history="1" r:id="rIdjmdbxtgiwjzy8ukqxzzjx">
+      <w:hyperlink w:history="1" r:id="rIdehtxgahwdgvcjvvbyg13g">
         <w:r>
           <w:rPr>
             <w:rFonts w:ascii="Calibri" w:cs="Calibri" w:eastAsia="Calibri" w:hAnsi="Calibri"/>
@@ -1303,7 +1303,7 @@
         </w:rPr>
         <w:t xml:space="preserve">| </w:t>
       </w:r>
-      <w:hyperlink w:history="1" r:id="rIdspadjquw_qewbk3qsusea">
+      <w:hyperlink w:history="1" r:id="rIdt2le4-uvxhmhrww7_obkt">
         <w:r>
           <w:rPr>
             <w:rFonts w:ascii="Calibri" w:cs="Calibri" w:eastAsia="Calibri" w:hAnsi="Calibri"/>
@@ -1436,7 +1436,7 @@
         </w:rPr>
         <w:t xml:space="preserve">   </w:t>
       </w:r>
-      <w:hyperlink w:history="1" r:id="rIdx4_0rogutk6bpog6bx703">
+      <w:hyperlink w:history="1" r:id="rIdv9juqelrtqjahwprqa5m3">
         <w:r>
           <w:rPr>
             <w:rFonts w:ascii="Calibri" w:cs="Calibri" w:eastAsia="Calibri" w:hAnsi="Calibri"/>
@@ -1464,7 +1464,7 @@
         </w:rPr>
         <w:t xml:space="preserve">| </w:t>
       </w:r>
-      <w:hyperlink w:history="1" r:id="rIdddem2kjpmhtxbxdhumz-w">
+      <w:hyperlink w:history="1" r:id="rIdz4em7vkiojupimldjmw_o">
         <w:r>
           <w:rPr>
             <w:rFonts w:ascii="Calibri" w:cs="Calibri" w:eastAsia="Calibri" w:hAnsi="Calibri"/>
@@ -1492,7 +1492,7 @@
         </w:rPr>
         <w:t xml:space="preserve">| </w:t>
       </w:r>
-      <w:hyperlink w:history="1" r:id="rIdhuoka6ph1o_39v8qul9mq">
+      <w:hyperlink w:history="1" r:id="rIdqfwusuvbp2atmdtkyxt5_">
         <w:r>
           <w:rPr>
             <w:rFonts w:ascii="Calibri" w:cs="Calibri" w:eastAsia="Calibri" w:hAnsi="Calibri"/>
@@ -1659,7 +1659,7 @@
         </w:rPr>
         <w:t xml:space="preserve">   </w:t>
       </w:r>
-      <w:hyperlink w:history="1" r:id="rIdmw9ajslaskwcoggebohgv">
+      <w:hyperlink w:history="1" r:id="rIdtkmcd9ry-ebhsv8f8atue">
         <w:r>
           <w:rPr>
             <w:rFonts w:ascii="Calibri" w:cs="Calibri" w:eastAsia="Calibri" w:hAnsi="Calibri"/>
@@ -1828,7 +1828,7 @@
         </w:rPr>
         <w:t xml:space="preserve">   </w:t>
       </w:r>
-      <w:hyperlink w:history="1" r:id="rIdssb1xvolrkir-dag4pp5t">
+      <w:hyperlink w:history="1" r:id="rIdf0v2liyf0gcs3e2nkveom">
         <w:r>
           <w:rPr>
             <w:rFonts w:ascii="Calibri" w:cs="Calibri" w:eastAsia="Calibri" w:hAnsi="Calibri"/>
@@ -1856,7 +1856,7 @@
         </w:rPr>
         <w:t xml:space="preserve">| </w:t>
       </w:r>
-      <w:hyperlink w:history="1" r:id="rIdmvpxn6jifqjxvc6jewjda">
+      <w:hyperlink w:history="1" r:id="rIdxlvakriudoywnpne1olo_">
         <w:r>
           <w:rPr>
             <w:rFonts w:ascii="Calibri" w:cs="Calibri" w:eastAsia="Calibri" w:hAnsi="Calibri"/>
@@ -1971,15 +1971,15 @@
           <w:sz w:val="20"/>
           <w:szCs w:val="20"/>
         </w:rPr>
-        <w:t xml:space="preserve">Peer Assisted Learning (PAL) Leader - Electronics and Programming</w:t>
-      </w:r>
-      <w:r>
-        <w:rPr>
-          <w:rFonts w:ascii="Calibri" w:cs="Calibri" w:eastAsia="Calibri" w:hAnsi="Calibri"/>
-          <w:sz w:val="20"/>
-          <w:szCs w:val="20"/>
-        </w:rPr>
-        <w:t xml:space="preserve">	Aston University, Learning Services, Birmingham, UK</w:t>
+        <w:t xml:space="preserve">Student Representative</w:t>
+      </w:r>
+      <w:r>
+        <w:rPr>
+          <w:rFonts w:ascii="Calibri" w:cs="Calibri" w:eastAsia="Calibri" w:hAnsi="Calibri"/>
+          <w:sz w:val="20"/>
+          <w:szCs w:val="20"/>
+        </w:rPr>
+        <w:t xml:space="preserve">	Aston Students' Union, Birmingham, UK</w:t>
       </w:r>
     </w:p>
     <w:p>
@@ -1996,15 +1996,15 @@
           <w:sz w:val="19"/>
           <w:szCs w:val="19"/>
         </w:rPr>
-        <w:t xml:space="preserve">Python, Electronics, peer teaching, curriculum design, student support</w:t>
-      </w:r>
-      <w:r>
-        <w:rPr>
-          <w:rFonts w:ascii="Calibri" w:cs="Calibri" w:eastAsia="Calibri" w:hAnsi="Calibri"/>
-          <w:sz w:val="19"/>
-          <w:szCs w:val="19"/>
-        </w:rPr>
-        <w:t xml:space="preserve">	Sep 2026 - Present</w:t>
+        <w:t xml:space="preserve">Student advocacy, stakeholder communication, academic liaison</w:t>
+      </w:r>
+      <w:r>
+        <w:rPr>
+          <w:rFonts w:ascii="Calibri" w:cs="Calibri" w:eastAsia="Calibri" w:hAnsi="Calibri"/>
+          <w:sz w:val="19"/>
+          <w:szCs w:val="19"/>
+        </w:rPr>
+        <w:t xml:space="preserve">	Sep 2025 - Present</w:t>
       </w:r>
     </w:p>
     <w:p>
@@ -2026,43 +2026,49 @@
           <w:sz w:val="19"/>
           <w:szCs w:val="19"/>
         </w:rPr>
-        <w:t xml:space="preserve">Facilitate weekly </w:t>
-      </w:r>
-      <w:r>
-        <w:rPr>
-          <w:rFonts w:ascii="Calibri" w:cs="Calibri" w:eastAsia="Calibri" w:hAnsi="Calibri"/>
-          <w:b/>
-          <w:bCs/>
-          <w:sz w:val="19"/>
-          <w:szCs w:val="19"/>
-        </w:rPr>
-        <w:t xml:space="preserve">Peer Assisted Learning (PAL)</w:t>
-      </w:r>
-      <w:r>
-        <w:rPr>
-          <w:rFonts w:ascii="Calibri" w:cs="Calibri" w:eastAsia="Calibri" w:hAnsi="Calibri"/>
-          <w:sz w:val="19"/>
-          <w:szCs w:val="19"/>
-        </w:rPr>
-        <w:t xml:space="preserve"> sessions covering </w:t>
-      </w:r>
-      <w:r>
-        <w:rPr>
-          <w:rFonts w:ascii="Calibri" w:cs="Calibri" w:eastAsia="Calibri" w:hAnsi="Calibri"/>
-          <w:b/>
-          <w:bCs/>
-          <w:sz w:val="19"/>
-          <w:szCs w:val="19"/>
-        </w:rPr>
-        <w:t xml:space="preserve">Python programming and Electronics</w:t>
-      </w:r>
-      <w:r>
-        <w:rPr>
-          <w:rFonts w:ascii="Calibri" w:cs="Calibri" w:eastAsia="Calibri" w:hAnsi="Calibri"/>
-          <w:sz w:val="19"/>
-          <w:szCs w:val="19"/>
-        </w:rPr>
-        <w:t xml:space="preserve"> across multiple student cohorts, preparing curriculum-aligned materials and fostering a collaborative low-pressure learning environment</w:t>
+        <w:t xml:space="preserve">
+            Collect and communicate student feedback to academic staff through </w:t>
+      </w:r>
+      <w:r>
+        <w:rPr>
+          <w:rFonts w:ascii="Calibri" w:cs="Calibri" w:eastAsia="Calibri" w:hAnsi="Calibri"/>
+          <w:b/>
+          <w:bCs/>
+          <w:sz w:val="19"/>
+          <w:szCs w:val="19"/>
+        </w:rPr>
+        <w:t xml:space="preserve">SSLC, Senate and Council meetings</w:t>
+      </w:r>
+      <w:r>
+        <w:rPr>
+          <w:rFonts w:ascii="Calibri" w:cs="Calibri" w:eastAsia="Calibri" w:hAnsi="Calibri"/>
+          <w:sz w:val="19"/>
+          <w:szCs w:val="19"/>
+        </w:rPr>
+        <w:t xml:space="preserve">
+          </w:t>
+      </w:r>
+    </w:p>
+    <w:p>
+      <w:pPr>
+        <w:spacing w:after="20" w:before="0"/>
+        <w:ind w:left="316" w:hanging="259"/>
+      </w:pPr>
+      <w:r>
+        <w:rPr>
+          <w:rFonts w:ascii="Calibri" w:cs="Calibri" w:eastAsia="Calibri" w:hAnsi="Calibri"/>
+          <w:sz w:val="19"/>
+          <w:szCs w:val="19"/>
+        </w:rPr>
+        <w:t xml:space="preserve">•  </w:t>
+      </w:r>
+      <w:r>
+        <w:rPr>
+          <w:rFonts w:ascii="Calibri" w:cs="Calibri" w:eastAsia="Calibri" w:hAnsi="Calibri"/>
+          <w:sz w:val="19"/>
+          <w:szCs w:val="19"/>
+        </w:rPr>
+        <w:t xml:space="preserve">Delivered improvements to learning delivery and the wider course experience</w:t>
       </w:r>
     </w:p>
     <w:p>
@@ -2085,15 +2091,15 @@
           <w:sz w:val="20"/>
           <w:szCs w:val="20"/>
         </w:rPr>
-        <w:t xml:space="preserve">Student Representative</w:t>
-      </w:r>
-      <w:r>
-        <w:rPr>
-          <w:rFonts w:ascii="Calibri" w:cs="Calibri" w:eastAsia="Calibri" w:hAnsi="Calibri"/>
-          <w:sz w:val="20"/>
-          <w:szCs w:val="20"/>
-        </w:rPr>
-        <w:t xml:space="preserve">	Aston Students' Union, Birmingham, UK</w:t>
+        <w:t xml:space="preserve">Engineering Operations &amp; Maintenance Planning (Virtual Experience)</w:t>
+      </w:r>
+      <w:r>
+        <w:rPr>
+          <w:rFonts w:ascii="Calibri" w:cs="Calibri" w:eastAsia="Calibri" w:hAnsi="Calibri"/>
+          <w:sz w:val="20"/>
+          <w:szCs w:val="20"/>
+        </w:rPr>
+        <w:t xml:space="preserve">	British Airways via Forage, Remote</w:t>
       </w:r>
     </w:p>
     <w:p>
@@ -2110,15 +2116,15 @@
           <w:sz w:val="19"/>
           <w:szCs w:val="19"/>
         </w:rPr>
-        <w:t xml:space="preserve">Student advocacy, stakeholder communication, academic liaison</w:t>
-      </w:r>
-      <w:r>
-        <w:rPr>
-          <w:rFonts w:ascii="Calibri" w:cs="Calibri" w:eastAsia="Calibri" w:hAnsi="Calibri"/>
-          <w:sz w:val="19"/>
-          <w:szCs w:val="19"/>
-        </w:rPr>
-        <w:t xml:space="preserve">	Sep 2025 - Present</w:t>
+        <w:t xml:space="preserve">Maintenance planning, risk analysis, reporting</w:t>
+      </w:r>
+      <w:r>
+        <w:rPr>
+          <w:rFonts w:ascii="Calibri" w:cs="Calibri" w:eastAsia="Calibri" w:hAnsi="Calibri"/>
+          <w:sz w:val="19"/>
+          <w:szCs w:val="19"/>
+        </w:rPr>
+        <w:t xml:space="preserve">	Oct 2025</w:t>
       </w:r>
     </w:p>
     <w:p>
@@ -2141,48 +2147,26 @@
           <w:szCs w:val="19"/>
         </w:rPr>
         <w:t xml:space="preserve">
-            Collect and communicate student feedback to academic staff through </w:t>
-      </w:r>
-      <w:r>
-        <w:rPr>
-          <w:rFonts w:ascii="Calibri" w:cs="Calibri" w:eastAsia="Calibri" w:hAnsi="Calibri"/>
-          <w:b/>
-          <w:bCs/>
-          <w:sz w:val="19"/>
-          <w:szCs w:val="19"/>
-        </w:rPr>
-        <w:t xml:space="preserve">SSLC, Senate and Council meetings</w:t>
-      </w:r>
-      <w:r>
-        <w:rPr>
-          <w:rFonts w:ascii="Calibri" w:cs="Calibri" w:eastAsia="Calibri" w:hAnsi="Calibri"/>
-          <w:sz w:val="19"/>
-          <w:szCs w:val="19"/>
-        </w:rPr>
-        <w:t xml:space="preserve">
+            Reviewed A320 maintenance schedules, diagnosed component faults and produced structured </w:t>
+      </w:r>
+      <w:r>
+        <w:rPr>
+          <w:rFonts w:ascii="Calibri" w:cs="Calibri" w:eastAsia="Calibri" w:hAnsi="Calibri"/>
+          <w:b/>
+          <w:bCs/>
+          <w:sz w:val="19"/>
+          <w:szCs w:val="19"/>
+        </w:rPr>
+        <w:t xml:space="preserve">WREQ engineering reports</w:t>
+      </w:r>
+      <w:r>
+        <w:rPr>
+          <w:rFonts w:ascii="Calibri" w:cs="Calibri" w:eastAsia="Calibri" w:hAnsi="Calibri"/>
+          <w:sz w:val="19"/>
+          <w:szCs w:val="19"/>
+        </w:rPr>
+        <w:t xml:space="preserve"> with material forecasts and risk-mitigation recommendations for six aircraft
           </w:t>
-      </w:r>
-    </w:p>
-    <w:p>
-      <w:pPr>
-        <w:spacing w:after="20" w:before="0"/>
-        <w:ind w:left="316" w:hanging="259"/>
-      </w:pPr>
-      <w:r>
-        <w:rPr>
-          <w:rFonts w:ascii="Calibri" w:cs="Calibri" w:eastAsia="Calibri" w:hAnsi="Calibri"/>
-          <w:sz w:val="19"/>
-          <w:szCs w:val="19"/>
-        </w:rPr>
-        <w:t xml:space="preserve">•  </w:t>
-      </w:r>
-      <w:r>
-        <w:rPr>
-          <w:rFonts w:ascii="Calibri" w:cs="Calibri" w:eastAsia="Calibri" w:hAnsi="Calibri"/>
-          <w:sz w:val="19"/>
-          <w:szCs w:val="19"/>
-        </w:rPr>
-        <w:t xml:space="preserve">Delivered improvements to learning delivery and the wider course experience</w:t>
       </w:r>
     </w:p>
     <w:p>
@@ -2205,15 +2189,15 @@
           <w:sz w:val="20"/>
           <w:szCs w:val="20"/>
         </w:rPr>
-        <w:t xml:space="preserve">Engineering Operations &amp; Maintenance Planning (Virtual Experience)</w:t>
-      </w:r>
-      <w:r>
-        <w:rPr>
-          <w:rFonts w:ascii="Calibri" w:cs="Calibri" w:eastAsia="Calibri" w:hAnsi="Calibri"/>
-          <w:sz w:val="20"/>
-          <w:szCs w:val="20"/>
-        </w:rPr>
-        <w:t xml:space="preserve">	British Airways via Forage, Remote</w:t>
+        <w:t xml:space="preserve">Smart Mobility &amp; Digital Tech (Virtual Work Experience)</w:t>
+      </w:r>
+      <w:r>
+        <w:rPr>
+          <w:rFonts w:ascii="Calibri" w:cs="Calibri" w:eastAsia="Calibri" w:hAnsi="Calibri"/>
+          <w:sz w:val="20"/>
+          <w:szCs w:val="20"/>
+        </w:rPr>
+        <w:t xml:space="preserve">	Yunex Traffic via Springpod, Remote</w:t>
       </w:r>
     </w:p>
     <w:p>
@@ -2230,15 +2214,15 @@
           <w:sz w:val="19"/>
           <w:szCs w:val="19"/>
         </w:rPr>
-        <w:t xml:space="preserve">Maintenance planning, risk analysis, reporting</w:t>
-      </w:r>
-      <w:r>
-        <w:rPr>
-          <w:rFonts w:ascii="Calibri" w:cs="Calibri" w:eastAsia="Calibri" w:hAnsi="Calibri"/>
-          <w:sz w:val="19"/>
-          <w:szCs w:val="19"/>
-        </w:rPr>
-        <w:t xml:space="preserve">	Oct 2025</w:t>
+        <w:t xml:space="preserve">Intelligent transport systems, sensor integration, data-driven urban mobility</w:t>
+      </w:r>
+      <w:r>
+        <w:rPr>
+          <w:rFonts w:ascii="Calibri" w:cs="Calibri" w:eastAsia="Calibri" w:hAnsi="Calibri"/>
+          <w:sz w:val="19"/>
+          <w:szCs w:val="19"/>
+        </w:rPr>
+        <w:t xml:space="preserve">	Aug 2025</w:t>
       </w:r>
     </w:p>
     <w:p>
@@ -2261,25 +2245,25 @@
           <w:szCs w:val="19"/>
         </w:rPr>
         <w:t xml:space="preserve">
-            Reviewed A320 maintenance schedules, diagnosed component faults and produced structured </w:t>
-      </w:r>
-      <w:r>
-        <w:rPr>
-          <w:rFonts w:ascii="Calibri" w:cs="Calibri" w:eastAsia="Calibri" w:hAnsi="Calibri"/>
-          <w:b/>
-          <w:bCs/>
-          <w:sz w:val="19"/>
-          <w:szCs w:val="19"/>
-        </w:rPr>
-        <w:t xml:space="preserve">WREQ engineering reports</w:t>
-      </w:r>
-      <w:r>
-        <w:rPr>
-          <w:rFonts w:ascii="Calibri" w:cs="Calibri" w:eastAsia="Calibri" w:hAnsi="Calibri"/>
-          <w:sz w:val="19"/>
-          <w:szCs w:val="19"/>
-        </w:rPr>
-        <w:t xml:space="preserve"> with material forecasts and risk-mitigation recommendations for six aircraft
+            Examined </w:t>
+      </w:r>
+      <w:r>
+        <w:rPr>
+          <w:rFonts w:ascii="Calibri" w:cs="Calibri" w:eastAsia="Calibri" w:hAnsi="Calibri"/>
+          <w:b/>
+          <w:bCs/>
+          <w:sz w:val="19"/>
+          <w:szCs w:val="19"/>
+        </w:rPr>
+        <w:t xml:space="preserve">intelligent transport systems</w:t>
+      </w:r>
+      <w:r>
+        <w:rPr>
+          <w:rFonts w:ascii="Calibri" w:cs="Calibri" w:eastAsia="Calibri" w:hAnsi="Calibri"/>
+          <w:sz w:val="19"/>
+          <w:szCs w:val="19"/>
+        </w:rPr>
+        <w:t xml:space="preserve"> and real-time pollution sensing workflows, evaluating digital solutions for their impact on air quality and urban mobility efficiency
           </w:t>
       </w:r>
     </w:p>
@@ -2303,15 +2287,15 @@
           <w:sz w:val="20"/>
           <w:szCs w:val="20"/>
         </w:rPr>
-        <w:t xml:space="preserve">Smart Mobility &amp; Digital Tech (Virtual Work Experience)</w:t>
-      </w:r>
-      <w:r>
-        <w:rPr>
-          <w:rFonts w:ascii="Calibri" w:cs="Calibri" w:eastAsia="Calibri" w:hAnsi="Calibri"/>
-          <w:sz w:val="20"/>
-          <w:szCs w:val="20"/>
-        </w:rPr>
-        <w:t xml:space="preserve">	Yunex Traffic via Springpod, Remote</w:t>
+        <w:t xml:space="preserve">Diplomatic, Consular and Estates Intern</w:t>
+      </w:r>
+      <w:r>
+        <w:rPr>
+          <w:rFonts w:ascii="Calibri" w:cs="Calibri" w:eastAsia="Calibri" w:hAnsi="Calibri"/>
+          <w:sz w:val="20"/>
+          <w:szCs w:val="20"/>
+        </w:rPr>
+        <w:t xml:space="preserve">	Ghana High Commission, London, UK</w:t>
       </w:r>
     </w:p>
     <w:p>
@@ -2328,15 +2312,15 @@
           <w:sz w:val="19"/>
           <w:szCs w:val="19"/>
         </w:rPr>
-        <w:t xml:space="preserve">Intelligent transport systems, sensor integration, data-driven urban mobility</w:t>
-      </w:r>
-      <w:r>
-        <w:rPr>
-          <w:rFonts w:ascii="Calibri" w:cs="Calibri" w:eastAsia="Calibri" w:hAnsi="Calibri"/>
-          <w:sz w:val="19"/>
-          <w:szCs w:val="19"/>
-        </w:rPr>
-        <w:t xml:space="preserve">	Aug 2025</w:t>
+        <w:t xml:space="preserve">Consular operations, diplomatic property, document processing, client support</w:t>
+      </w:r>
+      <w:r>
+        <w:rPr>
+          <w:rFonts w:ascii="Calibri" w:cs="Calibri" w:eastAsia="Calibri" w:hAnsi="Calibri"/>
+          <w:sz w:val="19"/>
+          <w:szCs w:val="19"/>
+        </w:rPr>
+        <w:t xml:space="preserve">	Mar 2024 - Aug 2024</w:t>
       </w:r>
     </w:p>
     <w:p>
@@ -2359,25 +2343,85 @@
           <w:szCs w:val="19"/>
         </w:rPr>
         <w:t xml:space="preserve">
-            Examined </w:t>
-      </w:r>
-      <w:r>
-        <w:rPr>
-          <w:rFonts w:ascii="Calibri" w:cs="Calibri" w:eastAsia="Calibri" w:hAnsi="Calibri"/>
-          <w:b/>
-          <w:bCs/>
-          <w:sz w:val="19"/>
-          <w:szCs w:val="19"/>
-        </w:rPr>
-        <w:t xml:space="preserve">intelligent transport systems</w:t>
-      </w:r>
-      <w:r>
-        <w:rPr>
-          <w:rFonts w:ascii="Calibri" w:cs="Calibri" w:eastAsia="Calibri" w:hAnsi="Calibri"/>
-          <w:sz w:val="19"/>
-          <w:szCs w:val="19"/>
-        </w:rPr>
-        <w:t xml:space="preserve"> and real-time pollution sensing workflows, evaluating digital solutions for their impact on air quality and urban mobility efficiency
+            Operated end-to-end consular processing workflows using official diplomatic management systems - handling application intake, </w:t>
+      </w:r>
+      <w:r>
+        <w:rPr>
+          <w:rFonts w:ascii="Calibri" w:cs="Calibri" w:eastAsia="Calibri" w:hAnsi="Calibri"/>
+          <w:b/>
+          <w:bCs/>
+          <w:sz w:val="19"/>
+          <w:szCs w:val="19"/>
+        </w:rPr>
+        <w:t xml:space="preserve">biometric data capture</w:t>
+      </w:r>
+      <w:r>
+        <w:rPr>
+          <w:rFonts w:ascii="Calibri" w:cs="Calibri" w:eastAsia="Calibri" w:hAnsi="Calibri"/>
+          <w:sz w:val="19"/>
+          <w:szCs w:val="19"/>
+        </w:rPr>
+        <w:t xml:space="preserve">, document authentication and physical visa and passport production from print to issuance, supporting </w:t>
+      </w:r>
+      <w:r>
+        <w:rPr>
+          <w:rFonts w:ascii="Calibri" w:cs="Calibri" w:eastAsia="Calibri" w:hAnsi="Calibri"/>
+          <w:b/>
+          <w:bCs/>
+          <w:sz w:val="19"/>
+          <w:szCs w:val="19"/>
+        </w:rPr>
+        <w:t xml:space="preserve">100+ daily client interactions</w:t>
+      </w:r>
+      <w:r>
+        <w:rPr>
+          <w:rFonts w:ascii="Calibri" w:cs="Calibri" w:eastAsia="Calibri" w:hAnsi="Calibri"/>
+          <w:sz w:val="19"/>
+          <w:szCs w:val="19"/>
+        </w:rPr>
+        <w:t xml:space="preserve">
+          </w:t>
+      </w:r>
+    </w:p>
+    <w:p>
+      <w:pPr>
+        <w:spacing w:after="20" w:before="0"/>
+        <w:ind w:left="316" w:hanging="259"/>
+      </w:pPr>
+      <w:r>
+        <w:rPr>
+          <w:rFonts w:ascii="Calibri" w:cs="Calibri" w:eastAsia="Calibri" w:hAnsi="Calibri"/>
+          <w:sz w:val="19"/>
+          <w:szCs w:val="19"/>
+        </w:rPr>
+        <w:t xml:space="preserve">•  </w:t>
+      </w:r>
+      <w:r>
+        <w:rPr>
+          <w:rFonts w:ascii="Calibri" w:cs="Calibri" w:eastAsia="Calibri" w:hAnsi="Calibri"/>
+          <w:sz w:val="19"/>
+          <w:szCs w:val="19"/>
+        </w:rPr>
+        <w:t xml:space="preserve">
+            Coordinated </w:t>
+      </w:r>
+      <w:r>
+        <w:rPr>
+          <w:rFonts w:ascii="Calibri" w:cs="Calibri" w:eastAsia="Calibri" w:hAnsi="Calibri"/>
+          <w:b/>
+          <w:bCs/>
+          <w:sz w:val="19"/>
+          <w:szCs w:val="19"/>
+        </w:rPr>
+        <w:t xml:space="preserve">diplomatic property operations</w:t>
+      </w:r>
+      <w:r>
+        <w:rPr>
+          <w:rFonts w:ascii="Calibri" w:cs="Calibri" w:eastAsia="Calibri" w:hAnsi="Calibri"/>
+          <w:sz w:val="19"/>
+          <w:szCs w:val="19"/>
+        </w:rPr>
+        <w:t xml:space="preserve"> by accompanying officers on site inspections and facility surveys, managing estates documentation, maintenance schedules and office workflows
           </w:t>
       </w:r>
     </w:p>
@@ -2401,15 +2445,15 @@
           <w:sz w:val="20"/>
           <w:szCs w:val="20"/>
         </w:rPr>
-        <w:t xml:space="preserve">Diplomatic, Consular and Estates Intern</w:t>
-      </w:r>
-      <w:r>
-        <w:rPr>
-          <w:rFonts w:ascii="Calibri" w:cs="Calibri" w:eastAsia="Calibri" w:hAnsi="Calibri"/>
-          <w:sz w:val="20"/>
-          <w:szCs w:val="20"/>
-        </w:rPr>
-        <w:t xml:space="preserve">	Ghana High Commission, London, UK</w:t>
+        <w:t xml:space="preserve">Junior Apprentice HVAC Technician</w:t>
+      </w:r>
+      <w:r>
+        <w:rPr>
+          <w:rFonts w:ascii="Calibri" w:cs="Calibri" w:eastAsia="Calibri" w:hAnsi="Calibri"/>
+          <w:sz w:val="20"/>
+          <w:szCs w:val="20"/>
+        </w:rPr>
+        <w:t xml:space="preserve">	Massive Refrigeration Services, Accra, Ghana</w:t>
       </w:r>
     </w:p>
     <w:p>
@@ -2426,15 +2470,15 @@
           <w:sz w:val="19"/>
           <w:szCs w:val="19"/>
         </w:rPr>
-        <w:t xml:space="preserve">Consular operations, diplomatic property, document processing, client support</w:t>
-      </w:r>
-      <w:r>
-        <w:rPr>
-          <w:rFonts w:ascii="Calibri" w:cs="Calibri" w:eastAsia="Calibri" w:hAnsi="Calibri"/>
-          <w:sz w:val="19"/>
-          <w:szCs w:val="19"/>
-        </w:rPr>
-        <w:t xml:space="preserve">	Mar 2024 - Aug 2024</w:t>
+        <w:t xml:space="preserve">Field servicing, diagnostics, installation support</w:t>
+      </w:r>
+      <w:r>
+        <w:rPr>
+          <w:rFonts w:ascii="Calibri" w:cs="Calibri" w:eastAsia="Calibri" w:hAnsi="Calibri"/>
+          <w:sz w:val="19"/>
+          <w:szCs w:val="19"/>
+        </w:rPr>
+        <w:t xml:space="preserve">	Jul 2019 - Jul 2021</w:t>
       </w:r>
     </w:p>
     <w:p>
@@ -2457,92 +2501,50 @@
           <w:szCs w:val="19"/>
         </w:rPr>
         <w:t xml:space="preserve">
-            Operated end-to-end consular processing workflows using official diplomatic management systems - handling application intake, </w:t>
-      </w:r>
-      <w:r>
-        <w:rPr>
-          <w:rFonts w:ascii="Calibri" w:cs="Calibri" w:eastAsia="Calibri" w:hAnsi="Calibri"/>
-          <w:b/>
-          <w:bCs/>
-          <w:sz w:val="19"/>
-          <w:szCs w:val="19"/>
-        </w:rPr>
-        <w:t xml:space="preserve">biometric data capture</w:t>
-      </w:r>
-      <w:r>
-        <w:rPr>
-          <w:rFonts w:ascii="Calibri" w:cs="Calibri" w:eastAsia="Calibri" w:hAnsi="Calibri"/>
-          <w:sz w:val="19"/>
-          <w:szCs w:val="19"/>
-        </w:rPr>
-        <w:t xml:space="preserve">, document authentication and physical visa and passport production from print to issuance, supporting </w:t>
-      </w:r>
-      <w:r>
-        <w:rPr>
-          <w:rFonts w:ascii="Calibri" w:cs="Calibri" w:eastAsia="Calibri" w:hAnsi="Calibri"/>
-          <w:b/>
-          <w:bCs/>
-          <w:sz w:val="19"/>
-          <w:szCs w:val="19"/>
-        </w:rPr>
-        <w:t xml:space="preserve">100+ daily client interactions</w:t>
-      </w:r>
-      <w:r>
-        <w:rPr>
-          <w:rFonts w:ascii="Calibri" w:cs="Calibri" w:eastAsia="Calibri" w:hAnsi="Calibri"/>
-          <w:sz w:val="19"/>
-          <w:szCs w:val="19"/>
-        </w:rPr>
-        <w:t xml:space="preserve">
+            Serviced, installed and maintained </w:t>
+      </w:r>
+      <w:r>
+        <w:rPr>
+          <w:rFonts w:ascii="Calibri" w:cs="Calibri" w:eastAsia="Calibri" w:hAnsi="Calibri"/>
+          <w:b/>
+          <w:bCs/>
+          <w:sz w:val="19"/>
+          <w:szCs w:val="19"/>
+        </w:rPr>
+        <w:t xml:space="preserve">50+ air conditioning units</w:t>
+      </w:r>
+      <w:r>
+        <w:rPr>
+          <w:rFonts w:ascii="Calibri" w:cs="Calibri" w:eastAsia="Calibri" w:hAnsi="Calibri"/>
+          <w:sz w:val="19"/>
+          <w:szCs w:val="19"/>
+        </w:rPr>
+        <w:t xml:space="preserve"> using standard diagnostic tools and field servicing techniques
           </w:t>
       </w:r>
     </w:p>
     <w:p>
       <w:pPr>
-        <w:spacing w:after="20" w:before="0"/>
-        <w:ind w:left="316" w:hanging="259"/>
-      </w:pPr>
-      <w:r>
-        <w:rPr>
-          <w:rFonts w:ascii="Calibri" w:cs="Calibri" w:eastAsia="Calibri" w:hAnsi="Calibri"/>
-          <w:sz w:val="19"/>
-          <w:szCs w:val="19"/>
-        </w:rPr>
-        <w:t xml:space="preserve">•  </w:t>
-      </w:r>
-      <w:r>
-        <w:rPr>
-          <w:rFonts w:ascii="Calibri" w:cs="Calibri" w:eastAsia="Calibri" w:hAnsi="Calibri"/>
-          <w:sz w:val="19"/>
-          <w:szCs w:val="19"/>
-        </w:rPr>
-        <w:t xml:space="preserve">
-            Coordinated </w:t>
-      </w:r>
-      <w:r>
-        <w:rPr>
-          <w:rFonts w:ascii="Calibri" w:cs="Calibri" w:eastAsia="Calibri" w:hAnsi="Calibri"/>
-          <w:b/>
-          <w:bCs/>
-          <w:sz w:val="19"/>
-          <w:szCs w:val="19"/>
-        </w:rPr>
-        <w:t xml:space="preserve">diplomatic property operations</w:t>
-      </w:r>
-      <w:r>
-        <w:rPr>
-          <w:rFonts w:ascii="Calibri" w:cs="Calibri" w:eastAsia="Calibri" w:hAnsi="Calibri"/>
-          <w:sz w:val="19"/>
-          <w:szCs w:val="19"/>
-        </w:rPr>
-        <w:t xml:space="preserve"> by accompanying officers on site inspections and facility surveys, managing estates documentation, maintenance schedules and office workflows
-          </w:t>
-      </w:r>
-    </w:p>
-    <w:p>
-      <w:pPr>
         <w:spacing w:after="80" w:before="0"/>
       </w:pPr>
+    </w:p>
+    <w:p>
+      <w:pPr>
+        <w:pBdr>
+          <w:bottom w:val="single" w:color="000000" w:sz="6" w:space="1"/>
+        </w:pBdr>
+        <w:spacing w:after="40" w:before="160"/>
+      </w:pPr>
+      <w:r>
+        <w:rPr>
+          <w:rFonts w:ascii="Calibri" w:cs="Calibri" w:eastAsia="Calibri" w:hAnsi="Calibri"/>
+          <w:b/>
+          <w:bCs/>
+          <w:sz w:val="21"/>
+          <w:szCs w:val="21"/>
+        </w:rPr>
+        <w:t xml:space="preserve">RESEARCH &amp; PUBLICATIONS</w:t>
+      </w:r>
     </w:p>
     <w:p>
       <w:pPr>
@@ -2559,15 +2561,7 @@
           <w:sz w:val="20"/>
           <w:szCs w:val="20"/>
         </w:rPr>
-        <w:t xml:space="preserve">Junior Apprentice HVAC Technician</w:t>
-      </w:r>
-      <w:r>
-        <w:rPr>
-          <w:rFonts w:ascii="Calibri" w:cs="Calibri" w:eastAsia="Calibri" w:hAnsi="Calibri"/>
-          <w:sz w:val="20"/>
-          <w:szCs w:val="20"/>
-        </w:rPr>
-        <w:t xml:space="preserve">	Massive Refrigeration Services, Accra, Ghana</w:t>
+        <w:t xml:space="preserve">git-unlocked: An Open-Source Modular Curriculum for Git and Version Control Education</w:t>
       </w:r>
     </w:p>
     <w:p>
@@ -2584,114 +2578,6 @@
           <w:sz w:val="19"/>
           <w:szCs w:val="19"/>
         </w:rPr>
-        <w:t xml:space="preserve">Field servicing, diagnostics, installation support</w:t>
-      </w:r>
-      <w:r>
-        <w:rPr>
-          <w:rFonts w:ascii="Calibri" w:cs="Calibri" w:eastAsia="Calibri" w:hAnsi="Calibri"/>
-          <w:sz w:val="19"/>
-          <w:szCs w:val="19"/>
-        </w:rPr>
-        <w:t xml:space="preserve">	Jul 2019 - Jul 2021</w:t>
-      </w:r>
-    </w:p>
-    <w:p>
-      <w:pPr>
-        <w:spacing w:after="20" w:before="0"/>
-        <w:ind w:left="316" w:hanging="259"/>
-      </w:pPr>
-      <w:r>
-        <w:rPr>
-          <w:rFonts w:ascii="Calibri" w:cs="Calibri" w:eastAsia="Calibri" w:hAnsi="Calibri"/>
-          <w:sz w:val="19"/>
-          <w:szCs w:val="19"/>
-        </w:rPr>
-        <w:t xml:space="preserve">•  </w:t>
-      </w:r>
-      <w:r>
-        <w:rPr>
-          <w:rFonts w:ascii="Calibri" w:cs="Calibri" w:eastAsia="Calibri" w:hAnsi="Calibri"/>
-          <w:sz w:val="19"/>
-          <w:szCs w:val="19"/>
-        </w:rPr>
-        <w:t xml:space="preserve">
-            Serviced, installed and maintained </w:t>
-      </w:r>
-      <w:r>
-        <w:rPr>
-          <w:rFonts w:ascii="Calibri" w:cs="Calibri" w:eastAsia="Calibri" w:hAnsi="Calibri"/>
-          <w:b/>
-          <w:bCs/>
-          <w:sz w:val="19"/>
-          <w:szCs w:val="19"/>
-        </w:rPr>
-        <w:t xml:space="preserve">50+ air conditioning units</w:t>
-      </w:r>
-      <w:r>
-        <w:rPr>
-          <w:rFonts w:ascii="Calibri" w:cs="Calibri" w:eastAsia="Calibri" w:hAnsi="Calibri"/>
-          <w:sz w:val="19"/>
-          <w:szCs w:val="19"/>
-        </w:rPr>
-        <w:t xml:space="preserve"> using standard diagnostic tools and field servicing techniques
-          </w:t>
-      </w:r>
-    </w:p>
-    <w:p>
-      <w:pPr>
-        <w:spacing w:after="80" w:before="0"/>
-      </w:pPr>
-    </w:p>
-    <w:p>
-      <w:pPr>
-        <w:pBdr>
-          <w:bottom w:val="single" w:color="000000" w:sz="6" w:space="1"/>
-        </w:pBdr>
-        <w:spacing w:after="40" w:before="160"/>
-      </w:pPr>
-      <w:r>
-        <w:rPr>
-          <w:rFonts w:ascii="Calibri" w:cs="Calibri" w:eastAsia="Calibri" w:hAnsi="Calibri"/>
-          <w:b/>
-          <w:bCs/>
-          <w:sz w:val="21"/>
-          <w:szCs w:val="21"/>
-        </w:rPr>
-        <w:t xml:space="preserve">RESEARCH &amp; PUBLICATIONS</w:t>
-      </w:r>
-    </w:p>
-    <w:p>
-      <w:pPr>
-        <w:tabs>
-          <w:tab w:val="right" w:pos="9026"/>
-        </w:tabs>
-        <w:spacing w:after="10" w:before="0"/>
-      </w:pPr>
-      <w:r>
-        <w:rPr>
-          <w:rFonts w:ascii="Calibri" w:cs="Calibri" w:eastAsia="Calibri" w:hAnsi="Calibri"/>
-          <w:b/>
-          <w:bCs/>
-          <w:sz w:val="20"/>
-          <w:szCs w:val="20"/>
-        </w:rPr>
-        <w:t xml:space="preserve">git-unlocked: An Open-Source Modular Curriculum for Git and Version Control Education</w:t>
-      </w:r>
-    </w:p>
-    <w:p>
-      <w:pPr>
-        <w:tabs>
-          <w:tab w:val="right" w:pos="9026"/>
-        </w:tabs>
-        <w:spacing w:after="10" w:before="0"/>
-      </w:pPr>
-      <w:r>
-        <w:rPr>
-          <w:rFonts w:ascii="Calibri" w:cs="Calibri" w:eastAsia="Calibri" w:hAnsi="Calibri"/>
-          <w:color w:val="444444"/>
-          <w:sz w:val="19"/>
-          <w:szCs w:val="19"/>
-        </w:rPr>
         <w:t xml:space="preserve">I. Adjei · Zenodo · Jun 2026</w:t>
       </w:r>
       <w:r>
@@ -2702,7 +2588,7 @@
         </w:rPr>
         <w:t xml:space="preserve">   </w:t>
       </w:r>
-      <w:hyperlink w:history="1" r:id="rIdoiwvg1srtyvdadhjh-ou_">
+      <w:hyperlink w:history="1" r:id="rIdobt_k4hohtsswn1fyejzd">
         <w:r>
           <w:rPr>
             <w:rFonts w:ascii="Calibri" w:cs="Calibri" w:eastAsia="Calibri" w:hAnsi="Calibri"/>
@@ -2730,7 +2616,7 @@
         </w:rPr>
         <w:t xml:space="preserve">| </w:t>
       </w:r>
-      <w:hyperlink w:history="1" r:id="rIdewhajj30izymzrdr2eiho">
+      <w:hyperlink w:history="1" r:id="rId8dn3edjhvjhzyuks1s8lb">
         <w:r>
           <w:rPr>
             <w:rFonts w:ascii="Calibri" w:cs="Calibri" w:eastAsia="Calibri" w:hAnsi="Calibri"/>

</xml_diff>

<commit_message>
Auto-regenerate CVs and cover letters
</commit_message>
<xml_diff>
--- a/public/resume/Isaac_Adjei_CV.docx
+++ b/public/resume/Isaac_Adjei_CV.docx
@@ -33,7 +33,7 @@
         </w:rPr>
         <w:t xml:space="preserve">✉ </w:t>
       </w:r>
-      <w:hyperlink w:history="1" r:id="rIdpvgrysqq1ozfuhdi9hnj3">
+      <w:hyperlink w:history="1" r:id="rIdddmsnvrluqtlv6tt_fzbl">
         <w:r>
           <w:rPr>
             <w:rFonts w:ascii="Calibri" w:cs="Calibri" w:eastAsia="Calibri" w:hAnsi="Calibri"/>
@@ -63,7 +63,7 @@
         </w:rPr>
         <w:t xml:space="preserve">• </w:t>
       </w:r>
-      <w:hyperlink w:history="1" r:id="rIdlcm4eoxwvdvqz5sme4oec">
+      <w:hyperlink w:history="1" r:id="rId2nneeom0e_n0nszzeuqrt">
         <w:r>
           <w:rPr>
             <w:rFonts w:ascii="Calibri" w:cs="Calibri" w:eastAsia="Calibri" w:hAnsi="Calibri"/>
@@ -93,7 +93,7 @@
         </w:rPr>
         <w:t xml:space="preserve">⁠in </w:t>
       </w:r>
-      <w:hyperlink w:history="1" r:id="rIdzxkc7mre47n9vb5sktejq">
+      <w:hyperlink w:history="1" r:id="rId53whqpspfzwmb224gmlod">
         <w:r>
           <w:rPr>
             <w:rFonts w:ascii="Calibri" w:cs="Calibri" w:eastAsia="Calibri" w:hAnsi="Calibri"/>
@@ -123,7 +123,7 @@
         </w:rPr>
         <w:t xml:space="preserve">◔ </w:t>
       </w:r>
-      <w:hyperlink w:history="1" r:id="rIdifjhbczylk91p8tn4hzce">
+      <w:hyperlink w:history="1" r:id="rId_ebrkxdzdop6rt1cm_iim">
         <w:r>
           <w:rPr>
             <w:rFonts w:ascii="Calibri" w:cs="Calibri" w:eastAsia="Calibri" w:hAnsi="Calibri"/>
@@ -153,7 +153,7 @@
         </w:rPr>
         <w:t xml:space="preserve">Ⓘ </w:t>
       </w:r>
-      <w:hyperlink w:history="1" r:id="rIdf8wmgnlh1xdmp-gbvei-g">
+      <w:hyperlink w:history="1" r:id="rId-pqw-5lxlwerbwrw_ssj8">
         <w:r>
           <w:rPr>
             <w:rFonts w:ascii="Calibri" w:cs="Calibri" w:eastAsia="Calibri" w:hAnsi="Calibri"/>
@@ -716,7 +716,7 @@
         </w:rPr>
         <w:t xml:space="preserve">   </w:t>
       </w:r>
-      <w:hyperlink w:history="1" r:id="rId_fvfvm_0wgdhqb7gjynhs">
+      <w:hyperlink w:history="1" r:id="rIdf62c1fhdqsh4_jujsi7ce">
         <w:r>
           <w:rPr>
             <w:rFonts w:ascii="Calibri" w:cs="Calibri" w:eastAsia="Calibri" w:hAnsi="Calibri"/>
@@ -744,7 +744,7 @@
         </w:rPr>
         <w:t xml:space="preserve">| </w:t>
       </w:r>
-      <w:hyperlink w:history="1" r:id="rId7i1dzg16qxldmygmkxlpo">
+      <w:hyperlink w:history="1" r:id="rIdah6rzxoz0zvqsrluux8of">
         <w:r>
           <w:rPr>
             <w:rFonts w:ascii="Calibri" w:cs="Calibri" w:eastAsia="Calibri" w:hAnsi="Calibri"/>
@@ -772,7 +772,7 @@
         </w:rPr>
         <w:t xml:space="preserve">| </w:t>
       </w:r>
-      <w:hyperlink w:history="1" r:id="rIdkpdh1evtsql2q_gu90kem">
+      <w:hyperlink w:history="1" r:id="rIdmitbh6kl-uaylawmvbdiw">
         <w:r>
           <w:rPr>
             <w:rFonts w:ascii="Calibri" w:cs="Calibri" w:eastAsia="Calibri" w:hAnsi="Calibri"/>
@@ -1125,7 +1125,7 @@
         </w:rPr>
         <w:t xml:space="preserve">   </w:t>
       </w:r>
-      <w:hyperlink w:history="1" r:id="rIdsqsu2pviccpr1syxkazgv">
+      <w:hyperlink w:history="1" r:id="rIdyr8y2ksge3rbziiduv_th">
         <w:r>
           <w:rPr>
             <w:rFonts w:ascii="Calibri" w:cs="Calibri" w:eastAsia="Calibri" w:hAnsi="Calibri"/>
@@ -1275,7 +1275,7 @@
         </w:rPr>
         <w:t xml:space="preserve">   </w:t>
       </w:r>
-      <w:hyperlink w:history="1" r:id="rIdehtxgahwdgvcjvvbyg13g">
+      <w:hyperlink w:history="1" r:id="rIdyabnmdviisxuw3fg2crtb">
         <w:r>
           <w:rPr>
             <w:rFonts w:ascii="Calibri" w:cs="Calibri" w:eastAsia="Calibri" w:hAnsi="Calibri"/>
@@ -1303,7 +1303,7 @@
         </w:rPr>
         <w:t xml:space="preserve">| </w:t>
       </w:r>
-      <w:hyperlink w:history="1" r:id="rIdt2le4-uvxhmhrww7_obkt">
+      <w:hyperlink w:history="1" r:id="rIdoskzxovpv4yerm8eu5cay">
         <w:r>
           <w:rPr>
             <w:rFonts w:ascii="Calibri" w:cs="Calibri" w:eastAsia="Calibri" w:hAnsi="Calibri"/>
@@ -1436,7 +1436,7 @@
         </w:rPr>
         <w:t xml:space="preserve">   </w:t>
       </w:r>
-      <w:hyperlink w:history="1" r:id="rIdv9juqelrtqjahwprqa5m3">
+      <w:hyperlink w:history="1" r:id="rId-mh36ij80ubflqlpsa1ue">
         <w:r>
           <w:rPr>
             <w:rFonts w:ascii="Calibri" w:cs="Calibri" w:eastAsia="Calibri" w:hAnsi="Calibri"/>
@@ -1464,7 +1464,7 @@
         </w:rPr>
         <w:t xml:space="preserve">| </w:t>
       </w:r>
-      <w:hyperlink w:history="1" r:id="rIdz4em7vkiojupimldjmw_o">
+      <w:hyperlink w:history="1" r:id="rIdkzh1f_0h-y6hifmmgghqo">
         <w:r>
           <w:rPr>
             <w:rFonts w:ascii="Calibri" w:cs="Calibri" w:eastAsia="Calibri" w:hAnsi="Calibri"/>
@@ -1492,7 +1492,7 @@
         </w:rPr>
         <w:t xml:space="preserve">| </w:t>
       </w:r>
-      <w:hyperlink w:history="1" r:id="rIdqfwusuvbp2atmdtkyxt5_">
+      <w:hyperlink w:history="1" r:id="rIdoocjbjnd0smut8pe7fa96">
         <w:r>
           <w:rPr>
             <w:rFonts w:ascii="Calibri" w:cs="Calibri" w:eastAsia="Calibri" w:hAnsi="Calibri"/>
@@ -1659,7 +1659,7 @@
         </w:rPr>
         <w:t xml:space="preserve">   </w:t>
       </w:r>
-      <w:hyperlink w:history="1" r:id="rIdtkmcd9ry-ebhsv8f8atue">
+      <w:hyperlink w:history="1" r:id="rIdxeun-hj2h_q16plw3bpt-">
         <w:r>
           <w:rPr>
             <w:rFonts w:ascii="Calibri" w:cs="Calibri" w:eastAsia="Calibri" w:hAnsi="Calibri"/>
@@ -1828,7 +1828,7 @@
         </w:rPr>
         <w:t xml:space="preserve">   </w:t>
       </w:r>
-      <w:hyperlink w:history="1" r:id="rIdf0v2liyf0gcs3e2nkveom">
+      <w:hyperlink w:history="1" r:id="rIdfd4cgornbbxjovcgzxd6m">
         <w:r>
           <w:rPr>
             <w:rFonts w:ascii="Calibri" w:cs="Calibri" w:eastAsia="Calibri" w:hAnsi="Calibri"/>
@@ -1856,7 +1856,7 @@
         </w:rPr>
         <w:t xml:space="preserve">| </w:t>
       </w:r>
-      <w:hyperlink w:history="1" r:id="rIdxlvakriudoywnpne1olo_">
+      <w:hyperlink w:history="1" r:id="rIdym6d0qazfobikvrwfttwv">
         <w:r>
           <w:rPr>
             <w:rFonts w:ascii="Calibri" w:cs="Calibri" w:eastAsia="Calibri" w:hAnsi="Calibri"/>
@@ -2588,7 +2588,7 @@
         </w:rPr>
         <w:t xml:space="preserve">   </w:t>
       </w:r>
-      <w:hyperlink w:history="1" r:id="rIdobt_k4hohtsswn1fyejzd">
+      <w:hyperlink w:history="1" r:id="rIdqgnhxtiovpdzd1czfc8uy">
         <w:r>
           <w:rPr>
             <w:rFonts w:ascii="Calibri" w:cs="Calibri" w:eastAsia="Calibri" w:hAnsi="Calibri"/>
@@ -2616,7 +2616,7 @@
         </w:rPr>
         <w:t xml:space="preserve">| </w:t>
       </w:r>
-      <w:hyperlink w:history="1" r:id="rId8dn3edjhvjhzyuks1s8lb">
+      <w:hyperlink w:history="1" r:id="rIdgehb5cxs0e5fd1k__hryg">
         <w:r>
           <w:rPr>
             <w:rFonts w:ascii="Calibri" w:cs="Calibri" w:eastAsia="Calibri" w:hAnsi="Calibri"/>

</xml_diff>

<commit_message>
Auto-regenerate CVs and cover letters (#904)
</commit_message>
<xml_diff>
--- a/public/resume/Isaac_Adjei_CV.docx
+++ b/public/resume/Isaac_Adjei_CV.docx
@@ -33,7 +33,7 @@
         </w:rPr>
         <w:t xml:space="preserve">✉ </w:t>
       </w:r>
-      <w:hyperlink w:history="1" r:id="rIdpvgrysqq1ozfuhdi9hnj3">
+      <w:hyperlink w:history="1" r:id="rIdddmsnvrluqtlv6tt_fzbl">
         <w:r>
           <w:rPr>
             <w:rFonts w:ascii="Calibri" w:cs="Calibri" w:eastAsia="Calibri" w:hAnsi="Calibri"/>
@@ -63,7 +63,7 @@
         </w:rPr>
         <w:t xml:space="preserve">• </w:t>
       </w:r>
-      <w:hyperlink w:history="1" r:id="rIdlcm4eoxwvdvqz5sme4oec">
+      <w:hyperlink w:history="1" r:id="rId2nneeom0e_n0nszzeuqrt">
         <w:r>
           <w:rPr>
             <w:rFonts w:ascii="Calibri" w:cs="Calibri" w:eastAsia="Calibri" w:hAnsi="Calibri"/>
@@ -93,7 +93,7 @@
         </w:rPr>
         <w:t xml:space="preserve">⁠in </w:t>
       </w:r>
-      <w:hyperlink w:history="1" r:id="rIdzxkc7mre47n9vb5sktejq">
+      <w:hyperlink w:history="1" r:id="rId53whqpspfzwmb224gmlod">
         <w:r>
           <w:rPr>
             <w:rFonts w:ascii="Calibri" w:cs="Calibri" w:eastAsia="Calibri" w:hAnsi="Calibri"/>
@@ -123,7 +123,7 @@
         </w:rPr>
         <w:t xml:space="preserve">◔ </w:t>
       </w:r>
-      <w:hyperlink w:history="1" r:id="rIdifjhbczylk91p8tn4hzce">
+      <w:hyperlink w:history="1" r:id="rId_ebrkxdzdop6rt1cm_iim">
         <w:r>
           <w:rPr>
             <w:rFonts w:ascii="Calibri" w:cs="Calibri" w:eastAsia="Calibri" w:hAnsi="Calibri"/>
@@ -153,7 +153,7 @@
         </w:rPr>
         <w:t xml:space="preserve">Ⓘ </w:t>
       </w:r>
-      <w:hyperlink w:history="1" r:id="rIdf8wmgnlh1xdmp-gbvei-g">
+      <w:hyperlink w:history="1" r:id="rId-pqw-5lxlwerbwrw_ssj8">
         <w:r>
           <w:rPr>
             <w:rFonts w:ascii="Calibri" w:cs="Calibri" w:eastAsia="Calibri" w:hAnsi="Calibri"/>
@@ -716,7 +716,7 @@
         </w:rPr>
         <w:t xml:space="preserve">   </w:t>
       </w:r>
-      <w:hyperlink w:history="1" r:id="rId_fvfvm_0wgdhqb7gjynhs">
+      <w:hyperlink w:history="1" r:id="rIdf62c1fhdqsh4_jujsi7ce">
         <w:r>
           <w:rPr>
             <w:rFonts w:ascii="Calibri" w:cs="Calibri" w:eastAsia="Calibri" w:hAnsi="Calibri"/>
@@ -744,7 +744,7 @@
         </w:rPr>
         <w:t xml:space="preserve">| </w:t>
       </w:r>
-      <w:hyperlink w:history="1" r:id="rId7i1dzg16qxldmygmkxlpo">
+      <w:hyperlink w:history="1" r:id="rIdah6rzxoz0zvqsrluux8of">
         <w:r>
           <w:rPr>
             <w:rFonts w:ascii="Calibri" w:cs="Calibri" w:eastAsia="Calibri" w:hAnsi="Calibri"/>
@@ -772,7 +772,7 @@
         </w:rPr>
         <w:t xml:space="preserve">| </w:t>
       </w:r>
-      <w:hyperlink w:history="1" r:id="rIdkpdh1evtsql2q_gu90kem">
+      <w:hyperlink w:history="1" r:id="rIdmitbh6kl-uaylawmvbdiw">
         <w:r>
           <w:rPr>
             <w:rFonts w:ascii="Calibri" w:cs="Calibri" w:eastAsia="Calibri" w:hAnsi="Calibri"/>
@@ -1125,7 +1125,7 @@
         </w:rPr>
         <w:t xml:space="preserve">   </w:t>
       </w:r>
-      <w:hyperlink w:history="1" r:id="rIdsqsu2pviccpr1syxkazgv">
+      <w:hyperlink w:history="1" r:id="rIdyr8y2ksge3rbziiduv_th">
         <w:r>
           <w:rPr>
             <w:rFonts w:ascii="Calibri" w:cs="Calibri" w:eastAsia="Calibri" w:hAnsi="Calibri"/>
@@ -1275,7 +1275,7 @@
         </w:rPr>
         <w:t xml:space="preserve">   </w:t>
       </w:r>
-      <w:hyperlink w:history="1" r:id="rIdehtxgahwdgvcjvvbyg13g">
+      <w:hyperlink w:history="1" r:id="rIdyabnmdviisxuw3fg2crtb">
         <w:r>
           <w:rPr>
             <w:rFonts w:ascii="Calibri" w:cs="Calibri" w:eastAsia="Calibri" w:hAnsi="Calibri"/>
@@ -1303,7 +1303,7 @@
         </w:rPr>
         <w:t xml:space="preserve">| </w:t>
       </w:r>
-      <w:hyperlink w:history="1" r:id="rIdt2le4-uvxhmhrww7_obkt">
+      <w:hyperlink w:history="1" r:id="rIdoskzxovpv4yerm8eu5cay">
         <w:r>
           <w:rPr>
             <w:rFonts w:ascii="Calibri" w:cs="Calibri" w:eastAsia="Calibri" w:hAnsi="Calibri"/>
@@ -1436,7 +1436,7 @@
         </w:rPr>
         <w:t xml:space="preserve">   </w:t>
       </w:r>
-      <w:hyperlink w:history="1" r:id="rIdv9juqelrtqjahwprqa5m3">
+      <w:hyperlink w:history="1" r:id="rId-mh36ij80ubflqlpsa1ue">
         <w:r>
           <w:rPr>
             <w:rFonts w:ascii="Calibri" w:cs="Calibri" w:eastAsia="Calibri" w:hAnsi="Calibri"/>
@@ -1464,7 +1464,7 @@
         </w:rPr>
         <w:t xml:space="preserve">| </w:t>
       </w:r>
-      <w:hyperlink w:history="1" r:id="rIdz4em7vkiojupimldjmw_o">
+      <w:hyperlink w:history="1" r:id="rIdkzh1f_0h-y6hifmmgghqo">
         <w:r>
           <w:rPr>
             <w:rFonts w:ascii="Calibri" w:cs="Calibri" w:eastAsia="Calibri" w:hAnsi="Calibri"/>
@@ -1492,7 +1492,7 @@
         </w:rPr>
         <w:t xml:space="preserve">| </w:t>
       </w:r>
-      <w:hyperlink w:history="1" r:id="rIdqfwusuvbp2atmdtkyxt5_">
+      <w:hyperlink w:history="1" r:id="rIdoocjbjnd0smut8pe7fa96">
         <w:r>
           <w:rPr>
             <w:rFonts w:ascii="Calibri" w:cs="Calibri" w:eastAsia="Calibri" w:hAnsi="Calibri"/>
@@ -1659,7 +1659,7 @@
         </w:rPr>
         <w:t xml:space="preserve">   </w:t>
       </w:r>
-      <w:hyperlink w:history="1" r:id="rIdtkmcd9ry-ebhsv8f8atue">
+      <w:hyperlink w:history="1" r:id="rIdxeun-hj2h_q16plw3bpt-">
         <w:r>
           <w:rPr>
             <w:rFonts w:ascii="Calibri" w:cs="Calibri" w:eastAsia="Calibri" w:hAnsi="Calibri"/>
@@ -1828,7 +1828,7 @@
         </w:rPr>
         <w:t xml:space="preserve">   </w:t>
       </w:r>
-      <w:hyperlink w:history="1" r:id="rIdf0v2liyf0gcs3e2nkveom">
+      <w:hyperlink w:history="1" r:id="rIdfd4cgornbbxjovcgzxd6m">
         <w:r>
           <w:rPr>
             <w:rFonts w:ascii="Calibri" w:cs="Calibri" w:eastAsia="Calibri" w:hAnsi="Calibri"/>
@@ -1856,7 +1856,7 @@
         </w:rPr>
         <w:t xml:space="preserve">| </w:t>
       </w:r>
-      <w:hyperlink w:history="1" r:id="rIdxlvakriudoywnpne1olo_">
+      <w:hyperlink w:history="1" r:id="rIdym6d0qazfobikvrwfttwv">
         <w:r>
           <w:rPr>
             <w:rFonts w:ascii="Calibri" w:cs="Calibri" w:eastAsia="Calibri" w:hAnsi="Calibri"/>
@@ -2588,7 +2588,7 @@
         </w:rPr>
         <w:t xml:space="preserve">   </w:t>
       </w:r>
-      <w:hyperlink w:history="1" r:id="rIdobt_k4hohtsswn1fyejzd">
+      <w:hyperlink w:history="1" r:id="rIdqgnhxtiovpdzd1czfc8uy">
         <w:r>
           <w:rPr>
             <w:rFonts w:ascii="Calibri" w:cs="Calibri" w:eastAsia="Calibri" w:hAnsi="Calibri"/>
@@ -2616,7 +2616,7 @@
         </w:rPr>
         <w:t xml:space="preserve">| </w:t>
       </w:r>
-      <w:hyperlink w:history="1" r:id="rId8dn3edjhvjhzyuks1s8lb">
+      <w:hyperlink w:history="1" r:id="rIdgehb5cxs0e5fd1k__hryg">
         <w:r>
           <w:rPr>
             <w:rFonts w:ascii="Calibri" w:cs="Calibri" w:eastAsia="Calibri" w:hAnsi="Calibri"/>

</xml_diff>

<commit_message>
Auto-regenerate CVs and cover letters (#906)
</commit_message>
<xml_diff>
--- a/public/resume/Isaac_Adjei_CV.docx
+++ b/public/resume/Isaac_Adjei_CV.docx
@@ -33,7 +33,7 @@
         </w:rPr>
         <w:t xml:space="preserve">✉ </w:t>
       </w:r>
-      <w:hyperlink w:history="1" r:id="rIdddmsnvrluqtlv6tt_fzbl">
+      <w:hyperlink w:history="1" r:id="rIdaevp4ozp6nxp0nasj4ost">
         <w:r>
           <w:rPr>
             <w:rFonts w:ascii="Calibri" w:cs="Calibri" w:eastAsia="Calibri" w:hAnsi="Calibri"/>
@@ -63,7 +63,7 @@
         </w:rPr>
         <w:t xml:space="preserve">• </w:t>
       </w:r>
-      <w:hyperlink w:history="1" r:id="rId2nneeom0e_n0nszzeuqrt">
+      <w:hyperlink w:history="1" r:id="rIddjoswtxqjupmcshtfrukb">
         <w:r>
           <w:rPr>
             <w:rFonts w:ascii="Calibri" w:cs="Calibri" w:eastAsia="Calibri" w:hAnsi="Calibri"/>
@@ -93,7 +93,7 @@
         </w:rPr>
         <w:t xml:space="preserve">⁠in </w:t>
       </w:r>
-      <w:hyperlink w:history="1" r:id="rId53whqpspfzwmb224gmlod">
+      <w:hyperlink w:history="1" r:id="rIdddzhxyohwrhx3s-kxtanp">
         <w:r>
           <w:rPr>
             <w:rFonts w:ascii="Calibri" w:cs="Calibri" w:eastAsia="Calibri" w:hAnsi="Calibri"/>
@@ -123,7 +123,7 @@
         </w:rPr>
         <w:t xml:space="preserve">◔ </w:t>
       </w:r>
-      <w:hyperlink w:history="1" r:id="rId_ebrkxdzdop6rt1cm_iim">
+      <w:hyperlink w:history="1" r:id="rIdkrnpiui2xopbq3frv4bqv">
         <w:r>
           <w:rPr>
             <w:rFonts w:ascii="Calibri" w:cs="Calibri" w:eastAsia="Calibri" w:hAnsi="Calibri"/>
@@ -153,7 +153,7 @@
         </w:rPr>
         <w:t xml:space="preserve">Ⓘ </w:t>
       </w:r>
-      <w:hyperlink w:history="1" r:id="rId-pqw-5lxlwerbwrw_ssj8">
+      <w:hyperlink w:history="1" r:id="rIdxrli2zdjmpkcuc8djd73j">
         <w:r>
           <w:rPr>
             <w:rFonts w:ascii="Calibri" w:cs="Calibri" w:eastAsia="Calibri" w:hAnsi="Calibri"/>
@@ -716,7 +716,7 @@
         </w:rPr>
         <w:t xml:space="preserve">   </w:t>
       </w:r>
-      <w:hyperlink w:history="1" r:id="rIdf62c1fhdqsh4_jujsi7ce">
+      <w:hyperlink w:history="1" r:id="rIdnctkawujrj6ox_9iwtmlr">
         <w:r>
           <w:rPr>
             <w:rFonts w:ascii="Calibri" w:cs="Calibri" w:eastAsia="Calibri" w:hAnsi="Calibri"/>
@@ -744,7 +744,7 @@
         </w:rPr>
         <w:t xml:space="preserve">| </w:t>
       </w:r>
-      <w:hyperlink w:history="1" r:id="rIdah6rzxoz0zvqsrluux8of">
+      <w:hyperlink w:history="1" r:id="rIdurpa1abfcnazr9gai15dy">
         <w:r>
           <w:rPr>
             <w:rFonts w:ascii="Calibri" w:cs="Calibri" w:eastAsia="Calibri" w:hAnsi="Calibri"/>
@@ -772,7 +772,7 @@
         </w:rPr>
         <w:t xml:space="preserve">| </w:t>
       </w:r>
-      <w:hyperlink w:history="1" r:id="rIdmitbh6kl-uaylawmvbdiw">
+      <w:hyperlink w:history="1" r:id="rIdb7kugi0xd0vjc416bhfgm">
         <w:r>
           <w:rPr>
             <w:rFonts w:ascii="Calibri" w:cs="Calibri" w:eastAsia="Calibri" w:hAnsi="Calibri"/>
@@ -1125,7 +1125,7 @@
         </w:rPr>
         <w:t xml:space="preserve">   </w:t>
       </w:r>
-      <w:hyperlink w:history="1" r:id="rIdyr8y2ksge3rbziiduv_th">
+      <w:hyperlink w:history="1" r:id="rIdfgppnvdyn94cdsbxvmrms">
         <w:r>
           <w:rPr>
             <w:rFonts w:ascii="Calibri" w:cs="Calibri" w:eastAsia="Calibri" w:hAnsi="Calibri"/>
@@ -1275,7 +1275,7 @@
         </w:rPr>
         <w:t xml:space="preserve">   </w:t>
       </w:r>
-      <w:hyperlink w:history="1" r:id="rIdyabnmdviisxuw3fg2crtb">
+      <w:hyperlink w:history="1" r:id="rIdm1opkeejizf-mpbzyzqzs">
         <w:r>
           <w:rPr>
             <w:rFonts w:ascii="Calibri" w:cs="Calibri" w:eastAsia="Calibri" w:hAnsi="Calibri"/>
@@ -1303,7 +1303,7 @@
         </w:rPr>
         <w:t xml:space="preserve">| </w:t>
       </w:r>
-      <w:hyperlink w:history="1" r:id="rIdoskzxovpv4yerm8eu5cay">
+      <w:hyperlink w:history="1" r:id="rIdnrfutw1pwit06y8y7h84l">
         <w:r>
           <w:rPr>
             <w:rFonts w:ascii="Calibri" w:cs="Calibri" w:eastAsia="Calibri" w:hAnsi="Calibri"/>
@@ -1436,7 +1436,7 @@
         </w:rPr>
         <w:t xml:space="preserve">   </w:t>
       </w:r>
-      <w:hyperlink w:history="1" r:id="rId-mh36ij80ubflqlpsa1ue">
+      <w:hyperlink w:history="1" r:id="rIdwkzwmx15tmacv6b9anfbn">
         <w:r>
           <w:rPr>
             <w:rFonts w:ascii="Calibri" w:cs="Calibri" w:eastAsia="Calibri" w:hAnsi="Calibri"/>
@@ -1464,7 +1464,7 @@
         </w:rPr>
         <w:t xml:space="preserve">| </w:t>
       </w:r>
-      <w:hyperlink w:history="1" r:id="rIdkzh1f_0h-y6hifmmgghqo">
+      <w:hyperlink w:history="1" r:id="rId1ytoicqdkqga_3ouf_wto">
         <w:r>
           <w:rPr>
             <w:rFonts w:ascii="Calibri" w:cs="Calibri" w:eastAsia="Calibri" w:hAnsi="Calibri"/>
@@ -1492,7 +1492,7 @@
         </w:rPr>
         <w:t xml:space="preserve">| </w:t>
       </w:r>
-      <w:hyperlink w:history="1" r:id="rIdoocjbjnd0smut8pe7fa96">
+      <w:hyperlink w:history="1" r:id="rIdmiy0ho1ksedmltuj7ry9a">
         <w:r>
           <w:rPr>
             <w:rFonts w:ascii="Calibri" w:cs="Calibri" w:eastAsia="Calibri" w:hAnsi="Calibri"/>
@@ -1659,7 +1659,7 @@
         </w:rPr>
         <w:t xml:space="preserve">   </w:t>
       </w:r>
-      <w:hyperlink w:history="1" r:id="rIdxeun-hj2h_q16plw3bpt-">
+      <w:hyperlink w:history="1" r:id="rIdamaf3lwffnerstimzx-dh">
         <w:r>
           <w:rPr>
             <w:rFonts w:ascii="Calibri" w:cs="Calibri" w:eastAsia="Calibri" w:hAnsi="Calibri"/>
@@ -1828,7 +1828,7 @@
         </w:rPr>
         <w:t xml:space="preserve">   </w:t>
       </w:r>
-      <w:hyperlink w:history="1" r:id="rIdfd4cgornbbxjovcgzxd6m">
+      <w:hyperlink w:history="1" r:id="rIdj6e3f_6nvugfgm6ia0dn6">
         <w:r>
           <w:rPr>
             <w:rFonts w:ascii="Calibri" w:cs="Calibri" w:eastAsia="Calibri" w:hAnsi="Calibri"/>
@@ -1856,7 +1856,7 @@
         </w:rPr>
         <w:t xml:space="preserve">| </w:t>
       </w:r>
-      <w:hyperlink w:history="1" r:id="rIdym6d0qazfobikvrwfttwv">
+      <w:hyperlink w:history="1" r:id="rIdce-c-zwy91nebjzan_xjg">
         <w:r>
           <w:rPr>
             <w:rFonts w:ascii="Calibri" w:cs="Calibri" w:eastAsia="Calibri" w:hAnsi="Calibri"/>
@@ -2588,7 +2588,7 @@
         </w:rPr>
         <w:t xml:space="preserve">   </w:t>
       </w:r>
-      <w:hyperlink w:history="1" r:id="rIdqgnhxtiovpdzd1czfc8uy">
+      <w:hyperlink w:history="1" r:id="rIdjpchl1denlpcozqele2ex">
         <w:r>
           <w:rPr>
             <w:rFonts w:ascii="Calibri" w:cs="Calibri" w:eastAsia="Calibri" w:hAnsi="Calibri"/>
@@ -2616,7 +2616,7 @@
         </w:rPr>
         <w:t xml:space="preserve">| </w:t>
       </w:r>
-      <w:hyperlink w:history="1" r:id="rIdgehb5cxs0e5fd1k__hryg">
+      <w:hyperlink w:history="1" r:id="rIduppb8hkmlx2pkuq82h8ay">
         <w:r>
           <w:rPr>
             <w:rFonts w:ascii="Calibri" w:cs="Calibri" w:eastAsia="Calibri" w:hAnsi="Calibri"/>

</xml_diff>

<commit_message>
Auto-regenerate CVs and cover letters (#907)
</commit_message>
<xml_diff>
--- a/public/resume/Isaac_Adjei_CV.docx
+++ b/public/resume/Isaac_Adjei_CV.docx
@@ -33,7 +33,7 @@
         </w:rPr>
         <w:t xml:space="preserve">✉ </w:t>
       </w:r>
-      <w:hyperlink w:history="1" r:id="rIdaevp4ozp6nxp0nasj4ost">
+      <w:hyperlink w:history="1" r:id="rIdam86ofq2mbnnuynsf3ot9">
         <w:r>
           <w:rPr>
             <w:rFonts w:ascii="Calibri" w:cs="Calibri" w:eastAsia="Calibri" w:hAnsi="Calibri"/>
@@ -63,7 +63,7 @@
         </w:rPr>
         <w:t xml:space="preserve">• </w:t>
       </w:r>
-      <w:hyperlink w:history="1" r:id="rIddjoswtxqjupmcshtfrukb">
+      <w:hyperlink w:history="1" r:id="rId5ct_tmssfn5ovk5qcwfy6">
         <w:r>
           <w:rPr>
             <w:rFonts w:ascii="Calibri" w:cs="Calibri" w:eastAsia="Calibri" w:hAnsi="Calibri"/>
@@ -93,7 +93,7 @@
         </w:rPr>
         <w:t xml:space="preserve">⁠in </w:t>
       </w:r>
-      <w:hyperlink w:history="1" r:id="rIdddzhxyohwrhx3s-kxtanp">
+      <w:hyperlink w:history="1" r:id="rIdrjjswuouj7tutqqjfrg-c">
         <w:r>
           <w:rPr>
             <w:rFonts w:ascii="Calibri" w:cs="Calibri" w:eastAsia="Calibri" w:hAnsi="Calibri"/>
@@ -123,7 +123,7 @@
         </w:rPr>
         <w:t xml:space="preserve">◔ </w:t>
       </w:r>
-      <w:hyperlink w:history="1" r:id="rIdkrnpiui2xopbq3frv4bqv">
+      <w:hyperlink w:history="1" r:id="rIdoahly5zjvpjazv-wmmrdx">
         <w:r>
           <w:rPr>
             <w:rFonts w:ascii="Calibri" w:cs="Calibri" w:eastAsia="Calibri" w:hAnsi="Calibri"/>
@@ -153,7 +153,7 @@
         </w:rPr>
         <w:t xml:space="preserve">Ⓘ </w:t>
       </w:r>
-      <w:hyperlink w:history="1" r:id="rIdxrli2zdjmpkcuc8djd73j">
+      <w:hyperlink w:history="1" r:id="rIdjxoxmxsetyaadb0er-n0p">
         <w:r>
           <w:rPr>
             <w:rFonts w:ascii="Calibri" w:cs="Calibri" w:eastAsia="Calibri" w:hAnsi="Calibri"/>
@@ -716,7 +716,7 @@
         </w:rPr>
         <w:t xml:space="preserve">   </w:t>
       </w:r>
-      <w:hyperlink w:history="1" r:id="rIdnctkawujrj6ox_9iwtmlr">
+      <w:hyperlink w:history="1" r:id="rIdouxxz-rfgbegp7hvsy-sn">
         <w:r>
           <w:rPr>
             <w:rFonts w:ascii="Calibri" w:cs="Calibri" w:eastAsia="Calibri" w:hAnsi="Calibri"/>
@@ -744,7 +744,7 @@
         </w:rPr>
         <w:t xml:space="preserve">| </w:t>
       </w:r>
-      <w:hyperlink w:history="1" r:id="rIdurpa1abfcnazr9gai15dy">
+      <w:hyperlink w:history="1" r:id="rIdnpvwltl-vvi48pidamvkk">
         <w:r>
           <w:rPr>
             <w:rFonts w:ascii="Calibri" w:cs="Calibri" w:eastAsia="Calibri" w:hAnsi="Calibri"/>
@@ -772,7 +772,7 @@
         </w:rPr>
         <w:t xml:space="preserve">| </w:t>
       </w:r>
-      <w:hyperlink w:history="1" r:id="rIdb7kugi0xd0vjc416bhfgm">
+      <w:hyperlink w:history="1" r:id="rIdtoyasu1smdmrfwxtvixwj">
         <w:r>
           <w:rPr>
             <w:rFonts w:ascii="Calibri" w:cs="Calibri" w:eastAsia="Calibri" w:hAnsi="Calibri"/>
@@ -1125,7 +1125,7 @@
         </w:rPr>
         <w:t xml:space="preserve">   </w:t>
       </w:r>
-      <w:hyperlink w:history="1" r:id="rIdfgppnvdyn94cdsbxvmrms">
+      <w:hyperlink w:history="1" r:id="rIdj2uwyv5zfs5dsnlovokcp">
         <w:r>
           <w:rPr>
             <w:rFonts w:ascii="Calibri" w:cs="Calibri" w:eastAsia="Calibri" w:hAnsi="Calibri"/>
@@ -1275,7 +1275,7 @@
         </w:rPr>
         <w:t xml:space="preserve">   </w:t>
       </w:r>
-      <w:hyperlink w:history="1" r:id="rIdm1opkeejizf-mpbzyzqzs">
+      <w:hyperlink w:history="1" r:id="rIdh2lkdgvdllpdpkvxg11wr">
         <w:r>
           <w:rPr>
             <w:rFonts w:ascii="Calibri" w:cs="Calibri" w:eastAsia="Calibri" w:hAnsi="Calibri"/>
@@ -1303,7 +1303,7 @@
         </w:rPr>
         <w:t xml:space="preserve">| </w:t>
       </w:r>
-      <w:hyperlink w:history="1" r:id="rIdnrfutw1pwit06y8y7h84l">
+      <w:hyperlink w:history="1" r:id="rIdoa-uhrsn66mko4qe4kcxr">
         <w:r>
           <w:rPr>
             <w:rFonts w:ascii="Calibri" w:cs="Calibri" w:eastAsia="Calibri" w:hAnsi="Calibri"/>
@@ -1436,7 +1436,7 @@
         </w:rPr>
         <w:t xml:space="preserve">   </w:t>
       </w:r>
-      <w:hyperlink w:history="1" r:id="rIdwkzwmx15tmacv6b9anfbn">
+      <w:hyperlink w:history="1" r:id="rId58aujgvf_flryigmcz3mf">
         <w:r>
           <w:rPr>
             <w:rFonts w:ascii="Calibri" w:cs="Calibri" w:eastAsia="Calibri" w:hAnsi="Calibri"/>
@@ -1464,7 +1464,7 @@
         </w:rPr>
         <w:t xml:space="preserve">| </w:t>
       </w:r>
-      <w:hyperlink w:history="1" r:id="rId1ytoicqdkqga_3ouf_wto">
+      <w:hyperlink w:history="1" r:id="rIddrbm9wa5eaxqkcpvlxyfl">
         <w:r>
           <w:rPr>
             <w:rFonts w:ascii="Calibri" w:cs="Calibri" w:eastAsia="Calibri" w:hAnsi="Calibri"/>
@@ -1492,7 +1492,7 @@
         </w:rPr>
         <w:t xml:space="preserve">| </w:t>
       </w:r>
-      <w:hyperlink w:history="1" r:id="rIdmiy0ho1ksedmltuj7ry9a">
+      <w:hyperlink w:history="1" r:id="rIdcxqv_kfkbyqxmwsg39bjv">
         <w:r>
           <w:rPr>
             <w:rFonts w:ascii="Calibri" w:cs="Calibri" w:eastAsia="Calibri" w:hAnsi="Calibri"/>
@@ -1659,7 +1659,7 @@
         </w:rPr>
         <w:t xml:space="preserve">   </w:t>
       </w:r>
-      <w:hyperlink w:history="1" r:id="rIdamaf3lwffnerstimzx-dh">
+      <w:hyperlink w:history="1" r:id="rIdotnrs4urkkq1urz2jtepx">
         <w:r>
           <w:rPr>
             <w:rFonts w:ascii="Calibri" w:cs="Calibri" w:eastAsia="Calibri" w:hAnsi="Calibri"/>
@@ -1828,7 +1828,7 @@
         </w:rPr>
         <w:t xml:space="preserve">   </w:t>
       </w:r>
-      <w:hyperlink w:history="1" r:id="rIdj6e3f_6nvugfgm6ia0dn6">
+      <w:hyperlink w:history="1" r:id="rIdseipu9p_2ydlsict2decz">
         <w:r>
           <w:rPr>
             <w:rFonts w:ascii="Calibri" w:cs="Calibri" w:eastAsia="Calibri" w:hAnsi="Calibri"/>
@@ -1856,7 +1856,7 @@
         </w:rPr>
         <w:t xml:space="preserve">| </w:t>
       </w:r>
-      <w:hyperlink w:history="1" r:id="rIdce-c-zwy91nebjzan_xjg">
+      <w:hyperlink w:history="1" r:id="rId2oqtwf8owff0tkmgme6l-">
         <w:r>
           <w:rPr>
             <w:rFonts w:ascii="Calibri" w:cs="Calibri" w:eastAsia="Calibri" w:hAnsi="Calibri"/>
@@ -2588,7 +2588,7 @@
         </w:rPr>
         <w:t xml:space="preserve">   </w:t>
       </w:r>
-      <w:hyperlink w:history="1" r:id="rIdjpchl1denlpcozqele2ex">
+      <w:hyperlink w:history="1" r:id="rId2tiw6syz8khudrki3zdvn">
         <w:r>
           <w:rPr>
             <w:rFonts w:ascii="Calibri" w:cs="Calibri" w:eastAsia="Calibri" w:hAnsi="Calibri"/>
@@ -2616,7 +2616,7 @@
         </w:rPr>
         <w:t xml:space="preserve">| </w:t>
       </w:r>
-      <w:hyperlink w:history="1" r:id="rIduppb8hkmlx2pkuq82h8ay">
+      <w:hyperlink w:history="1" r:id="rIdghgqranso-3v86q4sxttl">
         <w:r>
           <w:rPr>
             <w:rFonts w:ascii="Calibri" w:cs="Calibri" w:eastAsia="Calibri" w:hAnsi="Calibri"/>

</xml_diff>

<commit_message>
chore: regenerate CVs and cover letters
</commit_message>
<xml_diff>
--- a/public/resume/Isaac_Adjei_CV.docx
+++ b/public/resume/Isaac_Adjei_CV.docx
@@ -33,7 +33,7 @@
         </w:rPr>
         <w:t xml:space="preserve">✉ </w:t>
       </w:r>
-      <w:hyperlink w:history="1" r:id="rIdam86ofq2mbnnuynsf3ot9">
+      <w:hyperlink w:history="1" r:id="rIdokuleixlrjcwowifpd9rw">
         <w:r>
           <w:rPr>
             <w:rFonts w:ascii="Calibri" w:cs="Calibri" w:eastAsia="Calibri" w:hAnsi="Calibri"/>
@@ -63,7 +63,7 @@
         </w:rPr>
         <w:t xml:space="preserve">• </w:t>
       </w:r>
-      <w:hyperlink w:history="1" r:id="rId5ct_tmssfn5ovk5qcwfy6">
+      <w:hyperlink w:history="1" r:id="rIdleloyy_sreddilvuxemdu">
         <w:r>
           <w:rPr>
             <w:rFonts w:ascii="Calibri" w:cs="Calibri" w:eastAsia="Calibri" w:hAnsi="Calibri"/>
@@ -93,7 +93,7 @@
         </w:rPr>
         <w:t xml:space="preserve">⁠in </w:t>
       </w:r>
-      <w:hyperlink w:history="1" r:id="rIdrjjswuouj7tutqqjfrg-c">
+      <w:hyperlink w:history="1" r:id="rIditd2dro9zdv7ecky6fn8u">
         <w:r>
           <w:rPr>
             <w:rFonts w:ascii="Calibri" w:cs="Calibri" w:eastAsia="Calibri" w:hAnsi="Calibri"/>
@@ -123,7 +123,7 @@
         </w:rPr>
         <w:t xml:space="preserve">◔ </w:t>
       </w:r>
-      <w:hyperlink w:history="1" r:id="rIdoahly5zjvpjazv-wmmrdx">
+      <w:hyperlink w:history="1" r:id="rIdhs5lmlko-eve1xxqkgca1">
         <w:r>
           <w:rPr>
             <w:rFonts w:ascii="Calibri" w:cs="Calibri" w:eastAsia="Calibri" w:hAnsi="Calibri"/>
@@ -153,7 +153,7 @@
         </w:rPr>
         <w:t xml:space="preserve">Ⓘ </w:t>
       </w:r>
-      <w:hyperlink w:history="1" r:id="rIdjxoxmxsetyaadb0er-n0p">
+      <w:hyperlink w:history="1" r:id="rId64zpebfdtlhfhyntqp7ti">
         <w:r>
           <w:rPr>
             <w:rFonts w:ascii="Calibri" w:cs="Calibri" w:eastAsia="Calibri" w:hAnsi="Calibri"/>
@@ -716,7 +716,7 @@
         </w:rPr>
         <w:t xml:space="preserve">   </w:t>
       </w:r>
-      <w:hyperlink w:history="1" r:id="rIdouxxz-rfgbegp7hvsy-sn">
+      <w:hyperlink w:history="1" r:id="rIdketd0qc1d7ezsqr_uksct">
         <w:r>
           <w:rPr>
             <w:rFonts w:ascii="Calibri" w:cs="Calibri" w:eastAsia="Calibri" w:hAnsi="Calibri"/>
@@ -744,7 +744,7 @@
         </w:rPr>
         <w:t xml:space="preserve">| </w:t>
       </w:r>
-      <w:hyperlink w:history="1" r:id="rIdnpvwltl-vvi48pidamvkk">
+      <w:hyperlink w:history="1" r:id="rIdbiwncolvcggdq9b4wcepd">
         <w:r>
           <w:rPr>
             <w:rFonts w:ascii="Calibri" w:cs="Calibri" w:eastAsia="Calibri" w:hAnsi="Calibri"/>
@@ -772,7 +772,7 @@
         </w:rPr>
         <w:t xml:space="preserve">| </w:t>
       </w:r>
-      <w:hyperlink w:history="1" r:id="rIdtoyasu1smdmrfwxtvixwj">
+      <w:hyperlink w:history="1" r:id="rIdxawbyc_au4z6oizatli5p">
         <w:r>
           <w:rPr>
             <w:rFonts w:ascii="Calibri" w:cs="Calibri" w:eastAsia="Calibri" w:hAnsi="Calibri"/>
@@ -1125,7 +1125,7 @@
         </w:rPr>
         <w:t xml:space="preserve">   </w:t>
       </w:r>
-      <w:hyperlink w:history="1" r:id="rIdj2uwyv5zfs5dsnlovokcp">
+      <w:hyperlink w:history="1" r:id="rIdkslfmpg7ep9flfjyr6_op">
         <w:r>
           <w:rPr>
             <w:rFonts w:ascii="Calibri" w:cs="Calibri" w:eastAsia="Calibri" w:hAnsi="Calibri"/>
@@ -1275,7 +1275,7 @@
         </w:rPr>
         <w:t xml:space="preserve">   </w:t>
       </w:r>
-      <w:hyperlink w:history="1" r:id="rIdh2lkdgvdllpdpkvxg11wr">
+      <w:hyperlink w:history="1" r:id="rIdqm4h1r0lnzycouktdxqis">
         <w:r>
           <w:rPr>
             <w:rFonts w:ascii="Calibri" w:cs="Calibri" w:eastAsia="Calibri" w:hAnsi="Calibri"/>
@@ -1303,7 +1303,7 @@
         </w:rPr>
         <w:t xml:space="preserve">| </w:t>
       </w:r>
-      <w:hyperlink w:history="1" r:id="rIdoa-uhrsn66mko4qe4kcxr">
+      <w:hyperlink w:history="1" r:id="rIdnnxzllslvg5kzskrai2aw">
         <w:r>
           <w:rPr>
             <w:rFonts w:ascii="Calibri" w:cs="Calibri" w:eastAsia="Calibri" w:hAnsi="Calibri"/>
@@ -1436,7 +1436,7 @@
         </w:rPr>
         <w:t xml:space="preserve">   </w:t>
       </w:r>
-      <w:hyperlink w:history="1" r:id="rId58aujgvf_flryigmcz3mf">
+      <w:hyperlink w:history="1" r:id="rIdpia5pn43edhxuksqgu8p3">
         <w:r>
           <w:rPr>
             <w:rFonts w:ascii="Calibri" w:cs="Calibri" w:eastAsia="Calibri" w:hAnsi="Calibri"/>
@@ -1464,7 +1464,7 @@
         </w:rPr>
         <w:t xml:space="preserve">| </w:t>
       </w:r>
-      <w:hyperlink w:history="1" r:id="rIddrbm9wa5eaxqkcpvlxyfl">
+      <w:hyperlink w:history="1" r:id="rIdq8jntocjn-_hreqr5s3m8">
         <w:r>
           <w:rPr>
             <w:rFonts w:ascii="Calibri" w:cs="Calibri" w:eastAsia="Calibri" w:hAnsi="Calibri"/>
@@ -1492,7 +1492,7 @@
         </w:rPr>
         <w:t xml:space="preserve">| </w:t>
       </w:r>
-      <w:hyperlink w:history="1" r:id="rIdcxqv_kfkbyqxmwsg39bjv">
+      <w:hyperlink w:history="1" r:id="rIdaz-5bfzi9dpihzrxqdi69">
         <w:r>
           <w:rPr>
             <w:rFonts w:ascii="Calibri" w:cs="Calibri" w:eastAsia="Calibri" w:hAnsi="Calibri"/>
@@ -1659,7 +1659,7 @@
         </w:rPr>
         <w:t xml:space="preserve">   </w:t>
       </w:r>
-      <w:hyperlink w:history="1" r:id="rIdotnrs4urkkq1urz2jtepx">
+      <w:hyperlink w:history="1" r:id="rIdgqizvmasyp8ysulzq6ihb">
         <w:r>
           <w:rPr>
             <w:rFonts w:ascii="Calibri" w:cs="Calibri" w:eastAsia="Calibri" w:hAnsi="Calibri"/>
@@ -1828,7 +1828,7 @@
         </w:rPr>
         <w:t xml:space="preserve">   </w:t>
       </w:r>
-      <w:hyperlink w:history="1" r:id="rIdseipu9p_2ydlsict2decz">
+      <w:hyperlink w:history="1" r:id="rIdoj4evt1nha4udfc7b16wa">
         <w:r>
           <w:rPr>
             <w:rFonts w:ascii="Calibri" w:cs="Calibri" w:eastAsia="Calibri" w:hAnsi="Calibri"/>
@@ -1856,7 +1856,7 @@
         </w:rPr>
         <w:t xml:space="preserve">| </w:t>
       </w:r>
-      <w:hyperlink w:history="1" r:id="rId2oqtwf8owff0tkmgme6l-">
+      <w:hyperlink w:history="1" r:id="rIdyz0heizhxsjqkxmmv0yco">
         <w:r>
           <w:rPr>
             <w:rFonts w:ascii="Calibri" w:cs="Calibri" w:eastAsia="Calibri" w:hAnsi="Calibri"/>
@@ -2588,7 +2588,7 @@
         </w:rPr>
         <w:t xml:space="preserve">   </w:t>
       </w:r>
-      <w:hyperlink w:history="1" r:id="rId2tiw6syz8khudrki3zdvn">
+      <w:hyperlink w:history="1" r:id="rId55zn5eejjqfhafczhqj36">
         <w:r>
           <w:rPr>
             <w:rFonts w:ascii="Calibri" w:cs="Calibri" w:eastAsia="Calibri" w:hAnsi="Calibri"/>
@@ -2616,7 +2616,7 @@
         </w:rPr>
         <w:t xml:space="preserve">| </w:t>
       </w:r>
-      <w:hyperlink w:history="1" r:id="rIdghgqranso-3v86q4sxttl">
+      <w:hyperlink w:history="1" r:id="rId0wenk-xfiw7owxm122-0-">
         <w:r>
           <w:rPr>
             <w:rFonts w:ascii="Calibri" w:cs="Calibri" w:eastAsia="Calibri" w:hAnsi="Calibri"/>

</xml_diff>

<commit_message>
chore: regenerate CVs and cover letters (#921)
</commit_message>
<xml_diff>
--- a/public/resume/Isaac_Adjei_CV.docx
+++ b/public/resume/Isaac_Adjei_CV.docx
@@ -33,7 +33,7 @@
         </w:rPr>
         <w:t xml:space="preserve">✉ </w:t>
       </w:r>
-      <w:hyperlink w:history="1" r:id="rIdam86ofq2mbnnuynsf3ot9">
+      <w:hyperlink w:history="1" r:id="rIdokuleixlrjcwowifpd9rw">
         <w:r>
           <w:rPr>
             <w:rFonts w:ascii="Calibri" w:cs="Calibri" w:eastAsia="Calibri" w:hAnsi="Calibri"/>
@@ -63,7 +63,7 @@
         </w:rPr>
         <w:t xml:space="preserve">• </w:t>
       </w:r>
-      <w:hyperlink w:history="1" r:id="rId5ct_tmssfn5ovk5qcwfy6">
+      <w:hyperlink w:history="1" r:id="rIdleloyy_sreddilvuxemdu">
         <w:r>
           <w:rPr>
             <w:rFonts w:ascii="Calibri" w:cs="Calibri" w:eastAsia="Calibri" w:hAnsi="Calibri"/>
@@ -93,7 +93,7 @@
         </w:rPr>
         <w:t xml:space="preserve">⁠in </w:t>
       </w:r>
-      <w:hyperlink w:history="1" r:id="rIdrjjswuouj7tutqqjfrg-c">
+      <w:hyperlink w:history="1" r:id="rIditd2dro9zdv7ecky6fn8u">
         <w:r>
           <w:rPr>
             <w:rFonts w:ascii="Calibri" w:cs="Calibri" w:eastAsia="Calibri" w:hAnsi="Calibri"/>
@@ -123,7 +123,7 @@
         </w:rPr>
         <w:t xml:space="preserve">◔ </w:t>
       </w:r>
-      <w:hyperlink w:history="1" r:id="rIdoahly5zjvpjazv-wmmrdx">
+      <w:hyperlink w:history="1" r:id="rIdhs5lmlko-eve1xxqkgca1">
         <w:r>
           <w:rPr>
             <w:rFonts w:ascii="Calibri" w:cs="Calibri" w:eastAsia="Calibri" w:hAnsi="Calibri"/>
@@ -153,7 +153,7 @@
         </w:rPr>
         <w:t xml:space="preserve">Ⓘ </w:t>
       </w:r>
-      <w:hyperlink w:history="1" r:id="rIdjxoxmxsetyaadb0er-n0p">
+      <w:hyperlink w:history="1" r:id="rId64zpebfdtlhfhyntqp7ti">
         <w:r>
           <w:rPr>
             <w:rFonts w:ascii="Calibri" w:cs="Calibri" w:eastAsia="Calibri" w:hAnsi="Calibri"/>
@@ -716,7 +716,7 @@
         </w:rPr>
         <w:t xml:space="preserve">   </w:t>
       </w:r>
-      <w:hyperlink w:history="1" r:id="rIdouxxz-rfgbegp7hvsy-sn">
+      <w:hyperlink w:history="1" r:id="rIdketd0qc1d7ezsqr_uksct">
         <w:r>
           <w:rPr>
             <w:rFonts w:ascii="Calibri" w:cs="Calibri" w:eastAsia="Calibri" w:hAnsi="Calibri"/>
@@ -744,7 +744,7 @@
         </w:rPr>
         <w:t xml:space="preserve">| </w:t>
       </w:r>
-      <w:hyperlink w:history="1" r:id="rIdnpvwltl-vvi48pidamvkk">
+      <w:hyperlink w:history="1" r:id="rIdbiwncolvcggdq9b4wcepd">
         <w:r>
           <w:rPr>
             <w:rFonts w:ascii="Calibri" w:cs="Calibri" w:eastAsia="Calibri" w:hAnsi="Calibri"/>
@@ -772,7 +772,7 @@
         </w:rPr>
         <w:t xml:space="preserve">| </w:t>
       </w:r>
-      <w:hyperlink w:history="1" r:id="rIdtoyasu1smdmrfwxtvixwj">
+      <w:hyperlink w:history="1" r:id="rIdxawbyc_au4z6oizatli5p">
         <w:r>
           <w:rPr>
             <w:rFonts w:ascii="Calibri" w:cs="Calibri" w:eastAsia="Calibri" w:hAnsi="Calibri"/>
@@ -1125,7 +1125,7 @@
         </w:rPr>
         <w:t xml:space="preserve">   </w:t>
       </w:r>
-      <w:hyperlink w:history="1" r:id="rIdj2uwyv5zfs5dsnlovokcp">
+      <w:hyperlink w:history="1" r:id="rIdkslfmpg7ep9flfjyr6_op">
         <w:r>
           <w:rPr>
             <w:rFonts w:ascii="Calibri" w:cs="Calibri" w:eastAsia="Calibri" w:hAnsi="Calibri"/>
@@ -1275,7 +1275,7 @@
         </w:rPr>
         <w:t xml:space="preserve">   </w:t>
       </w:r>
-      <w:hyperlink w:history="1" r:id="rIdh2lkdgvdllpdpkvxg11wr">
+      <w:hyperlink w:history="1" r:id="rIdqm4h1r0lnzycouktdxqis">
         <w:r>
           <w:rPr>
             <w:rFonts w:ascii="Calibri" w:cs="Calibri" w:eastAsia="Calibri" w:hAnsi="Calibri"/>
@@ -1303,7 +1303,7 @@
         </w:rPr>
         <w:t xml:space="preserve">| </w:t>
       </w:r>
-      <w:hyperlink w:history="1" r:id="rIdoa-uhrsn66mko4qe4kcxr">
+      <w:hyperlink w:history="1" r:id="rIdnnxzllslvg5kzskrai2aw">
         <w:r>
           <w:rPr>
             <w:rFonts w:ascii="Calibri" w:cs="Calibri" w:eastAsia="Calibri" w:hAnsi="Calibri"/>
@@ -1436,7 +1436,7 @@
         </w:rPr>
         <w:t xml:space="preserve">   </w:t>
       </w:r>
-      <w:hyperlink w:history="1" r:id="rId58aujgvf_flryigmcz3mf">
+      <w:hyperlink w:history="1" r:id="rIdpia5pn43edhxuksqgu8p3">
         <w:r>
           <w:rPr>
             <w:rFonts w:ascii="Calibri" w:cs="Calibri" w:eastAsia="Calibri" w:hAnsi="Calibri"/>
@@ -1464,7 +1464,7 @@
         </w:rPr>
         <w:t xml:space="preserve">| </w:t>
       </w:r>
-      <w:hyperlink w:history="1" r:id="rIddrbm9wa5eaxqkcpvlxyfl">
+      <w:hyperlink w:history="1" r:id="rIdq8jntocjn-_hreqr5s3m8">
         <w:r>
           <w:rPr>
             <w:rFonts w:ascii="Calibri" w:cs="Calibri" w:eastAsia="Calibri" w:hAnsi="Calibri"/>
@@ -1492,7 +1492,7 @@
         </w:rPr>
         <w:t xml:space="preserve">| </w:t>
       </w:r>
-      <w:hyperlink w:history="1" r:id="rIdcxqv_kfkbyqxmwsg39bjv">
+      <w:hyperlink w:history="1" r:id="rIdaz-5bfzi9dpihzrxqdi69">
         <w:r>
           <w:rPr>
             <w:rFonts w:ascii="Calibri" w:cs="Calibri" w:eastAsia="Calibri" w:hAnsi="Calibri"/>
@@ -1659,7 +1659,7 @@
         </w:rPr>
         <w:t xml:space="preserve">   </w:t>
       </w:r>
-      <w:hyperlink w:history="1" r:id="rIdotnrs4urkkq1urz2jtepx">
+      <w:hyperlink w:history="1" r:id="rIdgqizvmasyp8ysulzq6ihb">
         <w:r>
           <w:rPr>
             <w:rFonts w:ascii="Calibri" w:cs="Calibri" w:eastAsia="Calibri" w:hAnsi="Calibri"/>
@@ -1828,7 +1828,7 @@
         </w:rPr>
         <w:t xml:space="preserve">   </w:t>
       </w:r>
-      <w:hyperlink w:history="1" r:id="rIdseipu9p_2ydlsict2decz">
+      <w:hyperlink w:history="1" r:id="rIdoj4evt1nha4udfc7b16wa">
         <w:r>
           <w:rPr>
             <w:rFonts w:ascii="Calibri" w:cs="Calibri" w:eastAsia="Calibri" w:hAnsi="Calibri"/>
@@ -1856,7 +1856,7 @@
         </w:rPr>
         <w:t xml:space="preserve">| </w:t>
       </w:r>
-      <w:hyperlink w:history="1" r:id="rId2oqtwf8owff0tkmgme6l-">
+      <w:hyperlink w:history="1" r:id="rIdyz0heizhxsjqkxmmv0yco">
         <w:r>
           <w:rPr>
             <w:rFonts w:ascii="Calibri" w:cs="Calibri" w:eastAsia="Calibri" w:hAnsi="Calibri"/>
@@ -2588,7 +2588,7 @@
         </w:rPr>
         <w:t xml:space="preserve">   </w:t>
       </w:r>
-      <w:hyperlink w:history="1" r:id="rId2tiw6syz8khudrki3zdvn">
+      <w:hyperlink w:history="1" r:id="rId55zn5eejjqfhafczhqj36">
         <w:r>
           <w:rPr>
             <w:rFonts w:ascii="Calibri" w:cs="Calibri" w:eastAsia="Calibri" w:hAnsi="Calibri"/>
@@ -2616,7 +2616,7 @@
         </w:rPr>
         <w:t xml:space="preserve">| </w:t>
       </w:r>
-      <w:hyperlink w:history="1" r:id="rIdghgqranso-3v86q4sxttl">
+      <w:hyperlink w:history="1" r:id="rId0wenk-xfiw7owxm122-0-">
         <w:r>
           <w:rPr>
             <w:rFonts w:ascii="Calibri" w:cs="Calibri" w:eastAsia="Calibri" w:hAnsi="Calibri"/>

</xml_diff>

<commit_message>
chore: regenerate CVs and cover letters (#922)
</commit_message>
<xml_diff>
--- a/public/resume/Isaac_Adjei_CV.docx
+++ b/public/resume/Isaac_Adjei_CV.docx
@@ -33,7 +33,7 @@
         </w:rPr>
         <w:t xml:space="preserve">✉ </w:t>
       </w:r>
-      <w:hyperlink w:history="1" r:id="rIdokuleixlrjcwowifpd9rw">
+      <w:hyperlink w:history="1" r:id="rIdgcgh4p4gogeg38xewhcku">
         <w:r>
           <w:rPr>
             <w:rFonts w:ascii="Calibri" w:cs="Calibri" w:eastAsia="Calibri" w:hAnsi="Calibri"/>
@@ -63,7 +63,7 @@
         </w:rPr>
         <w:t xml:space="preserve">• </w:t>
       </w:r>
-      <w:hyperlink w:history="1" r:id="rIdleloyy_sreddilvuxemdu">
+      <w:hyperlink w:history="1" r:id="rIdgbpg8vtvtfcikfcbfkbpq">
         <w:r>
           <w:rPr>
             <w:rFonts w:ascii="Calibri" w:cs="Calibri" w:eastAsia="Calibri" w:hAnsi="Calibri"/>
@@ -93,7 +93,7 @@
         </w:rPr>
         <w:t xml:space="preserve">⁠in </w:t>
       </w:r>
-      <w:hyperlink w:history="1" r:id="rIditd2dro9zdv7ecky6fn8u">
+      <w:hyperlink w:history="1" r:id="rIdvxo6k2-3r3ljqjcg-cawh">
         <w:r>
           <w:rPr>
             <w:rFonts w:ascii="Calibri" w:cs="Calibri" w:eastAsia="Calibri" w:hAnsi="Calibri"/>
@@ -123,7 +123,7 @@
         </w:rPr>
         <w:t xml:space="preserve">◔ </w:t>
       </w:r>
-      <w:hyperlink w:history="1" r:id="rIdhs5lmlko-eve1xxqkgca1">
+      <w:hyperlink w:history="1" r:id="rIdyvcx9cplud06dgylu3n_s">
         <w:r>
           <w:rPr>
             <w:rFonts w:ascii="Calibri" w:cs="Calibri" w:eastAsia="Calibri" w:hAnsi="Calibri"/>
@@ -153,7 +153,7 @@
         </w:rPr>
         <w:t xml:space="preserve">Ⓘ </w:t>
       </w:r>
-      <w:hyperlink w:history="1" r:id="rId64zpebfdtlhfhyntqp7ti">
+      <w:hyperlink w:history="1" r:id="rIdrhhgfxj2moxiuorqi5q6u">
         <w:r>
           <w:rPr>
             <w:rFonts w:ascii="Calibri" w:cs="Calibri" w:eastAsia="Calibri" w:hAnsi="Calibri"/>
@@ -716,7 +716,7 @@
         </w:rPr>
         <w:t xml:space="preserve">   </w:t>
       </w:r>
-      <w:hyperlink w:history="1" r:id="rIdketd0qc1d7ezsqr_uksct">
+      <w:hyperlink w:history="1" r:id="rIdmsmrlswz5iurezogryh-f">
         <w:r>
           <w:rPr>
             <w:rFonts w:ascii="Calibri" w:cs="Calibri" w:eastAsia="Calibri" w:hAnsi="Calibri"/>
@@ -744,7 +744,7 @@
         </w:rPr>
         <w:t xml:space="preserve">| </w:t>
       </w:r>
-      <w:hyperlink w:history="1" r:id="rIdbiwncolvcggdq9b4wcepd">
+      <w:hyperlink w:history="1" r:id="rIdryiekbw-qae6khzhsl9fd">
         <w:r>
           <w:rPr>
             <w:rFonts w:ascii="Calibri" w:cs="Calibri" w:eastAsia="Calibri" w:hAnsi="Calibri"/>
@@ -772,7 +772,7 @@
         </w:rPr>
         <w:t xml:space="preserve">| </w:t>
       </w:r>
-      <w:hyperlink w:history="1" r:id="rIdxawbyc_au4z6oizatli5p">
+      <w:hyperlink w:history="1" r:id="rIdbqu5jdbngxlnxdfuyorcv">
         <w:r>
           <w:rPr>
             <w:rFonts w:ascii="Calibri" w:cs="Calibri" w:eastAsia="Calibri" w:hAnsi="Calibri"/>
@@ -1125,7 +1125,7 @@
         </w:rPr>
         <w:t xml:space="preserve">   </w:t>
       </w:r>
-      <w:hyperlink w:history="1" r:id="rIdkslfmpg7ep9flfjyr6_op">
+      <w:hyperlink w:history="1" r:id="rIda8dmjakcjwb_o5rct0pkd">
         <w:r>
           <w:rPr>
             <w:rFonts w:ascii="Calibri" w:cs="Calibri" w:eastAsia="Calibri" w:hAnsi="Calibri"/>
@@ -1275,7 +1275,7 @@
         </w:rPr>
         <w:t xml:space="preserve">   </w:t>
       </w:r>
-      <w:hyperlink w:history="1" r:id="rIdqm4h1r0lnzycouktdxqis">
+      <w:hyperlink w:history="1" r:id="rIdnk1lt-keawkysp1kkm7gr">
         <w:r>
           <w:rPr>
             <w:rFonts w:ascii="Calibri" w:cs="Calibri" w:eastAsia="Calibri" w:hAnsi="Calibri"/>
@@ -1303,7 +1303,7 @@
         </w:rPr>
         <w:t xml:space="preserve">| </w:t>
       </w:r>
-      <w:hyperlink w:history="1" r:id="rIdnnxzllslvg5kzskrai2aw">
+      <w:hyperlink w:history="1" r:id="rIdzkwaojjbbbfl2tuu63mhn">
         <w:r>
           <w:rPr>
             <w:rFonts w:ascii="Calibri" w:cs="Calibri" w:eastAsia="Calibri" w:hAnsi="Calibri"/>
@@ -1436,7 +1436,7 @@
         </w:rPr>
         <w:t xml:space="preserve">   </w:t>
       </w:r>
-      <w:hyperlink w:history="1" r:id="rIdpia5pn43edhxuksqgu8p3">
+      <w:hyperlink w:history="1" r:id="rIdpodi8tercyzfct__t6poi">
         <w:r>
           <w:rPr>
             <w:rFonts w:ascii="Calibri" w:cs="Calibri" w:eastAsia="Calibri" w:hAnsi="Calibri"/>
@@ -1464,7 +1464,7 @@
         </w:rPr>
         <w:t xml:space="preserve">| </w:t>
       </w:r>
-      <w:hyperlink w:history="1" r:id="rIdq8jntocjn-_hreqr5s3m8">
+      <w:hyperlink w:history="1" r:id="rId3escmiy9kdb3i_oeuivuz">
         <w:r>
           <w:rPr>
             <w:rFonts w:ascii="Calibri" w:cs="Calibri" w:eastAsia="Calibri" w:hAnsi="Calibri"/>
@@ -1492,7 +1492,7 @@
         </w:rPr>
         <w:t xml:space="preserve">| </w:t>
       </w:r>
-      <w:hyperlink w:history="1" r:id="rIdaz-5bfzi9dpihzrxqdi69">
+      <w:hyperlink w:history="1" r:id="rIdnhlxpnn02xgureyqlu_p7">
         <w:r>
           <w:rPr>
             <w:rFonts w:ascii="Calibri" w:cs="Calibri" w:eastAsia="Calibri" w:hAnsi="Calibri"/>
@@ -1659,7 +1659,7 @@
         </w:rPr>
         <w:t xml:space="preserve">   </w:t>
       </w:r>
-      <w:hyperlink w:history="1" r:id="rIdgqizvmasyp8ysulzq6ihb">
+      <w:hyperlink w:history="1" r:id="rIddx2snoykrl8gqnvl_lo1m">
         <w:r>
           <w:rPr>
             <w:rFonts w:ascii="Calibri" w:cs="Calibri" w:eastAsia="Calibri" w:hAnsi="Calibri"/>
@@ -1828,7 +1828,7 @@
         </w:rPr>
         <w:t xml:space="preserve">   </w:t>
       </w:r>
-      <w:hyperlink w:history="1" r:id="rIdoj4evt1nha4udfc7b16wa">
+      <w:hyperlink w:history="1" r:id="rIdgq50fnujvc6a2htrpr55e">
         <w:r>
           <w:rPr>
             <w:rFonts w:ascii="Calibri" w:cs="Calibri" w:eastAsia="Calibri" w:hAnsi="Calibri"/>
@@ -1856,7 +1856,7 @@
         </w:rPr>
         <w:t xml:space="preserve">| </w:t>
       </w:r>
-      <w:hyperlink w:history="1" r:id="rIdyz0heizhxsjqkxmmv0yco">
+      <w:hyperlink w:history="1" r:id="rId4zxggkxu9s8dmqt1v9t9w">
         <w:r>
           <w:rPr>
             <w:rFonts w:ascii="Calibri" w:cs="Calibri" w:eastAsia="Calibri" w:hAnsi="Calibri"/>
@@ -2588,7 +2588,7 @@
         </w:rPr>
         <w:t xml:space="preserve">   </w:t>
       </w:r>
-      <w:hyperlink w:history="1" r:id="rId55zn5eejjqfhafczhqj36">
+      <w:hyperlink w:history="1" r:id="rIdayh_mcfiobkw_qaea_q82">
         <w:r>
           <w:rPr>
             <w:rFonts w:ascii="Calibri" w:cs="Calibri" w:eastAsia="Calibri" w:hAnsi="Calibri"/>
@@ -2616,7 +2616,7 @@
         </w:rPr>
         <w:t xml:space="preserve">| </w:t>
       </w:r>
-      <w:hyperlink w:history="1" r:id="rId0wenk-xfiw7owxm122-0-">
+      <w:hyperlink w:history="1" r:id="rId1s7moaiyfdz6rnl_m_fit">
         <w:r>
           <w:rPr>
             <w:rFonts w:ascii="Calibri" w:cs="Calibri" w:eastAsia="Calibri" w:hAnsi="Calibri"/>

</xml_diff>

<commit_message>
chore: regenerate CVs and cover letters (#952)
</commit_message>
<xml_diff>
--- a/public/resume/Isaac_Adjei_CV.docx
+++ b/public/resume/Isaac_Adjei_CV.docx
@@ -33,7 +33,7 @@
         </w:rPr>
         <w:t xml:space="preserve">✉ </w:t>
       </w:r>
-      <w:hyperlink w:history="1" r:id="rIdgcgh4p4gogeg38xewhcku">
+      <w:hyperlink w:history="1" r:id="rIdeb5_abldlmd1zjcggwhwr">
         <w:r>
           <w:rPr>
             <w:rFonts w:ascii="Calibri" w:cs="Calibri" w:eastAsia="Calibri" w:hAnsi="Calibri"/>
@@ -63,7 +63,7 @@
         </w:rPr>
         <w:t xml:space="preserve">• </w:t>
       </w:r>
-      <w:hyperlink w:history="1" r:id="rIdgbpg8vtvtfcikfcbfkbpq">
+      <w:hyperlink w:history="1" r:id="rIdqjjxbvbopjl_q0rl9w2rx">
         <w:r>
           <w:rPr>
             <w:rFonts w:ascii="Calibri" w:cs="Calibri" w:eastAsia="Calibri" w:hAnsi="Calibri"/>
@@ -93,7 +93,7 @@
         </w:rPr>
         <w:t xml:space="preserve">⁠in </w:t>
       </w:r>
-      <w:hyperlink w:history="1" r:id="rIdvxo6k2-3r3ljqjcg-cawh">
+      <w:hyperlink w:history="1" r:id="rIdozqidh2ka_8dfcjkj2ytp">
         <w:r>
           <w:rPr>
             <w:rFonts w:ascii="Calibri" w:cs="Calibri" w:eastAsia="Calibri" w:hAnsi="Calibri"/>
@@ -123,7 +123,7 @@
         </w:rPr>
         <w:t xml:space="preserve">◔ </w:t>
       </w:r>
-      <w:hyperlink w:history="1" r:id="rIdyvcx9cplud06dgylu3n_s">
+      <w:hyperlink w:history="1" r:id="rId3atoqd77yrjduw5pu-7zl">
         <w:r>
           <w:rPr>
             <w:rFonts w:ascii="Calibri" w:cs="Calibri" w:eastAsia="Calibri" w:hAnsi="Calibri"/>
@@ -153,7 +153,7 @@
         </w:rPr>
         <w:t xml:space="preserve">Ⓘ </w:t>
       </w:r>
-      <w:hyperlink w:history="1" r:id="rIdrhhgfxj2moxiuorqi5q6u">
+      <w:hyperlink w:history="1" r:id="rIdiaidue6fanzyem1e4tfzg">
         <w:r>
           <w:rPr>
             <w:rFonts w:ascii="Calibri" w:cs="Calibri" w:eastAsia="Calibri" w:hAnsi="Calibri"/>
@@ -716,7 +716,7 @@
         </w:rPr>
         <w:t xml:space="preserve">   </w:t>
       </w:r>
-      <w:hyperlink w:history="1" r:id="rIdmsmrlswz5iurezogryh-f">
+      <w:hyperlink w:history="1" r:id="rIdg9i-lt0-amsmdilegoir9">
         <w:r>
           <w:rPr>
             <w:rFonts w:ascii="Calibri" w:cs="Calibri" w:eastAsia="Calibri" w:hAnsi="Calibri"/>
@@ -744,7 +744,7 @@
         </w:rPr>
         <w:t xml:space="preserve">| </w:t>
       </w:r>
-      <w:hyperlink w:history="1" r:id="rIdryiekbw-qae6khzhsl9fd">
+      <w:hyperlink w:history="1" r:id="rIdwqntmowwyrmzmjcm1un2j">
         <w:r>
           <w:rPr>
             <w:rFonts w:ascii="Calibri" w:cs="Calibri" w:eastAsia="Calibri" w:hAnsi="Calibri"/>
@@ -772,7 +772,7 @@
         </w:rPr>
         <w:t xml:space="preserve">| </w:t>
       </w:r>
-      <w:hyperlink w:history="1" r:id="rIdbqu5jdbngxlnxdfuyorcv">
+      <w:hyperlink w:history="1" r:id="rIdlmfinplfzarq4xsq1khgf">
         <w:r>
           <w:rPr>
             <w:rFonts w:ascii="Calibri" w:cs="Calibri" w:eastAsia="Calibri" w:hAnsi="Calibri"/>
@@ -1125,7 +1125,7 @@
         </w:rPr>
         <w:t xml:space="preserve">   </w:t>
       </w:r>
-      <w:hyperlink w:history="1" r:id="rIda8dmjakcjwb_o5rct0pkd">
+      <w:hyperlink w:history="1" r:id="rIducb5ssodmsgn7vq-pyzlg">
         <w:r>
           <w:rPr>
             <w:rFonts w:ascii="Calibri" w:cs="Calibri" w:eastAsia="Calibri" w:hAnsi="Calibri"/>
@@ -1275,7 +1275,7 @@
         </w:rPr>
         <w:t xml:space="preserve">   </w:t>
       </w:r>
-      <w:hyperlink w:history="1" r:id="rIdnk1lt-keawkysp1kkm7gr">
+      <w:hyperlink w:history="1" r:id="rIdpruifmljgjeka-tantvo4">
         <w:r>
           <w:rPr>
             <w:rFonts w:ascii="Calibri" w:cs="Calibri" w:eastAsia="Calibri" w:hAnsi="Calibri"/>
@@ -1303,7 +1303,7 @@
         </w:rPr>
         <w:t xml:space="preserve">| </w:t>
       </w:r>
-      <w:hyperlink w:history="1" r:id="rIdzkwaojjbbbfl2tuu63mhn">
+      <w:hyperlink w:history="1" r:id="rIdsv1bel3vkhtbpw7d66w-t">
         <w:r>
           <w:rPr>
             <w:rFonts w:ascii="Calibri" w:cs="Calibri" w:eastAsia="Calibri" w:hAnsi="Calibri"/>
@@ -1436,7 +1436,7 @@
         </w:rPr>
         <w:t xml:space="preserve">   </w:t>
       </w:r>
-      <w:hyperlink w:history="1" r:id="rIdpodi8tercyzfct__t6poi">
+      <w:hyperlink w:history="1" r:id="rIdqy5yl6bfgrl_9geuzfjp9">
         <w:r>
           <w:rPr>
             <w:rFonts w:ascii="Calibri" w:cs="Calibri" w:eastAsia="Calibri" w:hAnsi="Calibri"/>
@@ -1464,7 +1464,7 @@
         </w:rPr>
         <w:t xml:space="preserve">| </w:t>
       </w:r>
-      <w:hyperlink w:history="1" r:id="rId3escmiy9kdb3i_oeuivuz">
+      <w:hyperlink w:history="1" r:id="rIdgapnqw8-xnztffthnmlfu">
         <w:r>
           <w:rPr>
             <w:rFonts w:ascii="Calibri" w:cs="Calibri" w:eastAsia="Calibri" w:hAnsi="Calibri"/>
@@ -1492,7 +1492,7 @@
         </w:rPr>
         <w:t xml:space="preserve">| </w:t>
       </w:r>
-      <w:hyperlink w:history="1" r:id="rIdnhlxpnn02xgureyqlu_p7">
+      <w:hyperlink w:history="1" r:id="rIdhyj_dgywqy2s_scl-2cqs">
         <w:r>
           <w:rPr>
             <w:rFonts w:ascii="Calibri" w:cs="Calibri" w:eastAsia="Calibri" w:hAnsi="Calibri"/>
@@ -1659,7 +1659,7 @@
         </w:rPr>
         <w:t xml:space="preserve">   </w:t>
       </w:r>
-      <w:hyperlink w:history="1" r:id="rIddx2snoykrl8gqnvl_lo1m">
+      <w:hyperlink w:history="1" r:id="rIdoitlmqbxgtbqt28be6zcd">
         <w:r>
           <w:rPr>
             <w:rFonts w:ascii="Calibri" w:cs="Calibri" w:eastAsia="Calibri" w:hAnsi="Calibri"/>
@@ -1828,7 +1828,7 @@
         </w:rPr>
         <w:t xml:space="preserve">   </w:t>
       </w:r>
-      <w:hyperlink w:history="1" r:id="rIdgq50fnujvc6a2htrpr55e">
+      <w:hyperlink w:history="1" r:id="rIdylhvokfj3nxtmisowbtlb">
         <w:r>
           <w:rPr>
             <w:rFonts w:ascii="Calibri" w:cs="Calibri" w:eastAsia="Calibri" w:hAnsi="Calibri"/>
@@ -1856,7 +1856,7 @@
         </w:rPr>
         <w:t xml:space="preserve">| </w:t>
       </w:r>
-      <w:hyperlink w:history="1" r:id="rId4zxggkxu9s8dmqt1v9t9w">
+      <w:hyperlink w:history="1" r:id="rId2h46nhgu7etgislhhhjy1">
         <w:r>
           <w:rPr>
             <w:rFonts w:ascii="Calibri" w:cs="Calibri" w:eastAsia="Calibri" w:hAnsi="Calibri"/>
@@ -2588,7 +2588,7 @@
         </w:rPr>
         <w:t xml:space="preserve">   </w:t>
       </w:r>
-      <w:hyperlink w:history="1" r:id="rIdayh_mcfiobkw_qaea_q82">
+      <w:hyperlink w:history="1" r:id="rId2hwo5n3zupthzws7ekhi2">
         <w:r>
           <w:rPr>
             <w:rFonts w:ascii="Calibri" w:cs="Calibri" w:eastAsia="Calibri" w:hAnsi="Calibri"/>
@@ -2616,7 +2616,7 @@
         </w:rPr>
         <w:t xml:space="preserve">| </w:t>
       </w:r>
-      <w:hyperlink w:history="1" r:id="rId1s7moaiyfdz6rnl_m_fit">
+      <w:hyperlink w:history="1" r:id="rId9ps4-l330rtaopsb2pn5n">
         <w:r>
           <w:rPr>
             <w:rFonts w:ascii="Calibri" w:cs="Calibri" w:eastAsia="Calibri" w:hAnsi="Calibri"/>

</xml_diff>

<commit_message>
chore: regenerate CVs and cover letters (#953)
</commit_message>
<xml_diff>
--- a/public/resume/Isaac_Adjei_CV.docx
+++ b/public/resume/Isaac_Adjei_CV.docx
@@ -33,7 +33,7 @@
         </w:rPr>
         <w:t xml:space="preserve">✉ </w:t>
       </w:r>
-      <w:hyperlink w:history="1" r:id="rIdeb5_abldlmd1zjcggwhwr">
+      <w:hyperlink w:history="1" r:id="rIdwganthm-gzrt0iveihh1n">
         <w:r>
           <w:rPr>
             <w:rFonts w:ascii="Calibri" w:cs="Calibri" w:eastAsia="Calibri" w:hAnsi="Calibri"/>
@@ -63,7 +63,7 @@
         </w:rPr>
         <w:t xml:space="preserve">• </w:t>
       </w:r>
-      <w:hyperlink w:history="1" r:id="rIdqjjxbvbopjl_q0rl9w2rx">
+      <w:hyperlink w:history="1" r:id="rIdnpndpv5wg2tkthe54yplt">
         <w:r>
           <w:rPr>
             <w:rFonts w:ascii="Calibri" w:cs="Calibri" w:eastAsia="Calibri" w:hAnsi="Calibri"/>
@@ -93,7 +93,7 @@
         </w:rPr>
         <w:t xml:space="preserve">⁠in </w:t>
       </w:r>
-      <w:hyperlink w:history="1" r:id="rIdozqidh2ka_8dfcjkj2ytp">
+      <w:hyperlink w:history="1" r:id="rIdns3kr0g0kxl5jwtmagpdf">
         <w:r>
           <w:rPr>
             <w:rFonts w:ascii="Calibri" w:cs="Calibri" w:eastAsia="Calibri" w:hAnsi="Calibri"/>
@@ -123,7 +123,7 @@
         </w:rPr>
         <w:t xml:space="preserve">◔ </w:t>
       </w:r>
-      <w:hyperlink w:history="1" r:id="rId3atoqd77yrjduw5pu-7zl">
+      <w:hyperlink w:history="1" r:id="rIdvvizisms2sfsalkzqomaw">
         <w:r>
           <w:rPr>
             <w:rFonts w:ascii="Calibri" w:cs="Calibri" w:eastAsia="Calibri" w:hAnsi="Calibri"/>
@@ -153,7 +153,7 @@
         </w:rPr>
         <w:t xml:space="preserve">Ⓘ </w:t>
       </w:r>
-      <w:hyperlink w:history="1" r:id="rIdiaidue6fanzyem1e4tfzg">
+      <w:hyperlink w:history="1" r:id="rIdud20p_bdtcgw2vsa4qokf">
         <w:r>
           <w:rPr>
             <w:rFonts w:ascii="Calibri" w:cs="Calibri" w:eastAsia="Calibri" w:hAnsi="Calibri"/>
@@ -716,7 +716,7 @@
         </w:rPr>
         <w:t xml:space="preserve">   </w:t>
       </w:r>
-      <w:hyperlink w:history="1" r:id="rIdg9i-lt0-amsmdilegoir9">
+      <w:hyperlink w:history="1" r:id="rId6y-r9q_1zqyabd51etgrn">
         <w:r>
           <w:rPr>
             <w:rFonts w:ascii="Calibri" w:cs="Calibri" w:eastAsia="Calibri" w:hAnsi="Calibri"/>
@@ -744,7 +744,7 @@
         </w:rPr>
         <w:t xml:space="preserve">| </w:t>
       </w:r>
-      <w:hyperlink w:history="1" r:id="rIdwqntmowwyrmzmjcm1un2j">
+      <w:hyperlink w:history="1" r:id="rId_gnv7uktjlwhknmcimwgm">
         <w:r>
           <w:rPr>
             <w:rFonts w:ascii="Calibri" w:cs="Calibri" w:eastAsia="Calibri" w:hAnsi="Calibri"/>
@@ -772,7 +772,7 @@
         </w:rPr>
         <w:t xml:space="preserve">| </w:t>
       </w:r>
-      <w:hyperlink w:history="1" r:id="rIdlmfinplfzarq4xsq1khgf">
+      <w:hyperlink w:history="1" r:id="rIdwa6liem5v2u_2km7j3dlw">
         <w:r>
           <w:rPr>
             <w:rFonts w:ascii="Calibri" w:cs="Calibri" w:eastAsia="Calibri" w:hAnsi="Calibri"/>
@@ -1125,7 +1125,7 @@
         </w:rPr>
         <w:t xml:space="preserve">   </w:t>
       </w:r>
-      <w:hyperlink w:history="1" r:id="rIducb5ssodmsgn7vq-pyzlg">
+      <w:hyperlink w:history="1" r:id="rIdvq3kbgrrkaw_yyh6ng9gu">
         <w:r>
           <w:rPr>
             <w:rFonts w:ascii="Calibri" w:cs="Calibri" w:eastAsia="Calibri" w:hAnsi="Calibri"/>
@@ -1275,7 +1275,7 @@
         </w:rPr>
         <w:t xml:space="preserve">   </w:t>
       </w:r>
-      <w:hyperlink w:history="1" r:id="rIdpruifmljgjeka-tantvo4">
+      <w:hyperlink w:history="1" r:id="rIdwfa4csnt0qedfentayi4z">
         <w:r>
           <w:rPr>
             <w:rFonts w:ascii="Calibri" w:cs="Calibri" w:eastAsia="Calibri" w:hAnsi="Calibri"/>
@@ -1303,7 +1303,7 @@
         </w:rPr>
         <w:t xml:space="preserve">| </w:t>
       </w:r>
-      <w:hyperlink w:history="1" r:id="rIdsv1bel3vkhtbpw7d66w-t">
+      <w:hyperlink w:history="1" r:id="rIdz5c8zrvpd-bbku5tjwdjb">
         <w:r>
           <w:rPr>
             <w:rFonts w:ascii="Calibri" w:cs="Calibri" w:eastAsia="Calibri" w:hAnsi="Calibri"/>
@@ -1436,7 +1436,7 @@
         </w:rPr>
         <w:t xml:space="preserve">   </w:t>
       </w:r>
-      <w:hyperlink w:history="1" r:id="rIdqy5yl6bfgrl_9geuzfjp9">
+      <w:hyperlink w:history="1" r:id="rIdjoeizegf6rze0xfg3x7hc">
         <w:r>
           <w:rPr>
             <w:rFonts w:ascii="Calibri" w:cs="Calibri" w:eastAsia="Calibri" w:hAnsi="Calibri"/>
@@ -1464,7 +1464,7 @@
         </w:rPr>
         <w:t xml:space="preserve">| </w:t>
       </w:r>
-      <w:hyperlink w:history="1" r:id="rIdgapnqw8-xnztffthnmlfu">
+      <w:hyperlink w:history="1" r:id="rIdmtr9a1kwhsgnwemzyf9gj">
         <w:r>
           <w:rPr>
             <w:rFonts w:ascii="Calibri" w:cs="Calibri" w:eastAsia="Calibri" w:hAnsi="Calibri"/>
@@ -1492,7 +1492,7 @@
         </w:rPr>
         <w:t xml:space="preserve">| </w:t>
       </w:r>
-      <w:hyperlink w:history="1" r:id="rIdhyj_dgywqy2s_scl-2cqs">
+      <w:hyperlink w:history="1" r:id="rId79pc0nuhvv0tr8qecdhqy">
         <w:r>
           <w:rPr>
             <w:rFonts w:ascii="Calibri" w:cs="Calibri" w:eastAsia="Calibri" w:hAnsi="Calibri"/>
@@ -1659,7 +1659,7 @@
         </w:rPr>
         <w:t xml:space="preserve">   </w:t>
       </w:r>
-      <w:hyperlink w:history="1" r:id="rIdoitlmqbxgtbqt28be6zcd">
+      <w:hyperlink w:history="1" r:id="rIdtgzlqk5uk-u0djxto9rgd">
         <w:r>
           <w:rPr>
             <w:rFonts w:ascii="Calibri" w:cs="Calibri" w:eastAsia="Calibri" w:hAnsi="Calibri"/>
@@ -1828,7 +1828,7 @@
         </w:rPr>
         <w:t xml:space="preserve">   </w:t>
       </w:r>
-      <w:hyperlink w:history="1" r:id="rIdylhvokfj3nxtmisowbtlb">
+      <w:hyperlink w:history="1" r:id="rIdrrhu1z6vs3ouhtvxg_c34">
         <w:r>
           <w:rPr>
             <w:rFonts w:ascii="Calibri" w:cs="Calibri" w:eastAsia="Calibri" w:hAnsi="Calibri"/>
@@ -1856,7 +1856,7 @@
         </w:rPr>
         <w:t xml:space="preserve">| </w:t>
       </w:r>
-      <w:hyperlink w:history="1" r:id="rId2h46nhgu7etgislhhhjy1">
+      <w:hyperlink w:history="1" r:id="rIdwd7k78fq-kefshbe0y4ke">
         <w:r>
           <w:rPr>
             <w:rFonts w:ascii="Calibri" w:cs="Calibri" w:eastAsia="Calibri" w:hAnsi="Calibri"/>
@@ -2588,7 +2588,7 @@
         </w:rPr>
         <w:t xml:space="preserve">   </w:t>
       </w:r>
-      <w:hyperlink w:history="1" r:id="rId2hwo5n3zupthzws7ekhi2">
+      <w:hyperlink w:history="1" r:id="rIdlh1brbri8mtgoevgoc_tv">
         <w:r>
           <w:rPr>
             <w:rFonts w:ascii="Calibri" w:cs="Calibri" w:eastAsia="Calibri" w:hAnsi="Calibri"/>
@@ -2616,7 +2616,7 @@
         </w:rPr>
         <w:t xml:space="preserve">| </w:t>
       </w:r>
-      <w:hyperlink w:history="1" r:id="rId9ps4-l330rtaopsb2pn5n">
+      <w:hyperlink w:history="1" r:id="rIdoqka6pwrtpu-5ovxe56na">
         <w:r>
           <w:rPr>
             <w:rFonts w:ascii="Calibri" w:cs="Calibri" w:eastAsia="Calibri" w:hAnsi="Calibri"/>

</xml_diff>

<commit_message>
chore: regenerate CVs and cover letters (#967)
</commit_message>
<xml_diff>
--- a/public/resume/Isaac_Adjei_CV.docx
+++ b/public/resume/Isaac_Adjei_CV.docx
@@ -33,7 +33,7 @@
         </w:rPr>
         <w:t xml:space="preserve">✉ </w:t>
       </w:r>
-      <w:hyperlink w:history="1" r:id="rIdwganthm-gzrt0iveihh1n">
+      <w:hyperlink w:history="1" r:id="rId-nrbnnfdyqid_beqkyadq">
         <w:r>
           <w:rPr>
             <w:rFonts w:ascii="Calibri" w:cs="Calibri" w:eastAsia="Calibri" w:hAnsi="Calibri"/>
@@ -63,7 +63,7 @@
         </w:rPr>
         <w:t xml:space="preserve">• </w:t>
       </w:r>
-      <w:hyperlink w:history="1" r:id="rIdnpndpv5wg2tkthe54yplt">
+      <w:hyperlink w:history="1" r:id="rId6aodgb2dfr08dc9tuba0d">
         <w:r>
           <w:rPr>
             <w:rFonts w:ascii="Calibri" w:cs="Calibri" w:eastAsia="Calibri" w:hAnsi="Calibri"/>
@@ -93,7 +93,7 @@
         </w:rPr>
         <w:t xml:space="preserve">⁠in </w:t>
       </w:r>
-      <w:hyperlink w:history="1" r:id="rIdns3kr0g0kxl5jwtmagpdf">
+      <w:hyperlink w:history="1" r:id="rIdfde6kcl9vqse3dpf6i8u_">
         <w:r>
           <w:rPr>
             <w:rFonts w:ascii="Calibri" w:cs="Calibri" w:eastAsia="Calibri" w:hAnsi="Calibri"/>
@@ -123,7 +123,7 @@
         </w:rPr>
         <w:t xml:space="preserve">◔ </w:t>
       </w:r>
-      <w:hyperlink w:history="1" r:id="rIdvvizisms2sfsalkzqomaw">
+      <w:hyperlink w:history="1" r:id="rIdlzrtrjeliju4ztvqwexjr">
         <w:r>
           <w:rPr>
             <w:rFonts w:ascii="Calibri" w:cs="Calibri" w:eastAsia="Calibri" w:hAnsi="Calibri"/>
@@ -153,7 +153,7 @@
         </w:rPr>
         <w:t xml:space="preserve">Ⓘ </w:t>
       </w:r>
-      <w:hyperlink w:history="1" r:id="rIdud20p_bdtcgw2vsa4qokf">
+      <w:hyperlink w:history="1" r:id="rIdv-dycx05qe9w93kunzs9p">
         <w:r>
           <w:rPr>
             <w:rFonts w:ascii="Calibri" w:cs="Calibri" w:eastAsia="Calibri" w:hAnsi="Calibri"/>
@@ -716,7 +716,7 @@
         </w:rPr>
         <w:t xml:space="preserve">   </w:t>
       </w:r>
-      <w:hyperlink w:history="1" r:id="rId6y-r9q_1zqyabd51etgrn">
+      <w:hyperlink w:history="1" r:id="rId84ywne0zjg64bgjnstti5">
         <w:r>
           <w:rPr>
             <w:rFonts w:ascii="Calibri" w:cs="Calibri" w:eastAsia="Calibri" w:hAnsi="Calibri"/>
@@ -744,7 +744,7 @@
         </w:rPr>
         <w:t xml:space="preserve">| </w:t>
       </w:r>
-      <w:hyperlink w:history="1" r:id="rId_gnv7uktjlwhknmcimwgm">
+      <w:hyperlink w:history="1" r:id="rIdtgj-gazsm60ifvh-n6hsa">
         <w:r>
           <w:rPr>
             <w:rFonts w:ascii="Calibri" w:cs="Calibri" w:eastAsia="Calibri" w:hAnsi="Calibri"/>
@@ -772,7 +772,7 @@
         </w:rPr>
         <w:t xml:space="preserve">| </w:t>
       </w:r>
-      <w:hyperlink w:history="1" r:id="rIdwa6liem5v2u_2km7j3dlw">
+      <w:hyperlink w:history="1" r:id="rIdqmiqrjql8ijhuiqyabako">
         <w:r>
           <w:rPr>
             <w:rFonts w:ascii="Calibri" w:cs="Calibri" w:eastAsia="Calibri" w:hAnsi="Calibri"/>
@@ -1125,7 +1125,7 @@
         </w:rPr>
         <w:t xml:space="preserve">   </w:t>
       </w:r>
-      <w:hyperlink w:history="1" r:id="rIdvq3kbgrrkaw_yyh6ng9gu">
+      <w:hyperlink w:history="1" r:id="rIdo1i2we-pulczctu9z3ben">
         <w:r>
           <w:rPr>
             <w:rFonts w:ascii="Calibri" w:cs="Calibri" w:eastAsia="Calibri" w:hAnsi="Calibri"/>
@@ -1275,7 +1275,7 @@
         </w:rPr>
         <w:t xml:space="preserve">   </w:t>
       </w:r>
-      <w:hyperlink w:history="1" r:id="rIdwfa4csnt0qedfentayi4z">
+      <w:hyperlink w:history="1" r:id="rIdjo8_mynfznxnefgqlmklh">
         <w:r>
           <w:rPr>
             <w:rFonts w:ascii="Calibri" w:cs="Calibri" w:eastAsia="Calibri" w:hAnsi="Calibri"/>
@@ -1303,7 +1303,7 @@
         </w:rPr>
         <w:t xml:space="preserve">| </w:t>
       </w:r>
-      <w:hyperlink w:history="1" r:id="rIdz5c8zrvpd-bbku5tjwdjb">
+      <w:hyperlink w:history="1" r:id="rIds_av_oiazzbv0m0bjty3h">
         <w:r>
           <w:rPr>
             <w:rFonts w:ascii="Calibri" w:cs="Calibri" w:eastAsia="Calibri" w:hAnsi="Calibri"/>
@@ -1436,7 +1436,7 @@
         </w:rPr>
         <w:t xml:space="preserve">   </w:t>
       </w:r>
-      <w:hyperlink w:history="1" r:id="rIdjoeizegf6rze0xfg3x7hc">
+      <w:hyperlink w:history="1" r:id="rIdmgialsxsvpm6ed-w2wnpt">
         <w:r>
           <w:rPr>
             <w:rFonts w:ascii="Calibri" w:cs="Calibri" w:eastAsia="Calibri" w:hAnsi="Calibri"/>
@@ -1464,7 +1464,7 @@
         </w:rPr>
         <w:t xml:space="preserve">| </w:t>
       </w:r>
-      <w:hyperlink w:history="1" r:id="rIdmtr9a1kwhsgnwemzyf9gj">
+      <w:hyperlink w:history="1" r:id="rIdvfrw5shu8xxmsv988d8ne">
         <w:r>
           <w:rPr>
             <w:rFonts w:ascii="Calibri" w:cs="Calibri" w:eastAsia="Calibri" w:hAnsi="Calibri"/>
@@ -1492,7 +1492,7 @@
         </w:rPr>
         <w:t xml:space="preserve">| </w:t>
       </w:r>
-      <w:hyperlink w:history="1" r:id="rId79pc0nuhvv0tr8qecdhqy">
+      <w:hyperlink w:history="1" r:id="rIdje0klu2dzfbdjfcgj0zpd">
         <w:r>
           <w:rPr>
             <w:rFonts w:ascii="Calibri" w:cs="Calibri" w:eastAsia="Calibri" w:hAnsi="Calibri"/>
@@ -1659,7 +1659,7 @@
         </w:rPr>
         <w:t xml:space="preserve">   </w:t>
       </w:r>
-      <w:hyperlink w:history="1" r:id="rIdtgzlqk5uk-u0djxto9rgd">
+      <w:hyperlink w:history="1" r:id="rIdv_semonrmn-yv-vbw_u-z">
         <w:r>
           <w:rPr>
             <w:rFonts w:ascii="Calibri" w:cs="Calibri" w:eastAsia="Calibri" w:hAnsi="Calibri"/>
@@ -1828,7 +1828,7 @@
         </w:rPr>
         <w:t xml:space="preserve">   </w:t>
       </w:r>
-      <w:hyperlink w:history="1" r:id="rIdrrhu1z6vs3ouhtvxg_c34">
+      <w:hyperlink w:history="1" r:id="rId9k_p7dduwgkqcy45nvorj">
         <w:r>
           <w:rPr>
             <w:rFonts w:ascii="Calibri" w:cs="Calibri" w:eastAsia="Calibri" w:hAnsi="Calibri"/>
@@ -1856,7 +1856,7 @@
         </w:rPr>
         <w:t xml:space="preserve">| </w:t>
       </w:r>
-      <w:hyperlink w:history="1" r:id="rIdwd7k78fq-kefshbe0y4ke">
+      <w:hyperlink w:history="1" r:id="rId03jnsyznbg5t2fkj5mhmk">
         <w:r>
           <w:rPr>
             <w:rFonts w:ascii="Calibri" w:cs="Calibri" w:eastAsia="Calibri" w:hAnsi="Calibri"/>
@@ -2588,7 +2588,7 @@
         </w:rPr>
         <w:t xml:space="preserve">   </w:t>
       </w:r>
-      <w:hyperlink w:history="1" r:id="rIdlh1brbri8mtgoevgoc_tv">
+      <w:hyperlink w:history="1" r:id="rId3s_noqrz3rx5ozwf2gvk9">
         <w:r>
           <w:rPr>
             <w:rFonts w:ascii="Calibri" w:cs="Calibri" w:eastAsia="Calibri" w:hAnsi="Calibri"/>
@@ -2616,7 +2616,7 @@
         </w:rPr>
         <w:t xml:space="preserve">| </w:t>
       </w:r>
-      <w:hyperlink w:history="1" r:id="rIdoqka6pwrtpu-5ovxe56na">
+      <w:hyperlink w:history="1" r:id="rIdktc2rpi-yxriydqpksc3k">
         <w:r>
           <w:rPr>
             <w:rFonts w:ascii="Calibri" w:cs="Calibri" w:eastAsia="Calibri" w:hAnsi="Calibri"/>

</xml_diff>

<commit_message>
chore: regenerate CVs and cover letters (#968)
</commit_message>
<xml_diff>
--- a/public/resume/Isaac_Adjei_CV.docx
+++ b/public/resume/Isaac_Adjei_CV.docx
@@ -33,7 +33,7 @@
         </w:rPr>
         <w:t xml:space="preserve">✉ </w:t>
       </w:r>
-      <w:hyperlink w:history="1" r:id="rId-nrbnnfdyqid_beqkyadq">
+      <w:hyperlink w:history="1" r:id="rIdfdvrw2bsz9tskgycajmzk">
         <w:r>
           <w:rPr>
             <w:rFonts w:ascii="Calibri" w:cs="Calibri" w:eastAsia="Calibri" w:hAnsi="Calibri"/>
@@ -63,7 +63,7 @@
         </w:rPr>
         <w:t xml:space="preserve">• </w:t>
       </w:r>
-      <w:hyperlink w:history="1" r:id="rId6aodgb2dfr08dc9tuba0d">
+      <w:hyperlink w:history="1" r:id="rIdztt6phupz90pimen9jmnm">
         <w:r>
           <w:rPr>
             <w:rFonts w:ascii="Calibri" w:cs="Calibri" w:eastAsia="Calibri" w:hAnsi="Calibri"/>
@@ -93,7 +93,7 @@
         </w:rPr>
         <w:t xml:space="preserve">⁠in </w:t>
       </w:r>
-      <w:hyperlink w:history="1" r:id="rIdfde6kcl9vqse3dpf6i8u_">
+      <w:hyperlink w:history="1" r:id="rIdq1vsndfnkwcbcpczfwncz">
         <w:r>
           <w:rPr>
             <w:rFonts w:ascii="Calibri" w:cs="Calibri" w:eastAsia="Calibri" w:hAnsi="Calibri"/>
@@ -123,7 +123,7 @@
         </w:rPr>
         <w:t xml:space="preserve">◔ </w:t>
       </w:r>
-      <w:hyperlink w:history="1" r:id="rIdlzrtrjeliju4ztvqwexjr">
+      <w:hyperlink w:history="1" r:id="rIdftdhiflxwmnzicidvyrhd">
         <w:r>
           <w:rPr>
             <w:rFonts w:ascii="Calibri" w:cs="Calibri" w:eastAsia="Calibri" w:hAnsi="Calibri"/>
@@ -153,7 +153,7 @@
         </w:rPr>
         <w:t xml:space="preserve">Ⓘ </w:t>
       </w:r>
-      <w:hyperlink w:history="1" r:id="rIdv-dycx05qe9w93kunzs9p">
+      <w:hyperlink w:history="1" r:id="rIdggix0ch_qfzccidbawmsi">
         <w:r>
           <w:rPr>
             <w:rFonts w:ascii="Calibri" w:cs="Calibri" w:eastAsia="Calibri" w:hAnsi="Calibri"/>
@@ -716,7 +716,7 @@
         </w:rPr>
         <w:t xml:space="preserve">   </w:t>
       </w:r>
-      <w:hyperlink w:history="1" r:id="rId84ywne0zjg64bgjnstti5">
+      <w:hyperlink w:history="1" r:id="rIdyww0ld20ofaaszthbmhob">
         <w:r>
           <w:rPr>
             <w:rFonts w:ascii="Calibri" w:cs="Calibri" w:eastAsia="Calibri" w:hAnsi="Calibri"/>
@@ -744,7 +744,7 @@
         </w:rPr>
         <w:t xml:space="preserve">| </w:t>
       </w:r>
-      <w:hyperlink w:history="1" r:id="rIdtgj-gazsm60ifvh-n6hsa">
+      <w:hyperlink w:history="1" r:id="rIdtg-zaudfkofwlobir9j3t">
         <w:r>
           <w:rPr>
             <w:rFonts w:ascii="Calibri" w:cs="Calibri" w:eastAsia="Calibri" w:hAnsi="Calibri"/>
@@ -772,7 +772,7 @@
         </w:rPr>
         <w:t xml:space="preserve">| </w:t>
       </w:r>
-      <w:hyperlink w:history="1" r:id="rIdqmiqrjql8ijhuiqyabako">
+      <w:hyperlink w:history="1" r:id="rIdmcv3wphmvkha22-f-kcfb">
         <w:r>
           <w:rPr>
             <w:rFonts w:ascii="Calibri" w:cs="Calibri" w:eastAsia="Calibri" w:hAnsi="Calibri"/>
@@ -1125,7 +1125,7 @@
         </w:rPr>
         <w:t xml:space="preserve">   </w:t>
       </w:r>
-      <w:hyperlink w:history="1" r:id="rIdo1i2we-pulczctu9z3ben">
+      <w:hyperlink w:history="1" r:id="rIdksoxubkrplwuy7nluhj6e">
         <w:r>
           <w:rPr>
             <w:rFonts w:ascii="Calibri" w:cs="Calibri" w:eastAsia="Calibri" w:hAnsi="Calibri"/>
@@ -1275,7 +1275,7 @@
         </w:rPr>
         <w:t xml:space="preserve">   </w:t>
       </w:r>
-      <w:hyperlink w:history="1" r:id="rIdjo8_mynfznxnefgqlmklh">
+      <w:hyperlink w:history="1" r:id="rIddj0aui1kesvznazypvaya">
         <w:r>
           <w:rPr>
             <w:rFonts w:ascii="Calibri" w:cs="Calibri" w:eastAsia="Calibri" w:hAnsi="Calibri"/>
@@ -1303,7 +1303,7 @@
         </w:rPr>
         <w:t xml:space="preserve">| </w:t>
       </w:r>
-      <w:hyperlink w:history="1" r:id="rIds_av_oiazzbv0m0bjty3h">
+      <w:hyperlink w:history="1" r:id="rIdrkn9x9u8m8bysiwlrw6vn">
         <w:r>
           <w:rPr>
             <w:rFonts w:ascii="Calibri" w:cs="Calibri" w:eastAsia="Calibri" w:hAnsi="Calibri"/>
@@ -1436,7 +1436,7 @@
         </w:rPr>
         <w:t xml:space="preserve">   </w:t>
       </w:r>
-      <w:hyperlink w:history="1" r:id="rIdmgialsxsvpm6ed-w2wnpt">
+      <w:hyperlink w:history="1" r:id="rIdar-jnshfq29vlzfjsw90i">
         <w:r>
           <w:rPr>
             <w:rFonts w:ascii="Calibri" w:cs="Calibri" w:eastAsia="Calibri" w:hAnsi="Calibri"/>
@@ -1464,7 +1464,7 @@
         </w:rPr>
         <w:t xml:space="preserve">| </w:t>
       </w:r>
-      <w:hyperlink w:history="1" r:id="rIdvfrw5shu8xxmsv988d8ne">
+      <w:hyperlink w:history="1" r:id="rId9snbm9qyp0dmh5mhni_so">
         <w:r>
           <w:rPr>
             <w:rFonts w:ascii="Calibri" w:cs="Calibri" w:eastAsia="Calibri" w:hAnsi="Calibri"/>
@@ -1492,7 +1492,7 @@
         </w:rPr>
         <w:t xml:space="preserve">| </w:t>
       </w:r>
-      <w:hyperlink w:history="1" r:id="rIdje0klu2dzfbdjfcgj0zpd">
+      <w:hyperlink w:history="1" r:id="rIdimlzs9epn99snflb2qlty">
         <w:r>
           <w:rPr>
             <w:rFonts w:ascii="Calibri" w:cs="Calibri" w:eastAsia="Calibri" w:hAnsi="Calibri"/>
@@ -1659,7 +1659,7 @@
         </w:rPr>
         <w:t xml:space="preserve">   </w:t>
       </w:r>
-      <w:hyperlink w:history="1" r:id="rIdv_semonrmn-yv-vbw_u-z">
+      <w:hyperlink w:history="1" r:id="rIde7fkbv3jku-94wdzwfrk1">
         <w:r>
           <w:rPr>
             <w:rFonts w:ascii="Calibri" w:cs="Calibri" w:eastAsia="Calibri" w:hAnsi="Calibri"/>
@@ -1828,7 +1828,7 @@
         </w:rPr>
         <w:t xml:space="preserve">   </w:t>
       </w:r>
-      <w:hyperlink w:history="1" r:id="rId9k_p7dduwgkqcy45nvorj">
+      <w:hyperlink w:history="1" r:id="rIdvlf07flwzkd5z-14gibfx">
         <w:r>
           <w:rPr>
             <w:rFonts w:ascii="Calibri" w:cs="Calibri" w:eastAsia="Calibri" w:hAnsi="Calibri"/>
@@ -1856,7 +1856,7 @@
         </w:rPr>
         <w:t xml:space="preserve">| </w:t>
       </w:r>
-      <w:hyperlink w:history="1" r:id="rId03jnsyznbg5t2fkj5mhmk">
+      <w:hyperlink w:history="1" r:id="rIdwxbcucslzafpm-cwybfx1">
         <w:r>
           <w:rPr>
             <w:rFonts w:ascii="Calibri" w:cs="Calibri" w:eastAsia="Calibri" w:hAnsi="Calibri"/>
@@ -2588,7 +2588,7 @@
         </w:rPr>
         <w:t xml:space="preserve">   </w:t>
       </w:r>
-      <w:hyperlink w:history="1" r:id="rId3s_noqrz3rx5ozwf2gvk9">
+      <w:hyperlink w:history="1" r:id="rIdfrghijvhthwydlbqfa3ib">
         <w:r>
           <w:rPr>
             <w:rFonts w:ascii="Calibri" w:cs="Calibri" w:eastAsia="Calibri" w:hAnsi="Calibri"/>
@@ -2616,7 +2616,7 @@
         </w:rPr>
         <w:t xml:space="preserve">| </w:t>
       </w:r>
-      <w:hyperlink w:history="1" r:id="rIdktc2rpi-yxriydqpksc3k">
+      <w:hyperlink w:history="1" r:id="rIdqig6relsabglrn5hkku9k">
         <w:r>
           <w:rPr>
             <w:rFonts w:ascii="Calibri" w:cs="Calibri" w:eastAsia="Calibri" w:hAnsi="Calibri"/>

</xml_diff>

<commit_message>
chore: regenerate CVs and cover letters (#984)
</commit_message>
<xml_diff>
--- a/public/resume/Isaac_Adjei_CV.docx
+++ b/public/resume/Isaac_Adjei_CV.docx
@@ -33,7 +33,7 @@
         </w:rPr>
         <w:t xml:space="preserve">✉ </w:t>
       </w:r>
-      <w:hyperlink w:history="1" r:id="rIdfdvrw2bsz9tskgycajmzk">
+      <w:hyperlink w:history="1" r:id="rIdlwmpcxgw34i862o3c-zka">
         <w:r>
           <w:rPr>
             <w:rFonts w:ascii="Calibri" w:cs="Calibri" w:eastAsia="Calibri" w:hAnsi="Calibri"/>
@@ -63,7 +63,7 @@
         </w:rPr>
         <w:t xml:space="preserve">• </w:t>
       </w:r>
-      <w:hyperlink w:history="1" r:id="rIdztt6phupz90pimen9jmnm">
+      <w:hyperlink w:history="1" r:id="rIdhpygh9-gufkty-x15r1nw">
         <w:r>
           <w:rPr>
             <w:rFonts w:ascii="Calibri" w:cs="Calibri" w:eastAsia="Calibri" w:hAnsi="Calibri"/>
@@ -93,7 +93,7 @@
         </w:rPr>
         <w:t xml:space="preserve">⁠in </w:t>
       </w:r>
-      <w:hyperlink w:history="1" r:id="rIdq1vsndfnkwcbcpczfwncz">
+      <w:hyperlink w:history="1" r:id="rIdpasjqdygceioe_uitwbzd">
         <w:r>
           <w:rPr>
             <w:rFonts w:ascii="Calibri" w:cs="Calibri" w:eastAsia="Calibri" w:hAnsi="Calibri"/>
@@ -123,7 +123,7 @@
         </w:rPr>
         <w:t xml:space="preserve">◔ </w:t>
       </w:r>
-      <w:hyperlink w:history="1" r:id="rIdftdhiflxwmnzicidvyrhd">
+      <w:hyperlink w:history="1" r:id="rIdfclxah-xbtcah3urynq3m">
         <w:r>
           <w:rPr>
             <w:rFonts w:ascii="Calibri" w:cs="Calibri" w:eastAsia="Calibri" w:hAnsi="Calibri"/>
@@ -153,7 +153,7 @@
         </w:rPr>
         <w:t xml:space="preserve">Ⓘ </w:t>
       </w:r>
-      <w:hyperlink w:history="1" r:id="rIdggix0ch_qfzccidbawmsi">
+      <w:hyperlink w:history="1" r:id="rIdymzyvh99llgxcecdscgej">
         <w:r>
           <w:rPr>
             <w:rFonts w:ascii="Calibri" w:cs="Calibri" w:eastAsia="Calibri" w:hAnsi="Calibri"/>
@@ -716,7 +716,7 @@
         </w:rPr>
         <w:t xml:space="preserve">   </w:t>
       </w:r>
-      <w:hyperlink w:history="1" r:id="rIdyww0ld20ofaaszthbmhob">
+      <w:hyperlink w:history="1" r:id="rIdl3bmub-vgjtfonckwumna">
         <w:r>
           <w:rPr>
             <w:rFonts w:ascii="Calibri" w:cs="Calibri" w:eastAsia="Calibri" w:hAnsi="Calibri"/>
@@ -744,7 +744,7 @@
         </w:rPr>
         <w:t xml:space="preserve">| </w:t>
       </w:r>
-      <w:hyperlink w:history="1" r:id="rIdtg-zaudfkofwlobir9j3t">
+      <w:hyperlink w:history="1" r:id="rIdblblvzn73wdzxbyqikyz-">
         <w:r>
           <w:rPr>
             <w:rFonts w:ascii="Calibri" w:cs="Calibri" w:eastAsia="Calibri" w:hAnsi="Calibri"/>
@@ -772,7 +772,7 @@
         </w:rPr>
         <w:t xml:space="preserve">| </w:t>
       </w:r>
-      <w:hyperlink w:history="1" r:id="rIdmcv3wphmvkha22-f-kcfb">
+      <w:hyperlink w:history="1" r:id="rId7w7jgk5zzhcb1_wxasyps">
         <w:r>
           <w:rPr>
             <w:rFonts w:ascii="Calibri" w:cs="Calibri" w:eastAsia="Calibri" w:hAnsi="Calibri"/>
@@ -1125,7 +1125,7 @@
         </w:rPr>
         <w:t xml:space="preserve">   </w:t>
       </w:r>
-      <w:hyperlink w:history="1" r:id="rIdksoxubkrplwuy7nluhj6e">
+      <w:hyperlink w:history="1" r:id="rIdfsivr14ygepib6l1zhppm">
         <w:r>
           <w:rPr>
             <w:rFonts w:ascii="Calibri" w:cs="Calibri" w:eastAsia="Calibri" w:hAnsi="Calibri"/>
@@ -1275,7 +1275,7 @@
         </w:rPr>
         <w:t xml:space="preserve">   </w:t>
       </w:r>
-      <w:hyperlink w:history="1" r:id="rIddj0aui1kesvznazypvaya">
+      <w:hyperlink w:history="1" r:id="rIdob2cvppnyb4zzxboggvcq">
         <w:r>
           <w:rPr>
             <w:rFonts w:ascii="Calibri" w:cs="Calibri" w:eastAsia="Calibri" w:hAnsi="Calibri"/>
@@ -1303,7 +1303,7 @@
         </w:rPr>
         <w:t xml:space="preserve">| </w:t>
       </w:r>
-      <w:hyperlink w:history="1" r:id="rIdrkn9x9u8m8bysiwlrw6vn">
+      <w:hyperlink w:history="1" r:id="rId_z62sgc60ku0jkih3awuy">
         <w:r>
           <w:rPr>
             <w:rFonts w:ascii="Calibri" w:cs="Calibri" w:eastAsia="Calibri" w:hAnsi="Calibri"/>
@@ -1436,7 +1436,7 @@
         </w:rPr>
         <w:t xml:space="preserve">   </w:t>
       </w:r>
-      <w:hyperlink w:history="1" r:id="rIdar-jnshfq29vlzfjsw90i">
+      <w:hyperlink w:history="1" r:id="rIdboa2gxtrabufgiq-x-7sq">
         <w:r>
           <w:rPr>
             <w:rFonts w:ascii="Calibri" w:cs="Calibri" w:eastAsia="Calibri" w:hAnsi="Calibri"/>
@@ -1464,7 +1464,7 @@
         </w:rPr>
         <w:t xml:space="preserve">| </w:t>
       </w:r>
-      <w:hyperlink w:history="1" r:id="rId9snbm9qyp0dmh5mhni_so">
+      <w:hyperlink w:history="1" r:id="rId5bzrhkhtz0zh0ufwbmqxe">
         <w:r>
           <w:rPr>
             <w:rFonts w:ascii="Calibri" w:cs="Calibri" w:eastAsia="Calibri" w:hAnsi="Calibri"/>
@@ -1492,7 +1492,7 @@
         </w:rPr>
         <w:t xml:space="preserve">| </w:t>
       </w:r>
-      <w:hyperlink w:history="1" r:id="rIdimlzs9epn99snflb2qlty">
+      <w:hyperlink w:history="1" r:id="rIdsln6tk25uxn_uhduim1qg">
         <w:r>
           <w:rPr>
             <w:rFonts w:ascii="Calibri" w:cs="Calibri" w:eastAsia="Calibri" w:hAnsi="Calibri"/>
@@ -1659,7 +1659,7 @@
         </w:rPr>
         <w:t xml:space="preserve">   </w:t>
       </w:r>
-      <w:hyperlink w:history="1" r:id="rIde7fkbv3jku-94wdzwfrk1">
+      <w:hyperlink w:history="1" r:id="rIdafz3iz8u9ly__jhpx56pm">
         <w:r>
           <w:rPr>
             <w:rFonts w:ascii="Calibri" w:cs="Calibri" w:eastAsia="Calibri" w:hAnsi="Calibri"/>
@@ -1828,7 +1828,7 @@
         </w:rPr>
         <w:t xml:space="preserve">   </w:t>
       </w:r>
-      <w:hyperlink w:history="1" r:id="rIdvlf07flwzkd5z-14gibfx">
+      <w:hyperlink w:history="1" r:id="rId3md_qbnmetidgp0sz-k7y">
         <w:r>
           <w:rPr>
             <w:rFonts w:ascii="Calibri" w:cs="Calibri" w:eastAsia="Calibri" w:hAnsi="Calibri"/>
@@ -1856,7 +1856,7 @@
         </w:rPr>
         <w:t xml:space="preserve">| </w:t>
       </w:r>
-      <w:hyperlink w:history="1" r:id="rIdwxbcucslzafpm-cwybfx1">
+      <w:hyperlink w:history="1" r:id="rIdipsoxnzvcp-pyc1kjcgit">
         <w:r>
           <w:rPr>
             <w:rFonts w:ascii="Calibri" w:cs="Calibri" w:eastAsia="Calibri" w:hAnsi="Calibri"/>
@@ -1971,6 +1971,220 @@
           <w:sz w:val="20"/>
           <w:szCs w:val="20"/>
         </w:rPr>
+        <w:t xml:space="preserve">Peer Assisted Learning (PAL) Leader - Electronics and Programming</w:t>
+      </w:r>
+      <w:r>
+        <w:rPr>
+          <w:rFonts w:ascii="Calibri" w:cs="Calibri" w:eastAsia="Calibri" w:hAnsi="Calibri"/>
+          <w:sz w:val="20"/>
+          <w:szCs w:val="20"/>
+        </w:rPr>
+        <w:t xml:space="preserve">	Aston University, Learning Services, Birmingham, UK</w:t>
+      </w:r>
+    </w:p>
+    <w:p>
+      <w:pPr>
+        <w:tabs>
+          <w:tab w:val="right" w:pos="9026"/>
+        </w:tabs>
+        <w:spacing w:after="10" w:before="0"/>
+      </w:pPr>
+      <w:r>
+        <w:rPr>
+          <w:rFonts w:ascii="Calibri" w:cs="Calibri" w:eastAsia="Calibri" w:hAnsi="Calibri"/>
+          <w:color w:val="444444"/>
+          <w:sz w:val="19"/>
+          <w:szCs w:val="19"/>
+        </w:rPr>
+        <w:t xml:space="preserve">Python, Electronics, peer teaching, curriculum design, student support</w:t>
+      </w:r>
+      <w:r>
+        <w:rPr>
+          <w:rFonts w:ascii="Calibri" w:cs="Calibri" w:eastAsia="Calibri" w:hAnsi="Calibri"/>
+          <w:sz w:val="19"/>
+          <w:szCs w:val="19"/>
+        </w:rPr>
+        <w:t xml:space="preserve">	Sep 2026 - Present</w:t>
+      </w:r>
+    </w:p>
+    <w:p>
+      <w:pPr>
+        <w:spacing w:after="20" w:before="0"/>
+        <w:ind w:left="316" w:hanging="259"/>
+      </w:pPr>
+      <w:r>
+        <w:rPr>
+          <w:rFonts w:ascii="Calibri" w:cs="Calibri" w:eastAsia="Calibri" w:hAnsi="Calibri"/>
+          <w:sz w:val="19"/>
+          <w:szCs w:val="19"/>
+        </w:rPr>
+        <w:t xml:space="preserve">•  </w:t>
+      </w:r>
+      <w:r>
+        <w:rPr>
+          <w:rFonts w:ascii="Calibri" w:cs="Calibri" w:eastAsia="Calibri" w:hAnsi="Calibri"/>
+          <w:sz w:val="19"/>
+          <w:szCs w:val="19"/>
+        </w:rPr>
+        <w:t xml:space="preserve">Facilitate weekly </w:t>
+      </w:r>
+      <w:r>
+        <w:rPr>
+          <w:rFonts w:ascii="Calibri" w:cs="Calibri" w:eastAsia="Calibri" w:hAnsi="Calibri"/>
+          <w:b/>
+          <w:bCs/>
+          <w:sz w:val="19"/>
+          <w:szCs w:val="19"/>
+        </w:rPr>
+        <w:t xml:space="preserve">Peer Assisted Learning (PAL)</w:t>
+      </w:r>
+      <w:r>
+        <w:rPr>
+          <w:rFonts w:ascii="Calibri" w:cs="Calibri" w:eastAsia="Calibri" w:hAnsi="Calibri"/>
+          <w:sz w:val="19"/>
+          <w:szCs w:val="19"/>
+        </w:rPr>
+        <w:t xml:space="preserve"> sessions covering </w:t>
+      </w:r>
+      <w:r>
+        <w:rPr>
+          <w:rFonts w:ascii="Calibri" w:cs="Calibri" w:eastAsia="Calibri" w:hAnsi="Calibri"/>
+          <w:b/>
+          <w:bCs/>
+          <w:sz w:val="19"/>
+          <w:szCs w:val="19"/>
+        </w:rPr>
+        <w:t xml:space="preserve">Python programming and Electronics</w:t>
+      </w:r>
+      <w:r>
+        <w:rPr>
+          <w:rFonts w:ascii="Calibri" w:cs="Calibri" w:eastAsia="Calibri" w:hAnsi="Calibri"/>
+          <w:sz w:val="19"/>
+          <w:szCs w:val="19"/>
+        </w:rPr>
+        <w:t xml:space="preserve"> across multiple student cohorts, preparing curriculum-aligned materials and fostering a collaborative low-pressure learning environment</w:t>
+      </w:r>
+    </w:p>
+    <w:p>
+      <w:pPr>
+        <w:spacing w:after="80" w:before="0"/>
+      </w:pPr>
+    </w:p>
+    <w:p>
+      <w:pPr>
+        <w:tabs>
+          <w:tab w:val="right" w:pos="9026"/>
+        </w:tabs>
+        <w:spacing w:after="10" w:before="0"/>
+      </w:pPr>
+      <w:r>
+        <w:rPr>
+          <w:rFonts w:ascii="Calibri" w:cs="Calibri" w:eastAsia="Calibri" w:hAnsi="Calibri"/>
+          <w:b/>
+          <w:bCs/>
+          <w:sz w:val="20"/>
+          <w:szCs w:val="20"/>
+        </w:rPr>
+        <w:t xml:space="preserve">Treasurer</w:t>
+      </w:r>
+      <w:r>
+        <w:rPr>
+          <w:rFonts w:ascii="Calibri" w:cs="Calibri" w:eastAsia="Calibri" w:hAnsi="Calibri"/>
+          <w:sz w:val="20"/>
+          <w:szCs w:val="20"/>
+        </w:rPr>
+        <w:t xml:space="preserve">	Computing &amp; Electronics Society, Aston Students' Union, Birmingham, UK</w:t>
+      </w:r>
+    </w:p>
+    <w:p>
+      <w:pPr>
+        <w:tabs>
+          <w:tab w:val="right" w:pos="9026"/>
+        </w:tabs>
+        <w:spacing w:after="10" w:before="0"/>
+      </w:pPr>
+      <w:r>
+        <w:rPr>
+          <w:rFonts w:ascii="Calibri" w:cs="Calibri" w:eastAsia="Calibri" w:hAnsi="Calibri"/>
+          <w:color w:val="444444"/>
+          <w:sz w:val="19"/>
+          <w:szCs w:val="19"/>
+        </w:rPr>
+        <w:t xml:space="preserve">Budget management, financial reporting, committee leadership, stakeholder communication</w:t>
+      </w:r>
+      <w:r>
+        <w:rPr>
+          <w:rFonts w:ascii="Calibri" w:cs="Calibri" w:eastAsia="Calibri" w:hAnsi="Calibri"/>
+          <w:sz w:val="19"/>
+          <w:szCs w:val="19"/>
+        </w:rPr>
+        <w:t xml:space="preserve">	Sep 2026 - Present</w:t>
+      </w:r>
+    </w:p>
+    <w:p>
+      <w:pPr>
+        <w:spacing w:after="20" w:before="0"/>
+        <w:ind w:left="316" w:hanging="259"/>
+      </w:pPr>
+      <w:r>
+        <w:rPr>
+          <w:rFonts w:ascii="Calibri" w:cs="Calibri" w:eastAsia="Calibri" w:hAnsi="Calibri"/>
+          <w:sz w:val="19"/>
+          <w:szCs w:val="19"/>
+        </w:rPr>
+        <w:t xml:space="preserve">•  </w:t>
+      </w:r>
+      <w:r>
+        <w:rPr>
+          <w:rFonts w:ascii="Calibri" w:cs="Calibri" w:eastAsia="Calibri" w:hAnsi="Calibri"/>
+          <w:sz w:val="19"/>
+          <w:szCs w:val="19"/>
+        </w:rPr>
+        <w:t xml:space="preserve">Manage the society's budget and financial records, reporting to the committee and the Students' Union</w:t>
+      </w:r>
+    </w:p>
+    <w:p>
+      <w:pPr>
+        <w:spacing w:after="20" w:before="0"/>
+        <w:ind w:left="316" w:hanging="259"/>
+      </w:pPr>
+      <w:r>
+        <w:rPr>
+          <w:rFonts w:ascii="Calibri" w:cs="Calibri" w:eastAsia="Calibri" w:hAnsi="Calibri"/>
+          <w:sz w:val="19"/>
+          <w:szCs w:val="19"/>
+        </w:rPr>
+        <w:t xml:space="preserve">•  </w:t>
+      </w:r>
+      <w:r>
+        <w:rPr>
+          <w:rFonts w:ascii="Calibri" w:cs="Calibri" w:eastAsia="Calibri" w:hAnsi="Calibri"/>
+          <w:sz w:val="19"/>
+          <w:szCs w:val="19"/>
+        </w:rPr>
+        <w:t xml:space="preserve">Elected onto the committee for the Computing &amp; Electronics Society, working alongside the President to run society operations</w:t>
+      </w:r>
+    </w:p>
+    <w:p>
+      <w:pPr>
+        <w:spacing w:after="80" w:before="0"/>
+      </w:pPr>
+    </w:p>
+    <w:p>
+      <w:pPr>
+        <w:tabs>
+          <w:tab w:val="right" w:pos="9026"/>
+        </w:tabs>
+        <w:spacing w:after="10" w:before="0"/>
+      </w:pPr>
+      <w:r>
+        <w:rPr>
+          <w:rFonts w:ascii="Calibri" w:cs="Calibri" w:eastAsia="Calibri" w:hAnsi="Calibri"/>
+          <w:b/>
+          <w:bCs/>
+          <w:sz w:val="20"/>
+          <w:szCs w:val="20"/>
+        </w:rPr>
         <w:t xml:space="preserve">Student Representative</w:t>
       </w:r>
       <w:r>
@@ -2588,7 +2802,7 @@
         </w:rPr>
         <w:t xml:space="preserve">   </w:t>
       </w:r>
-      <w:hyperlink w:history="1" r:id="rIdfrghijvhthwydlbqfa3ib">
+      <w:hyperlink w:history="1" r:id="rIdboyzkzrsfaquyjnafhchf">
         <w:r>
           <w:rPr>
             <w:rFonts w:ascii="Calibri" w:cs="Calibri" w:eastAsia="Calibri" w:hAnsi="Calibri"/>
@@ -2616,7 +2830,7 @@
         </w:rPr>
         <w:t xml:space="preserve">| </w:t>
       </w:r>
-      <w:hyperlink w:history="1" r:id="rIdqig6relsabglrn5hkku9k">
+      <w:hyperlink w:history="1" r:id="rId8b7xnz2ciljgfcawn0wai">
         <w:r>
           <w:rPr>
             <w:rFonts w:ascii="Calibri" w:cs="Calibri" w:eastAsia="Calibri" w:hAnsi="Calibri"/>

</xml_diff>

<commit_message>
chore: regenerate CVs and cover letters (#985)
</commit_message>
<xml_diff>
--- a/public/resume/Isaac_Adjei_CV.docx
+++ b/public/resume/Isaac_Adjei_CV.docx
@@ -33,7 +33,7 @@
         </w:rPr>
         <w:t xml:space="preserve">✉ </w:t>
       </w:r>
-      <w:hyperlink w:history="1" r:id="rIdlwmpcxgw34i862o3c-zka">
+      <w:hyperlink w:history="1" r:id="rIdoe4izdh4anakqhfiphflb">
         <w:r>
           <w:rPr>
             <w:rFonts w:ascii="Calibri" w:cs="Calibri" w:eastAsia="Calibri" w:hAnsi="Calibri"/>
@@ -63,7 +63,7 @@
         </w:rPr>
         <w:t xml:space="preserve">• </w:t>
       </w:r>
-      <w:hyperlink w:history="1" r:id="rIdhpygh9-gufkty-x15r1nw">
+      <w:hyperlink w:history="1" r:id="rIdwawzlbjzn2dacticwzy0f">
         <w:r>
           <w:rPr>
             <w:rFonts w:ascii="Calibri" w:cs="Calibri" w:eastAsia="Calibri" w:hAnsi="Calibri"/>
@@ -93,7 +93,7 @@
         </w:rPr>
         <w:t xml:space="preserve">⁠in </w:t>
       </w:r>
-      <w:hyperlink w:history="1" r:id="rIdpasjqdygceioe_uitwbzd">
+      <w:hyperlink w:history="1" r:id="rIdj5pipxgjfufedf8vthhyk">
         <w:r>
           <w:rPr>
             <w:rFonts w:ascii="Calibri" w:cs="Calibri" w:eastAsia="Calibri" w:hAnsi="Calibri"/>
@@ -123,7 +123,7 @@
         </w:rPr>
         <w:t xml:space="preserve">◔ </w:t>
       </w:r>
-      <w:hyperlink w:history="1" r:id="rIdfclxah-xbtcah3urynq3m">
+      <w:hyperlink w:history="1" r:id="rIdhi1zrf1nhblzo9qltkw_s">
         <w:r>
           <w:rPr>
             <w:rFonts w:ascii="Calibri" w:cs="Calibri" w:eastAsia="Calibri" w:hAnsi="Calibri"/>
@@ -153,7 +153,7 @@
         </w:rPr>
         <w:t xml:space="preserve">Ⓘ </w:t>
       </w:r>
-      <w:hyperlink w:history="1" r:id="rIdymzyvh99llgxcecdscgej">
+      <w:hyperlink w:history="1" r:id="rIdnd6hokoionihstqtyxf5l">
         <w:r>
           <w:rPr>
             <w:rFonts w:ascii="Calibri" w:cs="Calibri" w:eastAsia="Calibri" w:hAnsi="Calibri"/>
@@ -716,7 +716,7 @@
         </w:rPr>
         <w:t xml:space="preserve">   </w:t>
       </w:r>
-      <w:hyperlink w:history="1" r:id="rIdl3bmub-vgjtfonckwumna">
+      <w:hyperlink w:history="1" r:id="rIdrzqjglgm8mv5mbnrjfkfu">
         <w:r>
           <w:rPr>
             <w:rFonts w:ascii="Calibri" w:cs="Calibri" w:eastAsia="Calibri" w:hAnsi="Calibri"/>
@@ -744,7 +744,7 @@
         </w:rPr>
         <w:t xml:space="preserve">| </w:t>
       </w:r>
-      <w:hyperlink w:history="1" r:id="rIdblblvzn73wdzxbyqikyz-">
+      <w:hyperlink w:history="1" r:id="rIdd8ciebfqfxn-cvdatzefk">
         <w:r>
           <w:rPr>
             <w:rFonts w:ascii="Calibri" w:cs="Calibri" w:eastAsia="Calibri" w:hAnsi="Calibri"/>
@@ -772,7 +772,7 @@
         </w:rPr>
         <w:t xml:space="preserve">| </w:t>
       </w:r>
-      <w:hyperlink w:history="1" r:id="rId7w7jgk5zzhcb1_wxasyps">
+      <w:hyperlink w:history="1" r:id="rIdxh37se1cdg7bd8dnj9iqd">
         <w:r>
           <w:rPr>
             <w:rFonts w:ascii="Calibri" w:cs="Calibri" w:eastAsia="Calibri" w:hAnsi="Calibri"/>
@@ -1125,7 +1125,7 @@
         </w:rPr>
         <w:t xml:space="preserve">   </w:t>
       </w:r>
-      <w:hyperlink w:history="1" r:id="rIdfsivr14ygepib6l1zhppm">
+      <w:hyperlink w:history="1" r:id="rIdbikupdrdeq2t5qjq5a9ur">
         <w:r>
           <w:rPr>
             <w:rFonts w:ascii="Calibri" w:cs="Calibri" w:eastAsia="Calibri" w:hAnsi="Calibri"/>
@@ -1275,7 +1275,7 @@
         </w:rPr>
         <w:t xml:space="preserve">   </w:t>
       </w:r>
-      <w:hyperlink w:history="1" r:id="rIdob2cvppnyb4zzxboggvcq">
+      <w:hyperlink w:history="1" r:id="rId7z8mrv4ef59pucllhoqtb">
         <w:r>
           <w:rPr>
             <w:rFonts w:ascii="Calibri" w:cs="Calibri" w:eastAsia="Calibri" w:hAnsi="Calibri"/>
@@ -1303,7 +1303,7 @@
         </w:rPr>
         <w:t xml:space="preserve">| </w:t>
       </w:r>
-      <w:hyperlink w:history="1" r:id="rId_z62sgc60ku0jkih3awuy">
+      <w:hyperlink w:history="1" r:id="rIdcvkc2tjz7f2memlqsmkix">
         <w:r>
           <w:rPr>
             <w:rFonts w:ascii="Calibri" w:cs="Calibri" w:eastAsia="Calibri" w:hAnsi="Calibri"/>
@@ -1436,7 +1436,7 @@
         </w:rPr>
         <w:t xml:space="preserve">   </w:t>
       </w:r>
-      <w:hyperlink w:history="1" r:id="rIdboa2gxtrabufgiq-x-7sq">
+      <w:hyperlink w:history="1" r:id="rId_ifff4jwimjadqwtiwfai">
         <w:r>
           <w:rPr>
             <w:rFonts w:ascii="Calibri" w:cs="Calibri" w:eastAsia="Calibri" w:hAnsi="Calibri"/>
@@ -1464,7 +1464,7 @@
         </w:rPr>
         <w:t xml:space="preserve">| </w:t>
       </w:r>
-      <w:hyperlink w:history="1" r:id="rId5bzrhkhtz0zh0ufwbmqxe">
+      <w:hyperlink w:history="1" r:id="rIdikw1ygiujwivofhun4yum">
         <w:r>
           <w:rPr>
             <w:rFonts w:ascii="Calibri" w:cs="Calibri" w:eastAsia="Calibri" w:hAnsi="Calibri"/>
@@ -1492,7 +1492,7 @@
         </w:rPr>
         <w:t xml:space="preserve">| </w:t>
       </w:r>
-      <w:hyperlink w:history="1" r:id="rIdsln6tk25uxn_uhduim1qg">
+      <w:hyperlink w:history="1" r:id="rId8wskudhnfr-zp16r_bfpx">
         <w:r>
           <w:rPr>
             <w:rFonts w:ascii="Calibri" w:cs="Calibri" w:eastAsia="Calibri" w:hAnsi="Calibri"/>
@@ -1659,7 +1659,7 @@
         </w:rPr>
         <w:t xml:space="preserve">   </w:t>
       </w:r>
-      <w:hyperlink w:history="1" r:id="rIdafz3iz8u9ly__jhpx56pm">
+      <w:hyperlink w:history="1" r:id="rIdp3bxd6zyygodcjx7wicr6">
         <w:r>
           <w:rPr>
             <w:rFonts w:ascii="Calibri" w:cs="Calibri" w:eastAsia="Calibri" w:hAnsi="Calibri"/>
@@ -1828,7 +1828,7 @@
         </w:rPr>
         <w:t xml:space="preserve">   </w:t>
       </w:r>
-      <w:hyperlink w:history="1" r:id="rId3md_qbnmetidgp0sz-k7y">
+      <w:hyperlink w:history="1" r:id="rIdqzzkl-6mg8cvj-hkactjs">
         <w:r>
           <w:rPr>
             <w:rFonts w:ascii="Calibri" w:cs="Calibri" w:eastAsia="Calibri" w:hAnsi="Calibri"/>
@@ -1856,7 +1856,7 @@
         </w:rPr>
         <w:t xml:space="preserve">| </w:t>
       </w:r>
-      <w:hyperlink w:history="1" r:id="rIdipsoxnzvcp-pyc1kjcgit">
+      <w:hyperlink w:history="1" r:id="rIdhowgkjq26rndalq3jmpe5">
         <w:r>
           <w:rPr>
             <w:rFonts w:ascii="Calibri" w:cs="Calibri" w:eastAsia="Calibri" w:hAnsi="Calibri"/>
@@ -2802,7 +2802,7 @@
         </w:rPr>
         <w:t xml:space="preserve">   </w:t>
       </w:r>
-      <w:hyperlink w:history="1" r:id="rIdboyzkzrsfaquyjnafhchf">
+      <w:hyperlink w:history="1" r:id="rIdr1cnbiwnnr2acts4d4azz">
         <w:r>
           <w:rPr>
             <w:rFonts w:ascii="Calibri" w:cs="Calibri" w:eastAsia="Calibri" w:hAnsi="Calibri"/>
@@ -2830,7 +2830,7 @@
         </w:rPr>
         <w:t xml:space="preserve">| </w:t>
       </w:r>
-      <w:hyperlink w:history="1" r:id="rId8b7xnz2ciljgfcawn0wai">
+      <w:hyperlink w:history="1" r:id="rIdefjpebfrvavog64mlpflv">
         <w:r>
           <w:rPr>
             <w:rFonts w:ascii="Calibri" w:cs="Calibri" w:eastAsia="Calibri" w:hAnsi="Calibri"/>

</xml_diff>